<commit_message>
docs: professionalize UAT manual screenshot headings
</commit_message>
<xml_diff>
--- a/docs/pos/uat-v1.34.22/Manual-UAT-E2E-Kantin-POS-Kulakan-Akuntansi-100-Record-Jurnal-Umum-v1.34.22-20260904.docx
+++ b/docs/pos/uat-v1.34.22/Manual-UAT-E2E-Kantin-POS-Kulakan-Akuntansi-100-Record-Jurnal-Umum-v1.34.22-20260904.docx
@@ -77,8 +77,8 @@
           <w:noProof/>
         </w:rPr>
         <w:drawing>
-          <wp:inline distT="0" distB="0" distL="0" distR="0" wp14:anchorId="53F90278" wp14:editId="12E095E1">
-            <wp:extent cx="8595360" cy="4673727"/>
+          <wp:inline distT="0" distB="0" distL="0" distR="0" wp14:anchorId="421E01D3" wp14:editId="1438D0DA">
+            <wp:extent cx="6949440" cy="3778758"/>
             <wp:effectExtent l="0" t="0" r="0" b="0"/>
             <wp:docPr id="1" name="Picture 1"/>
             <wp:cNvGraphicFramePr>
@@ -100,7 +100,7 @@
                   <pic:spPr>
                     <a:xfrm>
                       <a:off x="0" y="0"/>
-                      <a:ext cx="8595360" cy="4673727"/>
+                      <a:ext cx="6949440" cy="3778758"/>
                     </a:xfrm>
                     <a:prstGeom prst="rect">
                       <a:avLst/>
@@ -160,7 +160,6 @@
                 <w:color w:val="FFFFFF"/>
                 <w:sz w:val="16"/>
               </w:rPr>
-              <w:lastRenderedPageBreak/>
               <w:t>Parameter</w:t>
             </w:r>
           </w:p>
@@ -345,7 +344,7 @@
               <w:rPr>
                 <w:sz w:val="16"/>
               </w:rPr>
-              <w:t>27 screenshot penuh • ≥500 kata + 3 diagram per screenshot</w:t>
+              <w:t>27 screenshot layar penuh • use case, flowchart, dan ERD pada setiap tahap</w:t>
             </w:r>
           </w:p>
         </w:tc>
@@ -398,22 +397,16 @@
       </w:pPr>
     </w:p>
     <w:p>
-      <w:r>
-        <w:br w:type="page"/>
-      </w:r>
-    </w:p>
-    <w:p>
       <w:pPr>
         <w:pStyle w:val="Heading1"/>
       </w:pPr>
       <w:r>
-        <w:lastRenderedPageBreak/>
         <w:t>1. Ringkasan eksekutif dan kriteria penerimaan</w:t>
       </w:r>
     </w:p>
     <w:p>
       <w:r>
-        <w:t>Dokumen baru ini tidak menimpa manual sebelumnya. Cakupannya adalah transaksi Kantin POS, Kulakan, posting Penjualan/HPP/Kulakan, Jurnal Umum, Buku Besar, dan enam laporan keuangan. Seluruh bukti diambil pada jendela Windows yang dimaksimalkan. Setiap screenshot memiliki narasi sekurang-kurangnya 500 kata dan tiga diagram yang spesifik terhadap layar tersebut.</w:t>
+        <w:t>Dokumen baru ini tidak menimpa manual sebelumnya. Cakupannya adalah transaksi Kantin POS, Kulakan, posting Penjualan/HPP/Kulakan, Jurnal Umum, Buku Besar, dan enam laporan keuangan. Seluruh bukti diambil pada jendela Windows yang dimaksimalkan. Setiap screenshot disertai penjelasan operasional dan tiga diagram yang spesifik terhadap layar tersebut.</w:t>
       </w:r>
     </w:p>
     <w:tbl>
@@ -4122,7 +4115,7 @@
           <w:noProof/>
         </w:rPr>
         <w:drawing>
-          <wp:inline distT="0" distB="0" distL="0" distR="0" wp14:anchorId="4CE29BE0" wp14:editId="2C82B0A0">
+          <wp:inline distT="0" distB="0" distL="0" distR="0" wp14:anchorId="62B0EAD9" wp14:editId="382E74C1">
             <wp:extent cx="9464040" cy="5146072"/>
             <wp:effectExtent l="0" t="0" r="0" b="0"/>
             <wp:docPr id="2" name="Picture 2"/>
@@ -4183,7 +4176,7 @@
       </w:pPr>
       <w:r>
         <w:lastRenderedPageBreak/>
-        <w:t>Narasi rinci Screenshot 1 — 891 kata</w:t>
+        <w:t>Layar awal eBisnis dalam mode maksimal</w:t>
       </w:r>
     </w:p>
     <w:p>
@@ -4279,13 +4272,13 @@
         <w:rPr>
           <w:sz w:val="18"/>
         </w:rPr>
-        <w:t>Diagram setelah narasi ini memodelkan use case, flowchart, dan aliran data untuk Layar awal eBisnis dalam mode maksimal. Entitas yang relevan ialah Pengguna, Sesi, Toko, Hak Akses. Use case menjelaskan siapa memicu tindakan dan siapa meninjau hasil. Flowchart menjelaskan urutan serta gerbang validasi sebelum status berubah. Diagram aliran data/ERD ringkas menunjukkan kunci hubungan antara dokumen sumber, detail, akun, transaksi akuntansi, dan laporan. Diagram bukan pengganti skema basis data fisik; ia senga</w:t>
-      </w:r>
-      <w:r>
-        <w:rPr>
-          <w:sz w:val="18"/>
-        </w:rPr>
-        <w:t>ja menampilkan relasi bisnis yang perlu dipahami key user. Keterlacakan dianggap cukup apabila nomor referensi pada transaksi dapat ditemukan pada jurnal, kode akun yang sama dapat ditemukan pada Buku Besar, dan saldo akhirnya dapat dijelaskan pada laporan.</w:t>
+        <w:t>Diagram setelah penjelasan ini memodelkan use case, flowchart, dan aliran data untuk Layar awal eBisnis dalam mode maksimal. Entitas yang relevan ialah Pengguna, Sesi, Toko, Hak Akses. Use case menjelaskan siapa memicu tindakan dan siapa meninjau hasil. Flowchart menjelaskan urutan serta gerbang validasi sebelum status berubah. Diagram aliran data/ERD ringkas menunjukkan kunci hubungan antara dokumen sumber, detail, akun, transaksi akuntansi, dan laporan. Diagram bukan pengganti skema basis data fisik; ia s</w:t>
+      </w:r>
+      <w:r>
+        <w:rPr>
+          <w:sz w:val="18"/>
+        </w:rPr>
+        <w:t>engaja menampilkan relasi bisnis yang perlu dipahami key user. Keterlacakan dianggap cukup apabila nomor referensi pada transaksi dapat ditemukan pada jurnal, kode akun yang sama dapat ditemukan pada Buku Besar, dan saldo akhirnya dapat dijelaskan pada laporan.</w:t>
       </w:r>
     </w:p>
     <w:p>
@@ -4333,7 +4326,7 @@
       </w:pPr>
       <w:r>
         <w:lastRenderedPageBreak/>
-        <w:t>Diagram terkait Screenshot 1</w:t>
+        <w:t>Diagram — Layar awal eBisnis dalam mode maksimal</w:t>
       </w:r>
     </w:p>
     <w:p>
@@ -4346,7 +4339,7 @@
           <w:noProof/>
         </w:rPr>
         <w:drawing>
-          <wp:inline distT="0" distB="0" distL="0" distR="0" wp14:anchorId="2CBEB235" wp14:editId="2AC76B0E">
+          <wp:inline distT="0" distB="0" distL="0" distR="0" wp14:anchorId="6941D57F" wp14:editId="1DA84A9F">
             <wp:extent cx="8412480" cy="1682496"/>
             <wp:effectExtent l="0" t="0" r="0" b="0"/>
             <wp:docPr id="3" name="Picture 3"/>
@@ -4406,7 +4399,7 @@
           <w:noProof/>
         </w:rPr>
         <w:drawing>
-          <wp:inline distT="0" distB="0" distL="0" distR="0" wp14:anchorId="3F62BCB8" wp14:editId="49EEC75E">
+          <wp:inline distT="0" distB="0" distL="0" distR="0" wp14:anchorId="5C43754D" wp14:editId="22F7E603">
             <wp:extent cx="8412480" cy="1682496"/>
             <wp:effectExtent l="0" t="0" r="0" b="0"/>
             <wp:docPr id="4" name="Picture 4"/>
@@ -4466,7 +4459,7 @@
           <w:noProof/>
         </w:rPr>
         <w:drawing>
-          <wp:inline distT="0" distB="0" distL="0" distR="0" wp14:anchorId="686349E5" wp14:editId="4416D3D9">
+          <wp:inline distT="0" distB="0" distL="0" distR="0" wp14:anchorId="1B3FCF2B" wp14:editId="79FB626F">
             <wp:extent cx="8412480" cy="1682496"/>
             <wp:effectExtent l="0" t="0" r="0" b="0"/>
             <wp:docPr id="5" name="Picture 5"/>
@@ -4723,7 +4716,7 @@
           <w:noProof/>
         </w:rPr>
         <w:drawing>
-          <wp:inline distT="0" distB="0" distL="0" distR="0" wp14:anchorId="3AC9F6C3" wp14:editId="710C62E4">
+          <wp:inline distT="0" distB="0" distL="0" distR="0" wp14:anchorId="3BFC36E8" wp14:editId="55D3426A">
             <wp:extent cx="9464040" cy="5146072"/>
             <wp:effectExtent l="0" t="0" r="0" b="0"/>
             <wp:docPr id="6" name="Picture 6"/>
@@ -4784,7 +4777,7 @@
       </w:pPr>
       <w:r>
         <w:lastRenderedPageBreak/>
-        <w:t>Narasi rinci Screenshot 2 — 872 kata</w:t>
+        <w:t>Navigasi Transaksi &amp; Laporan</w:t>
       </w:r>
     </w:p>
     <w:p>
@@ -4880,13 +4873,13 @@
         <w:rPr>
           <w:sz w:val="18"/>
         </w:rPr>
-        <w:t>Diagram setelah narasi ini memodelkan use case, flowchart, dan aliran data untuk Navigasi Transaksi &amp; Laporan. Entitas yang relevan ialah Menu, Hak Akses, Penjualan, Laporan Transaksi. Use case menjelaskan siapa memicu tindakan dan siapa meninjau hasil. Flowchart menjelaskan urutan serta gerbang validasi sebelum status berubah. Diagram aliran data/ERD ringkas menunjukkan kunci hubungan antara dokumen sumber, detail, akun, transaksi akuntansi, dan laporan. Diagram bukan pengganti skema basis data fisik; ia s</w:t>
-      </w:r>
-      <w:r>
-        <w:rPr>
-          <w:sz w:val="18"/>
-        </w:rPr>
-        <w:t>engaja menampilkan relasi bisnis yang perlu dipahami key user. Keterlacakan dianggap cukup apabila nomor referensi pada transaksi dapat ditemukan pada jurnal, kode akun yang sama dapat ditemukan pada Buku Besar, dan saldo akhirnya dapat dijelaskan pada laporan.</w:t>
+        <w:t xml:space="preserve">Diagram setelah penjelasan ini memodelkan use case, flowchart, dan aliran data untuk Navigasi Transaksi &amp; Laporan. Entitas yang relevan ialah Menu, Hak Akses, Penjualan, Laporan Transaksi. Use case menjelaskan siapa memicu tindakan dan siapa meninjau hasil. Flowchart menjelaskan urutan serta gerbang validasi sebelum status berubah. Diagram aliran data/ERD ringkas menunjukkan kunci hubungan antara dokumen sumber, detail, akun, transaksi akuntansi, dan laporan. Diagram bukan pengganti skema basis data fisik; </w:t>
+      </w:r>
+      <w:r>
+        <w:rPr>
+          <w:sz w:val="18"/>
+        </w:rPr>
+        <w:t>ia sengaja menampilkan relasi bisnis yang perlu dipahami key user. Keterlacakan dianggap cukup apabila nomor referensi pada transaksi dapat ditemukan pada jurnal, kode akun yang sama dapat ditemukan pada Buku Besar, dan saldo akhirnya dapat dijelaskan pada laporan.</w:t>
       </w:r>
     </w:p>
     <w:p>
@@ -4933,7 +4926,8 @@
         <w:pStyle w:val="Heading2"/>
       </w:pPr>
       <w:r>
-        <w:t>Diagram terkait Screenshot 2</w:t>
+        <w:lastRenderedPageBreak/>
+        <w:t>Diagram — Navigasi Transaksi &amp; Laporan</w:t>
       </w:r>
     </w:p>
     <w:p>
@@ -4946,7 +4940,7 @@
           <w:noProof/>
         </w:rPr>
         <w:drawing>
-          <wp:inline distT="0" distB="0" distL="0" distR="0" wp14:anchorId="033AACAF" wp14:editId="7CFF5FC1">
+          <wp:inline distT="0" distB="0" distL="0" distR="0" wp14:anchorId="24A7B812" wp14:editId="514D6307">
             <wp:extent cx="8412480" cy="1682496"/>
             <wp:effectExtent l="0" t="0" r="0" b="0"/>
             <wp:docPr id="7" name="Picture 7"/>
@@ -5006,7 +5000,7 @@
           <w:noProof/>
         </w:rPr>
         <w:drawing>
-          <wp:inline distT="0" distB="0" distL="0" distR="0" wp14:anchorId="6C09796E" wp14:editId="42846DB7">
+          <wp:inline distT="0" distB="0" distL="0" distR="0" wp14:anchorId="20DCF13D" wp14:editId="571F8800">
             <wp:extent cx="8412480" cy="1682496"/>
             <wp:effectExtent l="0" t="0" r="0" b="0"/>
             <wp:docPr id="8" name="Picture 8"/>
@@ -5066,7 +5060,7 @@
           <w:noProof/>
         </w:rPr>
         <w:drawing>
-          <wp:inline distT="0" distB="0" distL="0" distR="0" wp14:anchorId="6D71EFF3" wp14:editId="470F41C0">
+          <wp:inline distT="0" distB="0" distL="0" distR="0" wp14:anchorId="6FB155D8" wp14:editId="01372440">
             <wp:extent cx="8412480" cy="1682496"/>
             <wp:effectExtent l="0" t="0" r="0" b="0"/>
             <wp:docPr id="9" name="Picture 9"/>
@@ -5126,6 +5120,7 @@
         <w:pStyle w:val="Heading1"/>
       </w:pPr>
       <w:r>
+        <w:lastRenderedPageBreak/>
         <w:t>6. Riwayat Penjualan dengan 100+ transaksi</w:t>
       </w:r>
     </w:p>
@@ -5322,7 +5317,7 @@
           <w:noProof/>
         </w:rPr>
         <w:drawing>
-          <wp:inline distT="0" distB="0" distL="0" distR="0" wp14:anchorId="2F5A41FC" wp14:editId="34A23538">
+          <wp:inline distT="0" distB="0" distL="0" distR="0" wp14:anchorId="3B766A91" wp14:editId="48E302CF">
             <wp:extent cx="9464040" cy="5146072"/>
             <wp:effectExtent l="0" t="0" r="0" b="0"/>
             <wp:docPr id="10" name="Picture 10"/>
@@ -5382,7 +5377,8 @@
         <w:pStyle w:val="Heading2"/>
       </w:pPr>
       <w:r>
-        <w:t>Narasi rinci Screenshot 3 — 891 kata</w:t>
+        <w:lastRenderedPageBreak/>
+        <w:t>Riwayat Penjualan dengan 100+ transaksi</w:t>
       </w:r>
     </w:p>
     <w:p>
@@ -5478,13 +5474,13 @@
         <w:rPr>
           <w:sz w:val="18"/>
         </w:rPr>
-        <w:t>Diagram setelah narasi ini memodelkan use case, flowchart, dan aliran data untuk Riwayat Penjualan dengan 100+ transaksi. Entitas yang relevan ialah Penjualan, Detail Penjualan, Cara Bayar, Produk. Use case menjelaskan siapa memicu tindakan dan siapa meninjau hasil. Flowchart menjelaskan urutan serta gerbang validasi sebelum status berubah. Diagram aliran data/ERD ringkas menunjukkan kunci hubungan antara dokumen sumber, detail, akun, transaksi akuntansi, dan laporan. Diagram bukan pengganti skema basis dat</w:t>
-      </w:r>
-      <w:r>
-        <w:rPr>
-          <w:sz w:val="18"/>
-        </w:rPr>
-        <w:t>a fisik; ia sengaja menampilkan relasi bisnis yang perlu dipahami key user. Keterlacakan dianggap cukup apabila nomor referensi pada transaksi dapat ditemukan pada jurnal, kode akun yang sama dapat ditemukan pada Buku Besar, dan saldo akhirnya dapat dijelaskan pada laporan.</w:t>
+        <w:t>Diagram setelah penjelasan ini memodelkan use case, flowchart, dan aliran data untuk Riwayat Penjualan dengan 100+ transaksi. Entitas yang relevan ialah Penjualan, Detail Penjualan, Cara Bayar, Produk. Use case menjelaskan siapa memicu tindakan dan siapa meninjau hasil. Flowchart menjelaskan urutan serta gerbang validasi sebelum status berubah. Diagram aliran data/ERD ringkas menunjukkan kunci hubungan antara dokumen sumber, detail, akun, transaksi akuntansi, dan laporan. Diagram bukan pengganti skema basis</w:t>
+      </w:r>
+      <w:r>
+        <w:rPr>
+          <w:sz w:val="18"/>
+        </w:rPr>
+        <w:t xml:space="preserve"> data fisik; ia sengaja menampilkan relasi bisnis yang perlu dipahami key user. Keterlacakan dianggap cukup apabila nomor referensi pada transaksi dapat ditemukan pada jurnal, kode akun yang sama dapat ditemukan pada Buku Besar, dan saldo akhirnya dapat dijelaskan pada laporan.</w:t>
       </w:r>
     </w:p>
     <w:p>
@@ -5531,7 +5527,8 @@
         <w:pStyle w:val="Heading2"/>
       </w:pPr>
       <w:r>
-        <w:t>Diagram terkait Screenshot 3</w:t>
+        <w:lastRenderedPageBreak/>
+        <w:t>Diagram — Riwayat Penjualan dengan 100+ transaksi</w:t>
       </w:r>
     </w:p>
     <w:p>
@@ -5544,7 +5541,7 @@
           <w:noProof/>
         </w:rPr>
         <w:drawing>
-          <wp:inline distT="0" distB="0" distL="0" distR="0" wp14:anchorId="4DE0628F" wp14:editId="3431F126">
+          <wp:inline distT="0" distB="0" distL="0" distR="0" wp14:anchorId="47EFA51A" wp14:editId="4F9DB17C">
             <wp:extent cx="8412480" cy="1682496"/>
             <wp:effectExtent l="0" t="0" r="0" b="0"/>
             <wp:docPr id="11" name="Picture 11"/>
@@ -5604,7 +5601,7 @@
           <w:noProof/>
         </w:rPr>
         <w:drawing>
-          <wp:inline distT="0" distB="0" distL="0" distR="0" wp14:anchorId="7AFD198A" wp14:editId="5AC9C20F">
+          <wp:inline distT="0" distB="0" distL="0" distR="0" wp14:anchorId="6FAEB01F" wp14:editId="1BA77972">
             <wp:extent cx="8412480" cy="1682496"/>
             <wp:effectExtent l="0" t="0" r="0" b="0"/>
             <wp:docPr id="12" name="Picture 12"/>
@@ -5664,7 +5661,7 @@
           <w:noProof/>
         </w:rPr>
         <w:drawing>
-          <wp:inline distT="0" distB="0" distL="0" distR="0" wp14:anchorId="0926AE44" wp14:editId="2BF82100">
+          <wp:inline distT="0" distB="0" distL="0" distR="0" wp14:anchorId="02EAB859" wp14:editId="01AEEF13">
             <wp:extent cx="8412480" cy="1682496"/>
             <wp:effectExtent l="0" t="0" r="0" b="0"/>
             <wp:docPr id="13" name="Picture 13"/>
@@ -5920,7 +5917,7 @@
           <w:noProof/>
         </w:rPr>
         <w:drawing>
-          <wp:inline distT="0" distB="0" distL="0" distR="0" wp14:anchorId="6916BC9D" wp14:editId="284EB50B">
+          <wp:inline distT="0" distB="0" distL="0" distR="0" wp14:anchorId="2F165CFC" wp14:editId="07F9F90D">
             <wp:extent cx="9464040" cy="5146072"/>
             <wp:effectExtent l="0" t="0" r="0" b="0"/>
             <wp:docPr id="14" name="Picture 14"/>
@@ -5980,7 +5977,7 @@
         <w:pStyle w:val="Heading2"/>
       </w:pPr>
       <w:r>
-        <w:t>Narasi rinci Screenshot 4 — 890 kata</w:t>
+        <w:t>Riwayat Kulakan dengan 207 faktur</w:t>
       </w:r>
     </w:p>
     <w:p>
@@ -6076,13 +6073,13 @@
         <w:rPr>
           <w:sz w:val="18"/>
         </w:rPr>
-        <w:t>Diagram setelah narasi ini memodelkan use case, flowchart, dan aliran data untuk Riwayat Kulakan dengan 207 faktur. Entitas yang relevan ialah Faktur Kulakan, Rincian Faktur, Penyedia, Produk. Use case menjelaskan siapa memicu tindakan dan siapa meninjau hasil. Flowchart menjelaskan urutan serta gerbang validasi sebelum status berubah. Diagram aliran data/ERD ringkas menunjukkan kunci hubungan antara dokumen sumber, detail, akun, transaksi akuntansi, dan laporan. Diagram bukan pengganti skema basis data fis</w:t>
-      </w:r>
-      <w:r>
-        <w:rPr>
-          <w:sz w:val="18"/>
-        </w:rPr>
-        <w:t>ik; ia sengaja menampilkan relasi bisnis yang perlu dipahami key user. Keterlacakan dianggap cukup apabila nomor referensi pada transaksi dapat ditemukan pada jurnal, kode akun yang sama dapat ditemukan pada Buku Besar, dan saldo akhirnya dapat dijelaskan pada laporan.</w:t>
+        <w:t>Diagram setelah penjelasan ini memodelkan use case, flowchart, dan aliran data untuk Riwayat Kulakan dengan 207 faktur. Entitas yang relevan ialah Faktur Kulakan, Rincian Faktur, Penyedia, Produk. Use case menjelaskan siapa memicu tindakan dan siapa meninjau hasil. Flowchart menjelaskan urutan serta gerbang validasi sebelum status berubah. Diagram aliran data/ERD ringkas menunjukkan kunci hubungan antara dokumen sumber, detail, akun, transaksi akuntansi, dan laporan. Diagram bukan pengganti skema basis data</w:t>
+      </w:r>
+      <w:r>
+        <w:rPr>
+          <w:sz w:val="18"/>
+        </w:rPr>
+        <w:t xml:space="preserve"> fisik; ia sengaja menampilkan relasi bisnis yang perlu dipahami key user. Keterlacakan dianggap cukup apabila nomor referensi pada transaksi dapat ditemukan pada jurnal, kode akun yang sama dapat ditemukan pada Buku Besar, dan saldo akhirnya dapat dijelaskan pada laporan.</w:t>
       </w:r>
     </w:p>
     <w:p>
@@ -6129,7 +6126,7 @@
         <w:pStyle w:val="Heading2"/>
       </w:pPr>
       <w:r>
-        <w:t>Diagram terkait Screenshot 4</w:t>
+        <w:t>Diagram — Riwayat Kulakan dengan 207 faktur</w:t>
       </w:r>
     </w:p>
     <w:p>
@@ -6142,7 +6139,7 @@
           <w:noProof/>
         </w:rPr>
         <w:drawing>
-          <wp:inline distT="0" distB="0" distL="0" distR="0" wp14:anchorId="6E8430F3" wp14:editId="6056BED4">
+          <wp:inline distT="0" distB="0" distL="0" distR="0" wp14:anchorId="1BD41AD4" wp14:editId="3315E5D9">
             <wp:extent cx="8412480" cy="1682496"/>
             <wp:effectExtent l="0" t="0" r="0" b="0"/>
             <wp:docPr id="15" name="Picture 15"/>
@@ -6202,7 +6199,7 @@
           <w:noProof/>
         </w:rPr>
         <w:drawing>
-          <wp:inline distT="0" distB="0" distL="0" distR="0" wp14:anchorId="7AE3C239" wp14:editId="0E9F048A">
+          <wp:inline distT="0" distB="0" distL="0" distR="0" wp14:anchorId="6A1F7D76" wp14:editId="551D0A95">
             <wp:extent cx="8412480" cy="1682496"/>
             <wp:effectExtent l="0" t="0" r="0" b="0"/>
             <wp:docPr id="16" name="Picture 16"/>
@@ -6262,7 +6259,7 @@
           <w:noProof/>
         </w:rPr>
         <w:drawing>
-          <wp:inline distT="0" distB="0" distL="0" distR="0" wp14:anchorId="057DD11E" wp14:editId="46CC1B1A">
+          <wp:inline distT="0" distB="0" distL="0" distR="0" wp14:anchorId="562BD37D" wp14:editId="6A5D48AF">
             <wp:extent cx="8412480" cy="1682496"/>
             <wp:effectExtent l="0" t="0" r="0" b="0"/>
             <wp:docPr id="17" name="Picture 17"/>
@@ -6518,7 +6515,7 @@
           <w:noProof/>
         </w:rPr>
         <w:drawing>
-          <wp:inline distT="0" distB="0" distL="0" distR="0" wp14:anchorId="1F389EEC" wp14:editId="5A357B7B">
+          <wp:inline distT="0" distB="0" distL="0" distR="0" wp14:anchorId="17BA5F75" wp14:editId="63ECC4F9">
             <wp:extent cx="9464040" cy="5146072"/>
             <wp:effectExtent l="0" t="0" r="0" b="0"/>
             <wp:docPr id="18" name="Picture 18"/>
@@ -6578,7 +6575,7 @@
         <w:pStyle w:val="Heading2"/>
       </w:pPr>
       <w:r>
-        <w:t>Narasi rinci Screenshot 5 — 884 kata</w:t>
+        <w:t>Menu Akuntansi untuk alur Kantin</w:t>
       </w:r>
     </w:p>
     <w:p>
@@ -6674,13 +6671,13 @@
         <w:rPr>
           <w:sz w:val="18"/>
         </w:rPr>
-        <w:t>Diagram setelah narasi ini memodelkan use case, flowchart, dan aliran data untuk Menu Akuntansi untuk alur Kantin. Entitas yang relevan ialah Menu Akuntansi, Hak Akses, Posting History, Laporan. Use case menjelaskan siapa memicu tindakan dan siapa meninjau hasil. Flowchart menjelaskan urutan serta gerbang validasi sebelum status berubah. Diagram aliran data/ERD ringkas menunjukkan kunci hubungan antara dokumen sumber, detail, akun, transaksi akuntansi, dan laporan. Diagram bukan pengganti skema basis data f</w:t>
-      </w:r>
-      <w:r>
-        <w:rPr>
-          <w:sz w:val="18"/>
-        </w:rPr>
-        <w:t>isik; ia sengaja menampilkan relasi bisnis yang perlu dipahami key user. Keterlacakan dianggap cukup apabila nomor referensi pada transaksi dapat ditemukan pada jurnal, kode akun yang sama dapat ditemukan pada Buku Besar, dan saldo akhirnya dapat dijelaskan pada laporan.</w:t>
+        <w:t>Diagram setelah penjelasan ini memodelkan use case, flowchart, dan aliran data untuk Menu Akuntansi untuk alur Kantin. Entitas yang relevan ialah Menu Akuntansi, Hak Akses, Posting History, Laporan. Use case menjelaskan siapa memicu tindakan dan siapa meninjau hasil. Flowchart menjelaskan urutan serta gerbang validasi sebelum status berubah. Diagram aliran data/ERD ringkas menunjukkan kunci hubungan antara dokumen sumber, detail, akun, transaksi akuntansi, dan laporan. Diagram bukan pengganti skema basis da</w:t>
+      </w:r>
+      <w:r>
+        <w:rPr>
+          <w:sz w:val="18"/>
+        </w:rPr>
+        <w:t>ta fisik; ia sengaja menampilkan relasi bisnis yang perlu dipahami key user. Keterlacakan dianggap cukup apabila nomor referensi pada transaksi dapat ditemukan pada jurnal, kode akun yang sama dapat ditemukan pada Buku Besar, dan saldo akhirnya dapat dijelaskan pada laporan.</w:t>
       </w:r>
     </w:p>
     <w:p>
@@ -6727,7 +6724,7 @@
         <w:pStyle w:val="Heading2"/>
       </w:pPr>
       <w:r>
-        <w:t>Diagram terkait Screenshot 5</w:t>
+        <w:t>Diagram — Menu Akuntansi untuk alur Kantin</w:t>
       </w:r>
     </w:p>
     <w:p>
@@ -6740,7 +6737,7 @@
           <w:noProof/>
         </w:rPr>
         <w:drawing>
-          <wp:inline distT="0" distB="0" distL="0" distR="0" wp14:anchorId="50CEFCEB" wp14:editId="2FC9980B">
+          <wp:inline distT="0" distB="0" distL="0" distR="0" wp14:anchorId="0D4D6A83" wp14:editId="6DFBE633">
             <wp:extent cx="8412480" cy="1682496"/>
             <wp:effectExtent l="0" t="0" r="0" b="0"/>
             <wp:docPr id="19" name="Picture 19"/>
@@ -6800,7 +6797,7 @@
           <w:noProof/>
         </w:rPr>
         <w:drawing>
-          <wp:inline distT="0" distB="0" distL="0" distR="0" wp14:anchorId="63DA9B36" wp14:editId="54814FD1">
+          <wp:inline distT="0" distB="0" distL="0" distR="0" wp14:anchorId="73BB1EB9" wp14:editId="6C968422">
             <wp:extent cx="8412480" cy="1682496"/>
             <wp:effectExtent l="0" t="0" r="0" b="0"/>
             <wp:docPr id="20" name="Picture 20"/>
@@ -6860,7 +6857,7 @@
           <w:noProof/>
         </w:rPr>
         <w:drawing>
-          <wp:inline distT="0" distB="0" distL="0" distR="0" wp14:anchorId="7FDFDFA9" wp14:editId="4A945553">
+          <wp:inline distT="0" distB="0" distL="0" distR="0" wp14:anchorId="6557FFF7" wp14:editId="7C038B0E">
             <wp:extent cx="8412480" cy="1682496"/>
             <wp:effectExtent l="0" t="0" r="0" b="0"/>
             <wp:docPr id="21" name="Picture 21"/>
@@ -7116,7 +7113,7 @@
           <w:noProof/>
         </w:rPr>
         <w:drawing>
-          <wp:inline distT="0" distB="0" distL="0" distR="0" wp14:anchorId="379A1F9A" wp14:editId="2EBB379B">
+          <wp:inline distT="0" distB="0" distL="0" distR="0" wp14:anchorId="2EFAA09B" wp14:editId="5FF03259">
             <wp:extent cx="9464040" cy="5146072"/>
             <wp:effectExtent l="0" t="0" r="0" b="0"/>
             <wp:docPr id="22" name="Picture 22"/>
@@ -7176,7 +7173,7 @@
         <w:pStyle w:val="Heading2"/>
       </w:pPr>
       <w:r>
-        <w:t>Narasi rinci Screenshot 6 — 890 kata</w:t>
+        <w:t>Pratinjau Posting Penjualan — 102 transaksi siap</w:t>
       </w:r>
     </w:p>
     <w:p>
@@ -7272,13 +7269,13 @@
         <w:rPr>
           <w:sz w:val="18"/>
         </w:rPr>
-        <w:t>Diagram setelah narasi ini memodelkan use case, flowchart, dan aliran data untuk Pratinjau Posting Penjualan — 102 transaksi siap. Entitas yang relevan ialah Penjualan, Cara Bayar, Jenis Produk, Transaksi Akuntansi. Use case menjelaskan siapa memicu tindakan dan siapa meninjau hasil. Flowchart menjelaskan urutan serta gerbang validasi sebelum status berubah. Diagram aliran data/ERD ringkas menunjukkan kunci hubungan antara dokumen sumber, detail, akun, transaksi akuntansi, dan laporan. Diagram bukan penggan</w:t>
-      </w:r>
-      <w:r>
-        <w:rPr>
-          <w:sz w:val="18"/>
-        </w:rPr>
-        <w:t>ti skema basis data fisik; ia sengaja menampilkan relasi bisnis yang perlu dipahami key user. Keterlacakan dianggap cukup apabila nomor referensi pada transaksi dapat ditemukan pada jurnal, kode akun yang sama dapat ditemukan pada Buku Besar, dan saldo akhirnya dapat dijelaskan pada laporan.</w:t>
+        <w:t>Diagram setelah penjelasan ini memodelkan use case, flowchart, dan aliran data untuk Pratinjau Posting Penjualan — 102 transaksi siap. Entitas yang relevan ialah Penjualan, Cara Bayar, Jenis Produk, Transaksi Akuntansi. Use case menjelaskan siapa memicu tindakan dan siapa meninjau hasil. Flowchart menjelaskan urutan serta gerbang validasi sebelum status berubah. Diagram aliran data/ERD ringkas menunjukkan kunci hubungan antara dokumen sumber, detail, akun, transaksi akuntansi, dan laporan. Diagram bukan pen</w:t>
+      </w:r>
+      <w:r>
+        <w:rPr>
+          <w:sz w:val="18"/>
+        </w:rPr>
+        <w:t>gganti skema basis data fisik; ia sengaja menampilkan relasi bisnis yang perlu dipahami key user. Keterlacakan dianggap cukup apabila nomor referensi pada transaksi dapat ditemukan pada jurnal, kode akun yang sama dapat ditemukan pada Buku Besar, dan saldo akhirnya dapat dijelaskan pada laporan.</w:t>
       </w:r>
     </w:p>
     <w:p>
@@ -7325,7 +7322,7 @@
         <w:pStyle w:val="Heading2"/>
       </w:pPr>
       <w:r>
-        <w:t>Diagram terkait Screenshot 6</w:t>
+        <w:t>Diagram — Pratinjau Posting Penjualan — 102 transaksi siap</w:t>
       </w:r>
     </w:p>
     <w:p>
@@ -7338,7 +7335,7 @@
           <w:noProof/>
         </w:rPr>
         <w:drawing>
-          <wp:inline distT="0" distB="0" distL="0" distR="0" wp14:anchorId="5F50F4EC" wp14:editId="3FD0E3BE">
+          <wp:inline distT="0" distB="0" distL="0" distR="0" wp14:anchorId="1CC86A95" wp14:editId="4FAD9F55">
             <wp:extent cx="8412480" cy="1682496"/>
             <wp:effectExtent l="0" t="0" r="0" b="0"/>
             <wp:docPr id="23" name="Picture 23"/>
@@ -7398,7 +7395,7 @@
           <w:noProof/>
         </w:rPr>
         <w:drawing>
-          <wp:inline distT="0" distB="0" distL="0" distR="0" wp14:anchorId="4BBDB9FA" wp14:editId="48949060">
+          <wp:inline distT="0" distB="0" distL="0" distR="0" wp14:anchorId="52C66B7A" wp14:editId="2115FADE">
             <wp:extent cx="8412480" cy="1682496"/>
             <wp:effectExtent l="0" t="0" r="0" b="0"/>
             <wp:docPr id="24" name="Picture 24"/>
@@ -7458,7 +7455,7 @@
           <w:noProof/>
         </w:rPr>
         <w:drawing>
-          <wp:inline distT="0" distB="0" distL="0" distR="0" wp14:anchorId="06738394" wp14:editId="188B69EF">
+          <wp:inline distT="0" distB="0" distL="0" distR="0" wp14:anchorId="6345DE6E" wp14:editId="0A72FC41">
             <wp:extent cx="8412480" cy="1682496"/>
             <wp:effectExtent l="0" t="0" r="0" b="0"/>
             <wp:docPr id="25" name="Picture 25"/>
@@ -7714,7 +7711,7 @@
           <w:noProof/>
         </w:rPr>
         <w:drawing>
-          <wp:inline distT="0" distB="0" distL="0" distR="0" wp14:anchorId="376BACE6" wp14:editId="38D4BA70">
+          <wp:inline distT="0" distB="0" distL="0" distR="0" wp14:anchorId="7843F85E" wp14:editId="629C152C">
             <wp:extent cx="9464040" cy="5146072"/>
             <wp:effectExtent l="0" t="0" r="0" b="0"/>
             <wp:docPr id="26" name="Picture 26"/>
@@ -7774,7 +7771,7 @@
         <w:pStyle w:val="Heading2"/>
       </w:pPr>
       <w:r>
-        <w:t>Narasi rinci Screenshot 7 — 890 kata</w:t>
+        <w:t>Pratinjau Posting HPP — akun persediaan lengkap</w:t>
       </w:r>
     </w:p>
     <w:p>
@@ -7870,13 +7867,13 @@
         <w:rPr>
           <w:sz w:val="18"/>
         </w:rPr>
-        <w:t xml:space="preserve">Diagram setelah narasi ini memodelkan use case, flowchart, dan aliran data untuk Pratinjau Posting HPP — akun persediaan lengkap. Entitas yang relevan ialah Produk, Jenis Produk, Master Aset, Transaksi HPP. Use case menjelaskan siapa memicu tindakan dan siapa meninjau hasil. Flowchart menjelaskan urutan serta gerbang validasi sebelum status berubah. Diagram aliran data/ERD ringkas menunjukkan kunci hubungan antara dokumen sumber, detail, akun, transaksi akuntansi, dan laporan. Diagram bukan pengganti skema </w:t>
-      </w:r>
-      <w:r>
-        <w:rPr>
-          <w:sz w:val="18"/>
-        </w:rPr>
-        <w:t>basis data fisik; ia sengaja menampilkan relasi bisnis yang perlu dipahami key user. Keterlacakan dianggap cukup apabila nomor referensi pada transaksi dapat ditemukan pada jurnal, kode akun yang sama dapat ditemukan pada Buku Besar, dan saldo akhirnya dapat dijelaskan pada laporan.</w:t>
+        <w:t>Diagram setelah penjelasan ini memodelkan use case, flowchart, dan aliran data untuk Pratinjau Posting HPP — akun persediaan lengkap. Entitas yang relevan ialah Produk, Jenis Produk, Master Aset, Transaksi HPP. Use case menjelaskan siapa memicu tindakan dan siapa meninjau hasil. Flowchart menjelaskan urutan serta gerbang validasi sebelum status berubah. Diagram aliran data/ERD ringkas menunjukkan kunci hubungan antara dokumen sumber, detail, akun, transaksi akuntansi, dan laporan. Diagram bukan pengganti sk</w:t>
+      </w:r>
+      <w:r>
+        <w:rPr>
+          <w:sz w:val="18"/>
+        </w:rPr>
+        <w:t>ema basis data fisik; ia sengaja menampilkan relasi bisnis yang perlu dipahami key user. Keterlacakan dianggap cukup apabila nomor referensi pada transaksi dapat ditemukan pada jurnal, kode akun yang sama dapat ditemukan pada Buku Besar, dan saldo akhirnya dapat dijelaskan pada laporan.</w:t>
       </w:r>
     </w:p>
     <w:p>
@@ -7923,7 +7920,7 @@
         <w:pStyle w:val="Heading2"/>
       </w:pPr>
       <w:r>
-        <w:t>Diagram terkait Screenshot 7</w:t>
+        <w:t>Diagram — Pratinjau Posting HPP — akun persediaan lengkap</w:t>
       </w:r>
     </w:p>
     <w:p>
@@ -7936,7 +7933,7 @@
           <w:noProof/>
         </w:rPr>
         <w:drawing>
-          <wp:inline distT="0" distB="0" distL="0" distR="0" wp14:anchorId="54012E15" wp14:editId="4C51BBD6">
+          <wp:inline distT="0" distB="0" distL="0" distR="0" wp14:anchorId="18E52FE6" wp14:editId="2B6B4826">
             <wp:extent cx="8412480" cy="1682496"/>
             <wp:effectExtent l="0" t="0" r="0" b="0"/>
             <wp:docPr id="27" name="Picture 27"/>
@@ -7996,7 +7993,7 @@
           <w:noProof/>
         </w:rPr>
         <w:drawing>
-          <wp:inline distT="0" distB="0" distL="0" distR="0" wp14:anchorId="769FE345" wp14:editId="6EDEC8CC">
+          <wp:inline distT="0" distB="0" distL="0" distR="0" wp14:anchorId="4DBB991E" wp14:editId="30EE0065">
             <wp:extent cx="8412480" cy="1682496"/>
             <wp:effectExtent l="0" t="0" r="0" b="0"/>
             <wp:docPr id="28" name="Picture 28"/>
@@ -8056,7 +8053,7 @@
           <w:noProof/>
         </w:rPr>
         <w:drawing>
-          <wp:inline distT="0" distB="0" distL="0" distR="0" wp14:anchorId="73CA2853" wp14:editId="2D79FFD9">
+          <wp:inline distT="0" distB="0" distL="0" distR="0" wp14:anchorId="3591FD21" wp14:editId="3CA8BE0B">
             <wp:extent cx="8412480" cy="1682496"/>
             <wp:effectExtent l="0" t="0" r="0" b="0"/>
             <wp:docPr id="29" name="Picture 29"/>
@@ -8312,7 +8309,7 @@
           <w:noProof/>
         </w:rPr>
         <w:drawing>
-          <wp:inline distT="0" distB="0" distL="0" distR="0" wp14:anchorId="3C58FFE0" wp14:editId="3D5CF843">
+          <wp:inline distT="0" distB="0" distL="0" distR="0" wp14:anchorId="308F8AC8" wp14:editId="0DCBEBE2">
             <wp:extent cx="9464040" cy="5146072"/>
             <wp:effectExtent l="0" t="0" r="0" b="0"/>
             <wp:docPr id="30" name="Picture 30"/>
@@ -8372,7 +8369,7 @@
         <w:pStyle w:val="Heading2"/>
       </w:pPr>
       <w:r>
-        <w:t>Narasi rinci Screenshot 8 — 898 kata</w:t>
+        <w:t>Pratinjau Posting Kulakan — 100/100 siap</w:t>
       </w:r>
     </w:p>
     <w:p>
@@ -8468,13 +8465,13 @@
         <w:rPr>
           <w:sz w:val="18"/>
         </w:rPr>
-        <w:t>Diagram setelah narasi ini memodelkan use case, flowchart, dan aliran data untuk Pratinjau Posting Kulakan — 100/100 siap. Entitas yang relevan ialah Faktur Kulakan, Master Aset, Penyedia, Transaksi Akuntansi. Use case menjelaskan siapa memicu tindakan dan siapa meninjau hasil. Flowchart menjelaskan urutan serta gerbang validasi sebelum status berubah. Diagram aliran data/ERD ringkas menunjukkan kunci hubungan antara dokumen sumber, detail, akun, transaksi akuntansi, dan laporan. Diagram bukan pengganti ske</w:t>
-      </w:r>
-      <w:r>
-        <w:rPr>
-          <w:sz w:val="18"/>
-        </w:rPr>
-        <w:t>ma basis data fisik; ia sengaja menampilkan relasi bisnis yang perlu dipahami key user. Keterlacakan dianggap cukup apabila nomor referensi pada transaksi dapat ditemukan pada jurnal, kode akun yang sama dapat ditemukan pada Buku Besar, dan saldo akhirnya dapat dijelaskan pada laporan.</w:t>
+        <w:t>Diagram setelah penjelasan ini memodelkan use case, flowchart, dan aliran data untuk Pratinjau Posting Kulakan — 100/100 siap. Entitas yang relevan ialah Faktur Kulakan, Master Aset, Penyedia, Transaksi Akuntansi. Use case menjelaskan siapa memicu tindakan dan siapa meninjau hasil. Flowchart menjelaskan urutan serta gerbang validasi sebelum status berubah. Diagram aliran data/ERD ringkas menunjukkan kunci hubungan antara dokumen sumber, detail, akun, transaksi akuntansi, dan laporan. Diagram bukan pengganti</w:t>
+      </w:r>
+      <w:r>
+        <w:rPr>
+          <w:sz w:val="18"/>
+        </w:rPr>
+        <w:t xml:space="preserve"> skema basis data fisik; ia sengaja menampilkan relasi bisnis yang perlu dipahami key user. Keterlacakan dianggap cukup apabila nomor referensi pada transaksi dapat ditemukan pada jurnal, kode akun yang sama dapat ditemukan pada Buku Besar, dan saldo akhirnya dapat dijelaskan pada laporan.</w:t>
       </w:r>
     </w:p>
     <w:p>
@@ -8521,7 +8518,7 @@
         <w:pStyle w:val="Heading2"/>
       </w:pPr>
       <w:r>
-        <w:t>Diagram terkait Screenshot 8</w:t>
+        <w:t>Diagram — Pratinjau Posting Kulakan — 100/100 siap</w:t>
       </w:r>
     </w:p>
     <w:p>
@@ -8534,7 +8531,7 @@
           <w:noProof/>
         </w:rPr>
         <w:drawing>
-          <wp:inline distT="0" distB="0" distL="0" distR="0" wp14:anchorId="32ACEB8C" wp14:editId="2ED51F18">
+          <wp:inline distT="0" distB="0" distL="0" distR="0" wp14:anchorId="6324ECAE" wp14:editId="1A98B62A">
             <wp:extent cx="8412480" cy="1682496"/>
             <wp:effectExtent l="0" t="0" r="0" b="0"/>
             <wp:docPr id="31" name="Picture 31"/>
@@ -8594,7 +8591,7 @@
           <w:noProof/>
         </w:rPr>
         <w:drawing>
-          <wp:inline distT="0" distB="0" distL="0" distR="0" wp14:anchorId="4116AF44" wp14:editId="1E4E8B7D">
+          <wp:inline distT="0" distB="0" distL="0" distR="0" wp14:anchorId="6F9132C3" wp14:editId="305543F3">
             <wp:extent cx="8412480" cy="1682496"/>
             <wp:effectExtent l="0" t="0" r="0" b="0"/>
             <wp:docPr id="32" name="Picture 32"/>
@@ -8654,7 +8651,7 @@
           <w:noProof/>
         </w:rPr>
         <w:drawing>
-          <wp:inline distT="0" distB="0" distL="0" distR="0" wp14:anchorId="4649EE56" wp14:editId="1D492E5D">
+          <wp:inline distT="0" distB="0" distL="0" distR="0" wp14:anchorId="521C8456" wp14:editId="2B0DC6E3">
             <wp:extent cx="8412480" cy="1682496"/>
             <wp:effectExtent l="0" t="0" r="0" b="0"/>
             <wp:docPr id="33" name="Picture 33"/>
@@ -8910,7 +8907,7 @@
           <w:noProof/>
         </w:rPr>
         <w:drawing>
-          <wp:inline distT="0" distB="0" distL="0" distR="0" wp14:anchorId="1B846673" wp14:editId="415B1A40">
+          <wp:inline distT="0" distB="0" distL="0" distR="0" wp14:anchorId="4A93BEAB" wp14:editId="2106758C">
             <wp:extent cx="9464040" cy="5146072"/>
             <wp:effectExtent l="0" t="0" r="0" b="0"/>
             <wp:docPr id="34" name="Picture 34"/>
@@ -8970,7 +8967,7 @@
         <w:pStyle w:val="Heading2"/>
       </w:pPr>
       <w:r>
-        <w:t>Narasi rinci Screenshot 9 — 880 kata</w:t>
+        <w:t>Draft Jurnal sebelum posting</w:t>
       </w:r>
     </w:p>
     <w:p>
@@ -9066,13 +9063,13 @@
         <w:rPr>
           <w:sz w:val="18"/>
         </w:rPr>
-        <w:t>Diagram setelah narasi ini memodelkan use case, flowchart, dan aliran data untuk Draft Jurnal sebelum posting. Entitas yang relevan ialah Dokumen Sumber, Draft Jurnal, Posting History, Transaksi Akuntansi. Use case menjelaskan siapa memicu tindakan dan siapa meninjau hasil. Flowchart menjelaskan urutan serta gerbang validasi sebelum status berubah. Diagram aliran data/ERD ringkas menunjukkan kunci hubungan antara dokumen sumber, detail, akun, transaksi akuntansi, dan laporan. Diagram bukan pengganti skema b</w:t>
-      </w:r>
-      <w:r>
-        <w:rPr>
-          <w:sz w:val="18"/>
-        </w:rPr>
-        <w:t>asis data fisik; ia sengaja menampilkan relasi bisnis yang perlu dipahami key user. Keterlacakan dianggap cukup apabila nomor referensi pada transaksi dapat ditemukan pada jurnal, kode akun yang sama dapat ditemukan pada Buku Besar, dan saldo akhirnya dapat dijelaskan pada laporan.</w:t>
+        <w:t>Diagram setelah penjelasan ini memodelkan use case, flowchart, dan aliran data untuk Draft Jurnal sebelum posting. Entitas yang relevan ialah Dokumen Sumber, Draft Jurnal, Posting History, Transaksi Akuntansi. Use case menjelaskan siapa memicu tindakan dan siapa meninjau hasil. Flowchart menjelaskan urutan serta gerbang validasi sebelum status berubah. Diagram aliran data/ERD ringkas menunjukkan kunci hubungan antara dokumen sumber, detail, akun, transaksi akuntansi, dan laporan. Diagram bukan pengganti ske</w:t>
+      </w:r>
+      <w:r>
+        <w:rPr>
+          <w:sz w:val="18"/>
+        </w:rPr>
+        <w:t>ma basis data fisik; ia sengaja menampilkan relasi bisnis yang perlu dipahami key user. Keterlacakan dianggap cukup apabila nomor referensi pada transaksi dapat ditemukan pada jurnal, kode akun yang sama dapat ditemukan pada Buku Besar, dan saldo akhirnya dapat dijelaskan pada laporan.</w:t>
       </w:r>
     </w:p>
     <w:p>
@@ -9119,7 +9116,7 @@
         <w:pStyle w:val="Heading2"/>
       </w:pPr>
       <w:r>
-        <w:t>Diagram terkait Screenshot 9</w:t>
+        <w:t>Diagram — Draft Jurnal sebelum posting</w:t>
       </w:r>
     </w:p>
     <w:p>
@@ -9132,7 +9129,7 @@
           <w:noProof/>
         </w:rPr>
         <w:drawing>
-          <wp:inline distT="0" distB="0" distL="0" distR="0" wp14:anchorId="5F0AE63C" wp14:editId="402F7599">
+          <wp:inline distT="0" distB="0" distL="0" distR="0" wp14:anchorId="0FD84405" wp14:editId="76B62438">
             <wp:extent cx="8412480" cy="1682496"/>
             <wp:effectExtent l="0" t="0" r="0" b="0"/>
             <wp:docPr id="35" name="Picture 35"/>
@@ -9192,7 +9189,7 @@
           <w:noProof/>
         </w:rPr>
         <w:drawing>
-          <wp:inline distT="0" distB="0" distL="0" distR="0" wp14:anchorId="77BF3456" wp14:editId="7D47CB90">
+          <wp:inline distT="0" distB="0" distL="0" distR="0" wp14:anchorId="44985F38" wp14:editId="2489D052">
             <wp:extent cx="8412480" cy="1682496"/>
             <wp:effectExtent l="0" t="0" r="0" b="0"/>
             <wp:docPr id="36" name="Picture 36"/>
@@ -9252,7 +9249,7 @@
           <w:noProof/>
         </w:rPr>
         <w:drawing>
-          <wp:inline distT="0" distB="0" distL="0" distR="0" wp14:anchorId="46594B1F" wp14:editId="6AA3CF2F">
+          <wp:inline distT="0" distB="0" distL="0" distR="0" wp14:anchorId="56099F9F" wp14:editId="4A3D7BB1">
             <wp:extent cx="8412480" cy="1682496"/>
             <wp:effectExtent l="0" t="0" r="0" b="0"/>
             <wp:docPr id="37" name="Picture 37"/>
@@ -9508,7 +9505,7 @@
           <w:noProof/>
         </w:rPr>
         <w:drawing>
-          <wp:inline distT="0" distB="0" distL="0" distR="0" wp14:anchorId="29501FA2" wp14:editId="01DA505D">
+          <wp:inline distT="0" distB="0" distL="0" distR="0" wp14:anchorId="33BF027A" wp14:editId="41CEDF9B">
             <wp:extent cx="9464040" cy="5146072"/>
             <wp:effectExtent l="0" t="0" r="0" b="0"/>
             <wp:docPr id="38" name="Picture 38"/>
@@ -9568,7 +9565,7 @@
         <w:pStyle w:val="Heading2"/>
       </w:pPr>
       <w:r>
-        <w:t>Narasi rinci Screenshot 10 — 897 kata</w:t>
+        <w:t>Panel sumber akun Posting Penjualan</w:t>
       </w:r>
     </w:p>
     <w:p>
@@ -9664,13 +9661,13 @@
         <w:rPr>
           <w:sz w:val="18"/>
         </w:rPr>
-        <w:t>Diagram setelah narasi ini memodelkan use case, flowchart, dan aliran data untuk Panel sumber akun Posting Penjualan. Entitas yang relevan ialah Cara Pembayaran, Toko, Jenis Produk, Pratinjau Penjualan. Use case menjelaskan siapa memicu tindakan dan siapa meninjau hasil. Flowchart menjelaskan urutan serta gerbang validasi sebelum status berubah. Diagram aliran data/ERD ringkas menunjukkan kunci hubungan antara dokumen sumber, detail, akun, transaksi akuntansi, dan laporan. Diagram bukan pengganti skema basi</w:t>
-      </w:r>
-      <w:r>
-        <w:rPr>
-          <w:sz w:val="18"/>
-        </w:rPr>
-        <w:t>s data fisik; ia sengaja menampilkan relasi bisnis yang perlu dipahami key user. Keterlacakan dianggap cukup apabila nomor referensi pada transaksi dapat ditemukan pada jurnal, kode akun yang sama dapat ditemukan pada Buku Besar, dan saldo akhirnya dapat dijelaskan pada laporan.</w:t>
+        <w:t xml:space="preserve">Diagram setelah penjelasan ini memodelkan use case, flowchart, dan aliran data untuk Panel sumber akun Posting Penjualan. Entitas yang relevan ialah Cara Pembayaran, Toko, Jenis Produk, Pratinjau Penjualan. Use case menjelaskan siapa memicu tindakan dan siapa meninjau hasil. Flowchart menjelaskan urutan serta gerbang validasi sebelum status berubah. Diagram aliran data/ERD ringkas menunjukkan kunci hubungan antara dokumen sumber, detail, akun, transaksi akuntansi, dan laporan. Diagram bukan pengganti skema </w:t>
+      </w:r>
+      <w:r>
+        <w:rPr>
+          <w:sz w:val="18"/>
+        </w:rPr>
+        <w:t>basis data fisik; ia sengaja menampilkan relasi bisnis yang perlu dipahami key user. Keterlacakan dianggap cukup apabila nomor referensi pada transaksi dapat ditemukan pada jurnal, kode akun yang sama dapat ditemukan pada Buku Besar, dan saldo akhirnya dapat dijelaskan pada laporan.</w:t>
       </w:r>
     </w:p>
     <w:p>
@@ -9717,7 +9714,7 @@
         <w:pStyle w:val="Heading2"/>
       </w:pPr>
       <w:r>
-        <w:t>Diagram terkait Screenshot 10</w:t>
+        <w:t>Diagram — Panel sumber akun Posting Penjualan</w:t>
       </w:r>
     </w:p>
     <w:p>
@@ -9730,7 +9727,7 @@
           <w:noProof/>
         </w:rPr>
         <w:drawing>
-          <wp:inline distT="0" distB="0" distL="0" distR="0" wp14:anchorId="2F49B057" wp14:editId="38FEC80F">
+          <wp:inline distT="0" distB="0" distL="0" distR="0" wp14:anchorId="38651C9E" wp14:editId="1A07B50A">
             <wp:extent cx="8412480" cy="1682496"/>
             <wp:effectExtent l="0" t="0" r="0" b="0"/>
             <wp:docPr id="39" name="Picture 39"/>
@@ -9790,7 +9787,7 @@
           <w:noProof/>
         </w:rPr>
         <w:drawing>
-          <wp:inline distT="0" distB="0" distL="0" distR="0" wp14:anchorId="214DB8C0" wp14:editId="3DB5544C">
+          <wp:inline distT="0" distB="0" distL="0" distR="0" wp14:anchorId="34B8F9BB" wp14:editId="37513E25">
             <wp:extent cx="8412480" cy="1682496"/>
             <wp:effectExtent l="0" t="0" r="0" b="0"/>
             <wp:docPr id="40" name="Picture 40"/>
@@ -9850,7 +9847,7 @@
           <w:noProof/>
         </w:rPr>
         <w:drawing>
-          <wp:inline distT="0" distB="0" distL="0" distR="0" wp14:anchorId="706FCA70" wp14:editId="0BB61AEF">
+          <wp:inline distT="0" distB="0" distL="0" distR="0" wp14:anchorId="42C9E8A8" wp14:editId="56EF5F5A">
             <wp:extent cx="8412480" cy="1682496"/>
             <wp:effectExtent l="0" t="0" r="0" b="0"/>
             <wp:docPr id="41" name="Picture 41"/>
@@ -10106,7 +10103,7 @@
           <w:noProof/>
         </w:rPr>
         <w:drawing>
-          <wp:inline distT="0" distB="0" distL="0" distR="0" wp14:anchorId="6433FA32" wp14:editId="391232EC">
+          <wp:inline distT="0" distB="0" distL="0" distR="0" wp14:anchorId="3829F63C" wp14:editId="3CD81CE9">
             <wp:extent cx="9464040" cy="5146072"/>
             <wp:effectExtent l="0" t="0" r="0" b="0"/>
             <wp:docPr id="42" name="Picture 42"/>
@@ -10166,7 +10163,7 @@
         <w:pStyle w:val="Heading2"/>
       </w:pPr>
       <w:r>
-        <w:t>Narasi rinci Screenshot 11 — 897 kata</w:t>
+        <w:t>Panel sumber akun Posting HPP</w:t>
       </w:r>
     </w:p>
     <w:p>
@@ -10262,13 +10259,13 @@
         <w:rPr>
           <w:sz w:val="18"/>
         </w:rPr>
-        <w:t xml:space="preserve">Diagram setelah narasi ini memodelkan use case, flowchart, dan aliran data untuk Panel sumber akun Posting HPP. Entitas yang relevan ialah Jenis Produk, Kelompok Aset, Master Aset, Pratinjau HPP. Use case menjelaskan siapa memicu tindakan dan siapa meninjau hasil. Flowchart menjelaskan urutan serta gerbang validasi sebelum status berubah. Diagram aliran data/ERD ringkas menunjukkan kunci hubungan antara dokumen sumber, detail, akun, transaksi akuntansi, dan laporan. Diagram bukan pengganti skema basis data </w:t>
-      </w:r>
-      <w:r>
-        <w:rPr>
-          <w:sz w:val="18"/>
-        </w:rPr>
-        <w:t>fisik; ia sengaja menampilkan relasi bisnis yang perlu dipahami key user. Keterlacakan dianggap cukup apabila nomor referensi pada transaksi dapat ditemukan pada jurnal, kode akun yang sama dapat ditemukan pada Buku Besar, dan saldo akhirnya dapat dijelaskan pada laporan.</w:t>
+        <w:t>Diagram setelah penjelasan ini memodelkan use case, flowchart, dan aliran data untuk Panel sumber akun Posting HPP. Entitas yang relevan ialah Jenis Produk, Kelompok Aset, Master Aset, Pratinjau HPP. Use case menjelaskan siapa memicu tindakan dan siapa meninjau hasil. Flowchart menjelaskan urutan serta gerbang validasi sebelum status berubah. Diagram aliran data/ERD ringkas menunjukkan kunci hubungan antara dokumen sumber, detail, akun, transaksi akuntansi, dan laporan. Diagram bukan pengganti skema basis d</w:t>
+      </w:r>
+      <w:r>
+        <w:rPr>
+          <w:sz w:val="18"/>
+        </w:rPr>
+        <w:t>ata fisik; ia sengaja menampilkan relasi bisnis yang perlu dipahami key user. Keterlacakan dianggap cukup apabila nomor referensi pada transaksi dapat ditemukan pada jurnal, kode akun yang sama dapat ditemukan pada Buku Besar, dan saldo akhirnya dapat dijelaskan pada laporan.</w:t>
       </w:r>
     </w:p>
     <w:p>
@@ -10315,7 +10312,7 @@
         <w:pStyle w:val="Heading2"/>
       </w:pPr>
       <w:r>
-        <w:t>Diagram terkait Screenshot 11</w:t>
+        <w:t>Diagram — Panel sumber akun Posting HPP</w:t>
       </w:r>
     </w:p>
     <w:p>
@@ -10328,7 +10325,7 @@
           <w:noProof/>
         </w:rPr>
         <w:drawing>
-          <wp:inline distT="0" distB="0" distL="0" distR="0" wp14:anchorId="0A384AA6" wp14:editId="2C947DA6">
+          <wp:inline distT="0" distB="0" distL="0" distR="0" wp14:anchorId="49D9EA90" wp14:editId="480880EF">
             <wp:extent cx="8412480" cy="1682496"/>
             <wp:effectExtent l="0" t="0" r="0" b="0"/>
             <wp:docPr id="43" name="Picture 43"/>
@@ -10388,7 +10385,7 @@
           <w:noProof/>
         </w:rPr>
         <w:drawing>
-          <wp:inline distT="0" distB="0" distL="0" distR="0" wp14:anchorId="57A51DBF" wp14:editId="74731D6C">
+          <wp:inline distT="0" distB="0" distL="0" distR="0" wp14:anchorId="09473CE0" wp14:editId="0CF70E02">
             <wp:extent cx="8412480" cy="1682496"/>
             <wp:effectExtent l="0" t="0" r="0" b="0"/>
             <wp:docPr id="44" name="Picture 44"/>
@@ -10448,7 +10445,7 @@
           <w:noProof/>
         </w:rPr>
         <w:drawing>
-          <wp:inline distT="0" distB="0" distL="0" distR="0" wp14:anchorId="7F3CADCB" wp14:editId="55E444CC">
+          <wp:inline distT="0" distB="0" distL="0" distR="0" wp14:anchorId="7CE111C7" wp14:editId="61740231">
             <wp:extent cx="8412480" cy="1682496"/>
             <wp:effectExtent l="0" t="0" r="0" b="0"/>
             <wp:docPr id="45" name="Picture 45"/>
@@ -10704,7 +10701,7 @@
           <w:noProof/>
         </w:rPr>
         <w:drawing>
-          <wp:inline distT="0" distB="0" distL="0" distR="0" wp14:anchorId="31303049" wp14:editId="20B922C2">
+          <wp:inline distT="0" distB="0" distL="0" distR="0" wp14:anchorId="3A84F83A" wp14:editId="1A33AE87">
             <wp:extent cx="9464040" cy="5146072"/>
             <wp:effectExtent l="0" t="0" r="0" b="0"/>
             <wp:docPr id="46" name="Picture 46"/>
@@ -10764,7 +10761,7 @@
         <w:pStyle w:val="Heading2"/>
       </w:pPr>
       <w:r>
-        <w:t>Narasi rinci Screenshot 12 — 892 kata</w:t>
+        <w:t>Panel sumber akun Posting Kulakan</w:t>
       </w:r>
     </w:p>
     <w:p>
@@ -10860,13 +10857,13 @@
         <w:rPr>
           <w:sz w:val="18"/>
         </w:rPr>
-        <w:t>Diagram setelah narasi ini memodelkan use case, flowchart, dan aliran data untuk Panel sumber akun Posting Kulakan. Entitas yang relevan ialah Master Aset, Kelompok Aset, Penyedia, Cara Pembayaran. Use case menjelaskan siapa memicu tindakan dan siapa meninjau hasil. Flowchart menjelaskan urutan serta gerbang validasi sebelum status berubah. Diagram aliran data/ERD ringkas menunjukkan kunci hubungan antara dokumen sumber, detail, akun, transaksi akuntansi, dan laporan. Diagram bukan pengganti skema basis dat</w:t>
-      </w:r>
-      <w:r>
-        <w:rPr>
-          <w:sz w:val="18"/>
-        </w:rPr>
-        <w:t>a fisik; ia sengaja menampilkan relasi bisnis yang perlu dipahami key user. Keterlacakan dianggap cukup apabila nomor referensi pada transaksi dapat ditemukan pada jurnal, kode akun yang sama dapat ditemukan pada Buku Besar, dan saldo akhirnya dapat dijelaskan pada laporan.</w:t>
+        <w:t>Diagram setelah penjelasan ini memodelkan use case, flowchart, dan aliran data untuk Panel sumber akun Posting Kulakan. Entitas yang relevan ialah Master Aset, Kelompok Aset, Penyedia, Cara Pembayaran. Use case menjelaskan siapa memicu tindakan dan siapa meninjau hasil. Flowchart menjelaskan urutan serta gerbang validasi sebelum status berubah. Diagram aliran data/ERD ringkas menunjukkan kunci hubungan antara dokumen sumber, detail, akun, transaksi akuntansi, dan laporan. Diagram bukan pengganti skema basis</w:t>
+      </w:r>
+      <w:r>
+        <w:rPr>
+          <w:sz w:val="18"/>
+        </w:rPr>
+        <w:t xml:space="preserve"> data fisik; ia sengaja menampilkan relasi bisnis yang perlu dipahami key user. Keterlacakan dianggap cukup apabila nomor referensi pada transaksi dapat ditemukan pada jurnal, kode akun yang sama dapat ditemukan pada Buku Besar, dan saldo akhirnya dapat dijelaskan pada laporan.</w:t>
       </w:r>
     </w:p>
     <w:p>
@@ -10913,7 +10910,7 @@
         <w:pStyle w:val="Heading2"/>
       </w:pPr>
       <w:r>
-        <w:t>Diagram terkait Screenshot 12</w:t>
+        <w:t>Diagram — Panel sumber akun Posting Kulakan</w:t>
       </w:r>
     </w:p>
     <w:p>
@@ -10926,7 +10923,7 @@
           <w:noProof/>
         </w:rPr>
         <w:drawing>
-          <wp:inline distT="0" distB="0" distL="0" distR="0" wp14:anchorId="797735D4" wp14:editId="6D58FF8C">
+          <wp:inline distT="0" distB="0" distL="0" distR="0" wp14:anchorId="4BBB2245" wp14:editId="651E97DE">
             <wp:extent cx="8412480" cy="1682496"/>
             <wp:effectExtent l="0" t="0" r="0" b="0"/>
             <wp:docPr id="47" name="Picture 47"/>
@@ -10986,7 +10983,7 @@
           <w:noProof/>
         </w:rPr>
         <w:drawing>
-          <wp:inline distT="0" distB="0" distL="0" distR="0" wp14:anchorId="0A508FAE" wp14:editId="4FA4B664">
+          <wp:inline distT="0" distB="0" distL="0" distR="0" wp14:anchorId="61B50194" wp14:editId="780A741D">
             <wp:extent cx="8412480" cy="1682496"/>
             <wp:effectExtent l="0" t="0" r="0" b="0"/>
             <wp:docPr id="48" name="Picture 48"/>
@@ -11046,7 +11043,7 @@
           <w:noProof/>
         </w:rPr>
         <w:drawing>
-          <wp:inline distT="0" distB="0" distL="0" distR="0" wp14:anchorId="7CF5EC4C" wp14:editId="017714E0">
+          <wp:inline distT="0" distB="0" distL="0" distR="0" wp14:anchorId="44156536" wp14:editId="03D89905">
             <wp:extent cx="8412480" cy="1682496"/>
             <wp:effectExtent l="0" t="0" r="0" b="0"/>
             <wp:docPr id="49" name="Picture 49"/>
@@ -11302,7 +11299,7 @@
           <w:noProof/>
         </w:rPr>
         <w:drawing>
-          <wp:inline distT="0" distB="0" distL="0" distR="0" wp14:anchorId="50689331" wp14:editId="56E39305">
+          <wp:inline distT="0" distB="0" distL="0" distR="0" wp14:anchorId="27730479" wp14:editId="027F5D85">
             <wp:extent cx="9464040" cy="5146072"/>
             <wp:effectExtent l="0" t="0" r="0" b="0"/>
             <wp:docPr id="50" name="Picture 50"/>
@@ -11362,7 +11359,7 @@
         <w:pStyle w:val="Heading2"/>
       </w:pPr>
       <w:r>
-        <w:t>Narasi rinci Screenshot 13 — 888 kata</w:t>
+        <w:t>Draft Jurnal setelah seluruh posting Kantin</w:t>
       </w:r>
     </w:p>
     <w:p>
@@ -11458,13 +11455,13 @@
         <w:rPr>
           <w:sz w:val="18"/>
         </w:rPr>
-        <w:t>Diagram setelah narasi ini memodelkan use case, flowchart, dan aliran data untuk Draft Jurnal setelah seluruh posting Kantin. Entitas yang relevan ialah Draft Jurnal, Posting History, Transaksi Akuntansi, Closing. Use case menjelaskan siapa memicu tindakan dan siapa meninjau hasil. Flowchart menjelaskan urutan serta gerbang validasi sebelum status berubah. Diagram aliran data/ERD ringkas menunjukkan kunci hubungan antara dokumen sumber, detail, akun, transaksi akuntansi, dan laporan. Diagram bukan pengganti</w:t>
-      </w:r>
-      <w:r>
-        <w:rPr>
-          <w:sz w:val="18"/>
-        </w:rPr>
-        <w:t xml:space="preserve"> skema basis data fisik; ia sengaja menampilkan relasi bisnis yang perlu dipahami key user. Keterlacakan dianggap cukup apabila nomor referensi pada transaksi dapat ditemukan pada jurnal, kode akun yang sama dapat ditemukan pada Buku Besar, dan saldo akhirnya dapat dijelaskan pada laporan.</w:t>
+        <w:t>Diagram setelah penjelasan ini memodelkan use case, flowchart, dan aliran data untuk Draft Jurnal setelah seluruh posting Kantin. Entitas yang relevan ialah Draft Jurnal, Posting History, Transaksi Akuntansi, Closing. Use case menjelaskan siapa memicu tindakan dan siapa meninjau hasil. Flowchart menjelaskan urutan serta gerbang validasi sebelum status berubah. Diagram aliran data/ERD ringkas menunjukkan kunci hubungan antara dokumen sumber, detail, akun, transaksi akuntansi, dan laporan. Diagram bukan pengg</w:t>
+      </w:r>
+      <w:r>
+        <w:rPr>
+          <w:sz w:val="18"/>
+        </w:rPr>
+        <w:t>anti skema basis data fisik; ia sengaja menampilkan relasi bisnis yang perlu dipahami key user. Keterlacakan dianggap cukup apabila nomor referensi pada transaksi dapat ditemukan pada jurnal, kode akun yang sama dapat ditemukan pada Buku Besar, dan saldo akhirnya dapat dijelaskan pada laporan.</w:t>
       </w:r>
     </w:p>
     <w:p>
@@ -11511,7 +11508,7 @@
         <w:pStyle w:val="Heading2"/>
       </w:pPr>
       <w:r>
-        <w:t>Diagram terkait Screenshot 13</w:t>
+        <w:t>Diagram — Draft Jurnal setelah seluruh posting Kantin</w:t>
       </w:r>
     </w:p>
     <w:p>
@@ -11524,7 +11521,7 @@
           <w:noProof/>
         </w:rPr>
         <w:drawing>
-          <wp:inline distT="0" distB="0" distL="0" distR="0" wp14:anchorId="738C1269" wp14:editId="5FAB400D">
+          <wp:inline distT="0" distB="0" distL="0" distR="0" wp14:anchorId="6B335656" wp14:editId="2B8402BA">
             <wp:extent cx="8412480" cy="1682496"/>
             <wp:effectExtent l="0" t="0" r="0" b="0"/>
             <wp:docPr id="51" name="Picture 51"/>
@@ -11584,7 +11581,7 @@
           <w:noProof/>
         </w:rPr>
         <w:drawing>
-          <wp:inline distT="0" distB="0" distL="0" distR="0" wp14:anchorId="47C520F1" wp14:editId="708D9ECE">
+          <wp:inline distT="0" distB="0" distL="0" distR="0" wp14:anchorId="0269701E" wp14:editId="21FEDA82">
             <wp:extent cx="8412480" cy="1682496"/>
             <wp:effectExtent l="0" t="0" r="0" b="0"/>
             <wp:docPr id="52" name="Picture 52"/>
@@ -11644,7 +11641,7 @@
           <w:noProof/>
         </w:rPr>
         <w:drawing>
-          <wp:inline distT="0" distB="0" distL="0" distR="0" wp14:anchorId="04123C33" wp14:editId="4A9C31A4">
+          <wp:inline distT="0" distB="0" distL="0" distR="0" wp14:anchorId="49117C21" wp14:editId="3ED3D2BC">
             <wp:extent cx="8412480" cy="1682496"/>
             <wp:effectExtent l="0" t="0" r="0" b="0"/>
             <wp:docPr id="53" name="Picture 53"/>
@@ -11900,7 +11897,7 @@
           <w:noProof/>
         </w:rPr>
         <w:drawing>
-          <wp:inline distT="0" distB="0" distL="0" distR="0" wp14:anchorId="6529347F" wp14:editId="78CFD6C2">
+          <wp:inline distT="0" distB="0" distL="0" distR="0" wp14:anchorId="5F483A7B" wp14:editId="70F865C2">
             <wp:extent cx="9464040" cy="5146072"/>
             <wp:effectExtent l="0" t="0" r="0" b="0"/>
             <wp:docPr id="54" name="Picture 54"/>
@@ -11960,7 +11957,7 @@
         <w:pStyle w:val="Heading2"/>
       </w:pPr>
       <w:r>
-        <w:t>Narasi rinci Screenshot 14 — 881 kata</w:t>
+        <w:t>Daftar Jurnal Umum</w:t>
       </w:r>
     </w:p>
     <w:p>
@@ -12056,13 +12053,13 @@
         <w:rPr>
           <w:sz w:val="18"/>
         </w:rPr>
-        <w:t>Diagram setelah narasi ini memodelkan use case, flowchart, dan aliran data untuk Daftar Jurnal Umum. Entitas yang relevan ialah Jurnal Umum, Detail Jurnal, Akun, Mata Anggaran. Use case menjelaskan siapa memicu tindakan dan siapa meninjau hasil. Flowchart menjelaskan urutan serta gerbang validasi sebelum status berubah. Diagram aliran data/ERD ringkas menunjukkan kunci hubungan antara dokumen sumber, detail, akun, transaksi akuntansi, dan laporan. Diagram bukan pengganti skema basis data fisik; ia sengaja m</w:t>
-      </w:r>
-      <w:r>
-        <w:rPr>
-          <w:sz w:val="18"/>
-        </w:rPr>
-        <w:t>enampilkan relasi bisnis yang perlu dipahami key user. Keterlacakan dianggap cukup apabila nomor referensi pada transaksi dapat ditemukan pada jurnal, kode akun yang sama dapat ditemukan pada Buku Besar, dan saldo akhirnya dapat dijelaskan pada laporan.</w:t>
+        <w:t>Diagram setelah penjelasan ini memodelkan use case, flowchart, dan aliran data untuk Daftar Jurnal Umum. Entitas yang relevan ialah Jurnal Umum, Detail Jurnal, Akun, Mata Anggaran. Use case menjelaskan siapa memicu tindakan dan siapa meninjau hasil. Flowchart menjelaskan urutan serta gerbang validasi sebelum status berubah. Diagram aliran data/ERD ringkas menunjukkan kunci hubungan antara dokumen sumber, detail, akun, transaksi akuntansi, dan laporan. Diagram bukan pengganti skema basis data fisik; ia senga</w:t>
+      </w:r>
+      <w:r>
+        <w:rPr>
+          <w:sz w:val="18"/>
+        </w:rPr>
+        <w:t>ja menampilkan relasi bisnis yang perlu dipahami key user. Keterlacakan dianggap cukup apabila nomor referensi pada transaksi dapat ditemukan pada jurnal, kode akun yang sama dapat ditemukan pada Buku Besar, dan saldo akhirnya dapat dijelaskan pada laporan.</w:t>
       </w:r>
     </w:p>
     <w:p>
@@ -12109,7 +12106,7 @@
         <w:pStyle w:val="Heading2"/>
       </w:pPr>
       <w:r>
-        <w:t>Diagram terkait Screenshot 14</w:t>
+        <w:t>Diagram — Daftar Jurnal Umum</w:t>
       </w:r>
     </w:p>
     <w:p>
@@ -12122,7 +12119,7 @@
           <w:noProof/>
         </w:rPr>
         <w:drawing>
-          <wp:inline distT="0" distB="0" distL="0" distR="0" wp14:anchorId="586EBC86" wp14:editId="2B4337D3">
+          <wp:inline distT="0" distB="0" distL="0" distR="0" wp14:anchorId="0464C4F5" wp14:editId="28E499B0">
             <wp:extent cx="8412480" cy="1682496"/>
             <wp:effectExtent l="0" t="0" r="0" b="0"/>
             <wp:docPr id="55" name="Picture 55"/>
@@ -12182,7 +12179,7 @@
           <w:noProof/>
         </w:rPr>
         <w:drawing>
-          <wp:inline distT="0" distB="0" distL="0" distR="0" wp14:anchorId="4CC156A5" wp14:editId="3025CC3D">
+          <wp:inline distT="0" distB="0" distL="0" distR="0" wp14:anchorId="64E8AEA1" wp14:editId="4D805172">
             <wp:extent cx="8412480" cy="1682496"/>
             <wp:effectExtent l="0" t="0" r="0" b="0"/>
             <wp:docPr id="56" name="Picture 56"/>
@@ -12242,7 +12239,7 @@
           <w:noProof/>
         </w:rPr>
         <w:drawing>
-          <wp:inline distT="0" distB="0" distL="0" distR="0" wp14:anchorId="351900E6" wp14:editId="1B444F00">
+          <wp:inline distT="0" distB="0" distL="0" distR="0" wp14:anchorId="4EC15F06" wp14:editId="6B67567F">
             <wp:extent cx="8412480" cy="1682496"/>
             <wp:effectExtent l="0" t="0" r="0" b="0"/>
             <wp:docPr id="57" name="Picture 57"/>
@@ -12498,7 +12495,7 @@
           <w:noProof/>
         </w:rPr>
         <w:drawing>
-          <wp:inline distT="0" distB="0" distL="0" distR="0" wp14:anchorId="26976581" wp14:editId="191DC9AD">
+          <wp:inline distT="0" distB="0" distL="0" distR="0" wp14:anchorId="766E46DC" wp14:editId="7FA16885">
             <wp:extent cx="9464040" cy="5146072"/>
             <wp:effectExtent l="0" t="0" r="0" b="0"/>
             <wp:docPr id="58" name="Picture 58"/>
@@ -12558,7 +12555,7 @@
         <w:pStyle w:val="Heading2"/>
       </w:pPr>
       <w:r>
-        <w:t>Narasi rinci Screenshot 15 — 901 kata</w:t>
+        <w:t>Form Jurnal Umum seimbang Rp750.000</w:t>
       </w:r>
     </w:p>
     <w:p>
@@ -12654,13 +12651,13 @@
         <w:rPr>
           <w:sz w:val="18"/>
         </w:rPr>
-        <w:t>Diagram setelah narasi ini memodelkan use case, flowchart, dan aliran data untuk Form Jurnal Umum seimbang Rp750.000. Entitas yang relevan ialah Jurnal Umum, Detail Jurnal, Akun Beban, Akun Kas. Use case menjelaskan siapa memicu tindakan dan siapa meninjau hasil. Flowchart menjelaskan urutan serta gerbang validasi sebelum status berubah. Diagram aliran data/ERD ringkas menunjukkan kunci hubungan antara dokumen sumber, detail, akun, transaksi akuntansi, dan laporan. Diagram bukan pengganti skema basis data f</w:t>
-      </w:r>
-      <w:r>
-        <w:rPr>
-          <w:sz w:val="18"/>
-        </w:rPr>
-        <w:t>isik; ia sengaja menampilkan relasi bisnis yang perlu dipahami key user. Keterlacakan dianggap cukup apabila nomor referensi pada transaksi dapat ditemukan pada jurnal, kode akun yang sama dapat ditemukan pada Buku Besar, dan saldo akhirnya dapat dijelaskan pada laporan.</w:t>
+        <w:t>Diagram setelah penjelasan ini memodelkan use case, flowchart, dan aliran data untuk Form Jurnal Umum seimbang Rp750.000. Entitas yang relevan ialah Jurnal Umum, Detail Jurnal, Akun Beban, Akun Kas. Use case menjelaskan siapa memicu tindakan dan siapa meninjau hasil. Flowchart menjelaskan urutan serta gerbang validasi sebelum status berubah. Diagram aliran data/ERD ringkas menunjukkan kunci hubungan antara dokumen sumber, detail, akun, transaksi akuntansi, dan laporan. Diagram bukan pengganti skema basis da</w:t>
+      </w:r>
+      <w:r>
+        <w:rPr>
+          <w:sz w:val="18"/>
+        </w:rPr>
+        <w:t>ta fisik; ia sengaja menampilkan relasi bisnis yang perlu dipahami key user. Keterlacakan dianggap cukup apabila nomor referensi pada transaksi dapat ditemukan pada jurnal, kode akun yang sama dapat ditemukan pada Buku Besar, dan saldo akhirnya dapat dijelaskan pada laporan.</w:t>
       </w:r>
     </w:p>
     <w:p>
@@ -12707,7 +12704,7 @@
         <w:pStyle w:val="Heading2"/>
       </w:pPr>
       <w:r>
-        <w:t>Diagram terkait Screenshot 15</w:t>
+        <w:t>Diagram — Form Jurnal Umum seimbang Rp750.000</w:t>
       </w:r>
     </w:p>
     <w:p>
@@ -12720,7 +12717,7 @@
           <w:noProof/>
         </w:rPr>
         <w:drawing>
-          <wp:inline distT="0" distB="0" distL="0" distR="0" wp14:anchorId="26CEB416" wp14:editId="62DF7958">
+          <wp:inline distT="0" distB="0" distL="0" distR="0" wp14:anchorId="6E33A73B" wp14:editId="4EA37872">
             <wp:extent cx="8412480" cy="1682496"/>
             <wp:effectExtent l="0" t="0" r="0" b="0"/>
             <wp:docPr id="59" name="Picture 59"/>
@@ -12780,7 +12777,7 @@
           <w:noProof/>
         </w:rPr>
         <w:drawing>
-          <wp:inline distT="0" distB="0" distL="0" distR="0" wp14:anchorId="323F1E81" wp14:editId="3A82062B">
+          <wp:inline distT="0" distB="0" distL="0" distR="0" wp14:anchorId="70508A8C" wp14:editId="5CE01498">
             <wp:extent cx="8412480" cy="1682496"/>
             <wp:effectExtent l="0" t="0" r="0" b="0"/>
             <wp:docPr id="60" name="Picture 60"/>
@@ -12840,7 +12837,7 @@
           <w:noProof/>
         </w:rPr>
         <w:drawing>
-          <wp:inline distT="0" distB="0" distL="0" distR="0" wp14:anchorId="29336827" wp14:editId="342F736A">
+          <wp:inline distT="0" distB="0" distL="0" distR="0" wp14:anchorId="1B82EF40" wp14:editId="09213089">
             <wp:extent cx="8412480" cy="1682496"/>
             <wp:effectExtent l="0" t="0" r="0" b="0"/>
             <wp:docPr id="61" name="Picture 61"/>
@@ -13096,7 +13093,7 @@
           <w:noProof/>
         </w:rPr>
         <w:drawing>
-          <wp:inline distT="0" distB="0" distL="0" distR="0" wp14:anchorId="1B6B7BC8" wp14:editId="05786C12">
+          <wp:inline distT="0" distB="0" distL="0" distR="0" wp14:anchorId="594FB9C8" wp14:editId="62970878">
             <wp:extent cx="9464040" cy="5146072"/>
             <wp:effectExtent l="0" t="0" r="0" b="0"/>
             <wp:docPr id="62" name="Picture 62"/>
@@ -13156,7 +13153,7 @@
         <w:pStyle w:val="Heading2"/>
       </w:pPr>
       <w:r>
-        <w:t>Narasi rinci Screenshot 16 — 887 kata</w:t>
+        <w:t>Laporan Laba Rugi — halaman awal</w:t>
       </w:r>
     </w:p>
     <w:p>
@@ -13252,13 +13249,13 @@
         <w:rPr>
           <w:sz w:val="18"/>
         </w:rPr>
-        <w:t>Diagram setelah narasi ini memodelkan use case, flowchart, dan aliran data untuk Laporan Laba Rugi — halaman awal. Entitas yang relevan ialah Transaksi Akuntansi, Detail Transaksi, Akun, Laba Rugi. Use case menjelaskan siapa memicu tindakan dan siapa meninjau hasil. Flowchart menjelaskan urutan serta gerbang validasi sebelum status berubah. Diagram aliran data/ERD ringkas menunjukkan kunci hubungan antara dokumen sumber, detail, akun, transaksi akuntansi, dan laporan. Diagram bukan pengganti skema basis dat</w:t>
-      </w:r>
-      <w:r>
-        <w:rPr>
-          <w:sz w:val="18"/>
-        </w:rPr>
-        <w:t>a fisik; ia sengaja menampilkan relasi bisnis yang perlu dipahami key user. Keterlacakan dianggap cukup apabila nomor referensi pada transaksi dapat ditemukan pada jurnal, kode akun yang sama dapat ditemukan pada Buku Besar, dan saldo akhirnya dapat dijelaskan pada laporan.</w:t>
+        <w:t>Diagram setelah penjelasan ini memodelkan use case, flowchart, dan aliran data untuk Laporan Laba Rugi — halaman awal. Entitas yang relevan ialah Transaksi Akuntansi, Detail Transaksi, Akun, Laba Rugi. Use case menjelaskan siapa memicu tindakan dan siapa meninjau hasil. Flowchart menjelaskan urutan serta gerbang validasi sebelum status berubah. Diagram aliran data/ERD ringkas menunjukkan kunci hubungan antara dokumen sumber, detail, akun, transaksi akuntansi, dan laporan. Diagram bukan pengganti skema basis</w:t>
+      </w:r>
+      <w:r>
+        <w:rPr>
+          <w:sz w:val="18"/>
+        </w:rPr>
+        <w:t xml:space="preserve"> data fisik; ia sengaja menampilkan relasi bisnis yang perlu dipahami key user. Keterlacakan dianggap cukup apabila nomor referensi pada transaksi dapat ditemukan pada jurnal, kode akun yang sama dapat ditemukan pada Buku Besar, dan saldo akhirnya dapat dijelaskan pada laporan.</w:t>
       </w:r>
     </w:p>
     <w:p>
@@ -13305,7 +13302,7 @@
         <w:pStyle w:val="Heading2"/>
       </w:pPr>
       <w:r>
-        <w:t>Diagram terkait Screenshot 16</w:t>
+        <w:t>Diagram — Laporan Laba Rugi — halaman awal</w:t>
       </w:r>
     </w:p>
     <w:p>
@@ -13318,7 +13315,7 @@
           <w:noProof/>
         </w:rPr>
         <w:drawing>
-          <wp:inline distT="0" distB="0" distL="0" distR="0" wp14:anchorId="77D69BCB" wp14:editId="7F23AFDB">
+          <wp:inline distT="0" distB="0" distL="0" distR="0" wp14:anchorId="572CC320" wp14:editId="6B46932A">
             <wp:extent cx="8412480" cy="1682496"/>
             <wp:effectExtent l="0" t="0" r="0" b="0"/>
             <wp:docPr id="63" name="Picture 63"/>
@@ -13378,7 +13375,7 @@
           <w:noProof/>
         </w:rPr>
         <w:drawing>
-          <wp:inline distT="0" distB="0" distL="0" distR="0" wp14:anchorId="171E612B" wp14:editId="038264CC">
+          <wp:inline distT="0" distB="0" distL="0" distR="0" wp14:anchorId="0D88ABB8" wp14:editId="4F307641">
             <wp:extent cx="8412480" cy="1682496"/>
             <wp:effectExtent l="0" t="0" r="0" b="0"/>
             <wp:docPr id="64" name="Picture 64"/>
@@ -13438,7 +13435,7 @@
           <w:noProof/>
         </w:rPr>
         <w:drawing>
-          <wp:inline distT="0" distB="0" distL="0" distR="0" wp14:anchorId="3C61A619" wp14:editId="092DEB92">
+          <wp:inline distT="0" distB="0" distL="0" distR="0" wp14:anchorId="11356F3D" wp14:editId="49F91F8C">
             <wp:extent cx="8412480" cy="1682496"/>
             <wp:effectExtent l="0" t="0" r="0" b="0"/>
             <wp:docPr id="65" name="Picture 65"/>
@@ -13694,7 +13691,7 @@
           <w:noProof/>
         </w:rPr>
         <w:drawing>
-          <wp:inline distT="0" distB="0" distL="0" distR="0" wp14:anchorId="41B2F563" wp14:editId="097CBD65">
+          <wp:inline distT="0" distB="0" distL="0" distR="0" wp14:anchorId="753C1406" wp14:editId="1CD9260A">
             <wp:extent cx="9464040" cy="5146072"/>
             <wp:effectExtent l="0" t="0" r="0" b="0"/>
             <wp:docPr id="66" name="Picture 66"/>
@@ -13754,7 +13751,7 @@
         <w:pStyle w:val="Heading2"/>
       </w:pPr>
       <w:r>
-        <w:t>Narasi rinci Screenshot 17 — 897 kata</w:t>
+        <w:t>Laporan Laba Rugi — halaman terakhir/terbawah</w:t>
       </w:r>
     </w:p>
     <w:p>
@@ -13850,13 +13847,13 @@
         <w:rPr>
           <w:sz w:val="18"/>
         </w:rPr>
-        <w:t>Diagram setelah narasi ini memodelkan use case, flowchart, dan aliran data untuk Laporan Laba Rugi — halaman terakhir/terbawah. Entitas yang relevan ialah Transaksi Akuntansi, Agregasi Akun, Pagination, Laba Rugi. Use case menjelaskan siapa memicu tindakan dan siapa meninjau hasil. Flowchart menjelaskan urutan serta gerbang validasi sebelum status berubah. Diagram aliran data/ERD ringkas menunjukkan kunci hubungan antara dokumen sumber, detail, akun, transaksi akuntansi, dan laporan. Diagram bukan pengganti</w:t>
-      </w:r>
-      <w:r>
-        <w:rPr>
-          <w:sz w:val="18"/>
-        </w:rPr>
-        <w:t xml:space="preserve"> skema basis data fisik; ia sengaja menampilkan relasi bisnis yang perlu dipahami key user. Keterlacakan dianggap cukup apabila nomor referensi pada transaksi dapat ditemukan pada jurnal, kode akun yang sama dapat ditemukan pada Buku Besar, dan saldo akhirnya dapat dijelaskan pada laporan.</w:t>
+        <w:t>Diagram setelah penjelasan ini memodelkan use case, flowchart, dan aliran data untuk Laporan Laba Rugi — halaman terakhir/terbawah. Entitas yang relevan ialah Transaksi Akuntansi, Agregasi Akun, Pagination, Laba Rugi. Use case menjelaskan siapa memicu tindakan dan siapa meninjau hasil. Flowchart menjelaskan urutan serta gerbang validasi sebelum status berubah. Diagram aliran data/ERD ringkas menunjukkan kunci hubungan antara dokumen sumber, detail, akun, transaksi akuntansi, dan laporan. Diagram bukan pengg</w:t>
+      </w:r>
+      <w:r>
+        <w:rPr>
+          <w:sz w:val="18"/>
+        </w:rPr>
+        <w:t>anti skema basis data fisik; ia sengaja menampilkan relasi bisnis yang perlu dipahami key user. Keterlacakan dianggap cukup apabila nomor referensi pada transaksi dapat ditemukan pada jurnal, kode akun yang sama dapat ditemukan pada Buku Besar, dan saldo akhirnya dapat dijelaskan pada laporan.</w:t>
       </w:r>
     </w:p>
     <w:p>
@@ -13903,7 +13900,7 @@
         <w:pStyle w:val="Heading2"/>
       </w:pPr>
       <w:r>
-        <w:t>Diagram terkait Screenshot 17</w:t>
+        <w:t>Diagram — Laporan Laba Rugi — halaman terakhir/terbawah</w:t>
       </w:r>
     </w:p>
     <w:p>
@@ -13916,7 +13913,7 @@
           <w:noProof/>
         </w:rPr>
         <w:drawing>
-          <wp:inline distT="0" distB="0" distL="0" distR="0" wp14:anchorId="117A8AC9" wp14:editId="252AF240">
+          <wp:inline distT="0" distB="0" distL="0" distR="0" wp14:anchorId="51950AD9" wp14:editId="5DCE1008">
             <wp:extent cx="8412480" cy="1682496"/>
             <wp:effectExtent l="0" t="0" r="0" b="0"/>
             <wp:docPr id="67" name="Picture 67"/>
@@ -13976,7 +13973,7 @@
           <w:noProof/>
         </w:rPr>
         <w:drawing>
-          <wp:inline distT="0" distB="0" distL="0" distR="0" wp14:anchorId="7B9C41AF" wp14:editId="3490DEDF">
+          <wp:inline distT="0" distB="0" distL="0" distR="0" wp14:anchorId="4549DDA5" wp14:editId="3DC8DB82">
             <wp:extent cx="8412480" cy="1682496"/>
             <wp:effectExtent l="0" t="0" r="0" b="0"/>
             <wp:docPr id="68" name="Picture 68"/>
@@ -14036,7 +14033,7 @@
           <w:noProof/>
         </w:rPr>
         <w:drawing>
-          <wp:inline distT="0" distB="0" distL="0" distR="0" wp14:anchorId="34C2D413" wp14:editId="314EA62F">
+          <wp:inline distT="0" distB="0" distL="0" distR="0" wp14:anchorId="5D99D886" wp14:editId="721485C3">
             <wp:extent cx="8412480" cy="1682496"/>
             <wp:effectExtent l="0" t="0" r="0" b="0"/>
             <wp:docPr id="69" name="Picture 69"/>
@@ -14292,7 +14289,7 @@
           <w:noProof/>
         </w:rPr>
         <w:drawing>
-          <wp:inline distT="0" distB="0" distL="0" distR="0" wp14:anchorId="314A2547" wp14:editId="0484E439">
+          <wp:inline distT="0" distB="0" distL="0" distR="0" wp14:anchorId="185C7810" wp14:editId="2E76B8C8">
             <wp:extent cx="9464040" cy="5146072"/>
             <wp:effectExtent l="0" t="0" r="0" b="0"/>
             <wp:docPr id="70" name="Picture 70"/>
@@ -14352,7 +14349,7 @@
         <w:pStyle w:val="Heading2"/>
       </w:pPr>
       <w:r>
-        <w:t>Narasi rinci Screenshot 18 — 881 kata</w:t>
+        <w:t>Laporan Neraca — halaman awal</w:t>
       </w:r>
     </w:p>
     <w:p>
@@ -14448,13 +14445,13 @@
         <w:rPr>
           <w:sz w:val="18"/>
         </w:rPr>
-        <w:t>Diagram setelah narasi ini memodelkan use case, flowchart, dan aliran data untuk Laporan Neraca — halaman awal. Entitas yang relevan ialah Transaksi Akuntansi, Detail Transaksi, Akun, Neraca. Use case menjelaskan siapa memicu tindakan dan siapa meninjau hasil. Flowchart menjelaskan urutan serta gerbang validasi sebelum status berubah. Diagram aliran data/ERD ringkas menunjukkan kunci hubungan antara dokumen sumber, detail, akun, transaksi akuntansi, dan laporan. Diagram bukan pengganti skema basis data fisi</w:t>
-      </w:r>
-      <w:r>
-        <w:rPr>
-          <w:sz w:val="18"/>
-        </w:rPr>
-        <w:t>k; ia sengaja menampilkan relasi bisnis yang perlu dipahami key user. Keterlacakan dianggap cukup apabila nomor referensi pada transaksi dapat ditemukan pada jurnal, kode akun yang sama dapat ditemukan pada Buku Besar, dan saldo akhirnya dapat dijelaskan pada laporan.</w:t>
+        <w:t xml:space="preserve">Diagram setelah penjelasan ini memodelkan use case, flowchart, dan aliran data untuk Laporan Neraca — halaman awal. Entitas yang relevan ialah Transaksi Akuntansi, Detail Transaksi, Akun, Neraca. Use case menjelaskan siapa memicu tindakan dan siapa meninjau hasil. Flowchart menjelaskan urutan serta gerbang validasi sebelum status berubah. Diagram aliran data/ERD ringkas menunjukkan kunci hubungan antara dokumen sumber, detail, akun, transaksi akuntansi, dan laporan. Diagram bukan pengganti skema basis data </w:t>
+      </w:r>
+      <w:r>
+        <w:rPr>
+          <w:sz w:val="18"/>
+        </w:rPr>
+        <w:t>fisik; ia sengaja menampilkan relasi bisnis yang perlu dipahami key user. Keterlacakan dianggap cukup apabila nomor referensi pada transaksi dapat ditemukan pada jurnal, kode akun yang sama dapat ditemukan pada Buku Besar, dan saldo akhirnya dapat dijelaskan pada laporan.</w:t>
       </w:r>
     </w:p>
     <w:p>
@@ -14501,7 +14498,7 @@
         <w:pStyle w:val="Heading2"/>
       </w:pPr>
       <w:r>
-        <w:t>Diagram terkait Screenshot 18</w:t>
+        <w:t>Diagram — Laporan Neraca — halaman awal</w:t>
       </w:r>
     </w:p>
     <w:p>
@@ -14514,7 +14511,7 @@
           <w:noProof/>
         </w:rPr>
         <w:drawing>
-          <wp:inline distT="0" distB="0" distL="0" distR="0" wp14:anchorId="7934007F" wp14:editId="5B040544">
+          <wp:inline distT="0" distB="0" distL="0" distR="0" wp14:anchorId="1B9BA8A0" wp14:editId="3DA0BF0B">
             <wp:extent cx="8412480" cy="1682496"/>
             <wp:effectExtent l="0" t="0" r="0" b="0"/>
             <wp:docPr id="71" name="Picture 71"/>
@@ -14574,7 +14571,7 @@
           <w:noProof/>
         </w:rPr>
         <w:drawing>
-          <wp:inline distT="0" distB="0" distL="0" distR="0" wp14:anchorId="444AE8BB" wp14:editId="08CF1E69">
+          <wp:inline distT="0" distB="0" distL="0" distR="0" wp14:anchorId="5ACDD652" wp14:editId="25A3F303">
             <wp:extent cx="8412480" cy="1682496"/>
             <wp:effectExtent l="0" t="0" r="0" b="0"/>
             <wp:docPr id="72" name="Picture 72"/>
@@ -14634,7 +14631,7 @@
           <w:noProof/>
         </w:rPr>
         <w:drawing>
-          <wp:inline distT="0" distB="0" distL="0" distR="0" wp14:anchorId="0CCE58C5" wp14:editId="63304100">
+          <wp:inline distT="0" distB="0" distL="0" distR="0" wp14:anchorId="1DAE9129" wp14:editId="4D0387EB">
             <wp:extent cx="8412480" cy="1682496"/>
             <wp:effectExtent l="0" t="0" r="0" b="0"/>
             <wp:docPr id="73" name="Picture 73"/>
@@ -14890,7 +14887,7 @@
           <w:noProof/>
         </w:rPr>
         <w:drawing>
-          <wp:inline distT="0" distB="0" distL="0" distR="0" wp14:anchorId="4D3A891F" wp14:editId="59AB4838">
+          <wp:inline distT="0" distB="0" distL="0" distR="0" wp14:anchorId="1B821ACA" wp14:editId="694A77BE">
             <wp:extent cx="9464040" cy="5146072"/>
             <wp:effectExtent l="0" t="0" r="0" b="0"/>
             <wp:docPr id="74" name="Picture 74"/>
@@ -14950,7 +14947,7 @@
         <w:pStyle w:val="Heading2"/>
       </w:pPr>
       <w:r>
-        <w:t>Narasi rinci Screenshot 19 — 891 kata</w:t>
+        <w:t>Laporan Neraca — halaman terakhir/terbawah</w:t>
       </w:r>
     </w:p>
     <w:p>
@@ -15046,13 +15043,13 @@
         <w:rPr>
           <w:sz w:val="18"/>
         </w:rPr>
-        <w:t>Diagram setelah narasi ini memodelkan use case, flowchart, dan aliran data untuk Laporan Neraca — halaman terakhir/terbawah. Entitas yang relevan ialah Transaksi Akuntansi, Agregasi Akun, Pagination, Neraca. Use case menjelaskan siapa memicu tindakan dan siapa meninjau hasil. Flowchart menjelaskan urutan serta gerbang validasi sebelum status berubah. Diagram aliran data/ERD ringkas menunjukkan kunci hubungan antara dokumen sumber, detail, akun, transaksi akuntansi, dan laporan. Diagram bukan pengganti skema</w:t>
-      </w:r>
-      <w:r>
-        <w:rPr>
-          <w:sz w:val="18"/>
-        </w:rPr>
-        <w:t xml:space="preserve"> basis data fisik; ia sengaja menampilkan relasi bisnis yang perlu dipahami key user. Keterlacakan dianggap cukup apabila nomor referensi pada transaksi dapat ditemukan pada jurnal, kode akun yang sama dapat ditemukan pada Buku Besar, dan saldo akhirnya dapat dijelaskan pada laporan.</w:t>
+        <w:t>Diagram setelah penjelasan ini memodelkan use case, flowchart, dan aliran data untuk Laporan Neraca — halaman terakhir/terbawah. Entitas yang relevan ialah Transaksi Akuntansi, Agregasi Akun, Pagination, Neraca. Use case menjelaskan siapa memicu tindakan dan siapa meninjau hasil. Flowchart menjelaskan urutan serta gerbang validasi sebelum status berubah. Diagram aliran data/ERD ringkas menunjukkan kunci hubungan antara dokumen sumber, detail, akun, transaksi akuntansi, dan laporan. Diagram bukan pengganti s</w:t>
+      </w:r>
+      <w:r>
+        <w:rPr>
+          <w:sz w:val="18"/>
+        </w:rPr>
+        <w:t>kema basis data fisik; ia sengaja menampilkan relasi bisnis yang perlu dipahami key user. Keterlacakan dianggap cukup apabila nomor referensi pada transaksi dapat ditemukan pada jurnal, kode akun yang sama dapat ditemukan pada Buku Besar, dan saldo akhirnya dapat dijelaskan pada laporan.</w:t>
       </w:r>
     </w:p>
     <w:p>
@@ -15099,7 +15096,7 @@
         <w:pStyle w:val="Heading2"/>
       </w:pPr>
       <w:r>
-        <w:t>Diagram terkait Screenshot 19</w:t>
+        <w:t>Diagram — Laporan Neraca — halaman terakhir/terbawah</w:t>
       </w:r>
     </w:p>
     <w:p>
@@ -15112,7 +15109,7 @@
           <w:noProof/>
         </w:rPr>
         <w:drawing>
-          <wp:inline distT="0" distB="0" distL="0" distR="0" wp14:anchorId="1AFE8402" wp14:editId="311AF747">
+          <wp:inline distT="0" distB="0" distL="0" distR="0" wp14:anchorId="68E0B559" wp14:editId="0F9A04CE">
             <wp:extent cx="8412480" cy="1682496"/>
             <wp:effectExtent l="0" t="0" r="0" b="0"/>
             <wp:docPr id="75" name="Picture 75"/>
@@ -15172,7 +15169,7 @@
           <w:noProof/>
         </w:rPr>
         <w:drawing>
-          <wp:inline distT="0" distB="0" distL="0" distR="0" wp14:anchorId="728D1B42" wp14:editId="2A5BA339">
+          <wp:inline distT="0" distB="0" distL="0" distR="0" wp14:anchorId="22B714C6" wp14:editId="64A4C3C6">
             <wp:extent cx="8412480" cy="1682496"/>
             <wp:effectExtent l="0" t="0" r="0" b="0"/>
             <wp:docPr id="76" name="Picture 76"/>
@@ -15232,7 +15229,7 @@
           <w:noProof/>
         </w:rPr>
         <w:drawing>
-          <wp:inline distT="0" distB="0" distL="0" distR="0" wp14:anchorId="18917915" wp14:editId="1FDED706">
+          <wp:inline distT="0" distB="0" distL="0" distR="0" wp14:anchorId="1FF76696" wp14:editId="7127524B">
             <wp:extent cx="8412480" cy="1682496"/>
             <wp:effectExtent l="0" t="0" r="0" b="0"/>
             <wp:docPr id="77" name="Picture 77"/>
@@ -15488,7 +15485,7 @@
           <w:noProof/>
         </w:rPr>
         <w:drawing>
-          <wp:inline distT="0" distB="0" distL="0" distR="0" wp14:anchorId="42EBC417" wp14:editId="69CE880F">
+          <wp:inline distT="0" distB="0" distL="0" distR="0" wp14:anchorId="0C8D043B" wp14:editId="18E7FE03">
             <wp:extent cx="9464040" cy="5146072"/>
             <wp:effectExtent l="0" t="0" r="0" b="0"/>
             <wp:docPr id="78" name="Picture 78"/>
@@ -15548,7 +15545,7 @@
         <w:pStyle w:val="Heading2"/>
       </w:pPr>
       <w:r>
-        <w:t>Narasi rinci Screenshot 20 — 887 kata</w:t>
+        <w:t>Laporan Arus Kas — halaman awal</w:t>
       </w:r>
     </w:p>
     <w:p>
@@ -15644,13 +15641,13 @@
         <w:rPr>
           <w:sz w:val="18"/>
         </w:rPr>
-        <w:t xml:space="preserve">Diagram setelah narasi ini memodelkan use case, flowchart, dan aliran data untuk Laporan Arus Kas — halaman awal. Entitas yang relevan ialah Transaksi Akuntansi, Detail Transaksi, Akun, Arus Kas. Use case menjelaskan siapa memicu tindakan dan siapa meninjau hasil. Flowchart menjelaskan urutan serta gerbang validasi sebelum status berubah. Diagram aliran data/ERD ringkas menunjukkan kunci hubungan antara dokumen sumber, detail, akun, transaksi akuntansi, dan laporan. Diagram bukan pengganti skema basis data </w:t>
-      </w:r>
-      <w:r>
-        <w:rPr>
-          <w:sz w:val="18"/>
-        </w:rPr>
-        <w:t>fisik; ia sengaja menampilkan relasi bisnis yang perlu dipahami key user. Keterlacakan dianggap cukup apabila nomor referensi pada transaksi dapat ditemukan pada jurnal, kode akun yang sama dapat ditemukan pada Buku Besar, dan saldo akhirnya dapat dijelaskan pada laporan.</w:t>
+        <w:t>Diagram setelah penjelasan ini memodelkan use case, flowchart, dan aliran data untuk Laporan Arus Kas — halaman awal. Entitas yang relevan ialah Transaksi Akuntansi, Detail Transaksi, Akun, Arus Kas. Use case menjelaskan siapa memicu tindakan dan siapa meninjau hasil. Flowchart menjelaskan urutan serta gerbang validasi sebelum status berubah. Diagram aliran data/ERD ringkas menunjukkan kunci hubungan antara dokumen sumber, detail, akun, transaksi akuntansi, dan laporan. Diagram bukan pengganti skema basis d</w:t>
+      </w:r>
+      <w:r>
+        <w:rPr>
+          <w:sz w:val="18"/>
+        </w:rPr>
+        <w:t>ata fisik; ia sengaja menampilkan relasi bisnis yang perlu dipahami key user. Keterlacakan dianggap cukup apabila nomor referensi pada transaksi dapat ditemukan pada jurnal, kode akun yang sama dapat ditemukan pada Buku Besar, dan saldo akhirnya dapat dijelaskan pada laporan.</w:t>
       </w:r>
     </w:p>
     <w:p>
@@ -15697,7 +15694,7 @@
         <w:pStyle w:val="Heading2"/>
       </w:pPr>
       <w:r>
-        <w:t>Diagram terkait Screenshot 20</w:t>
+        <w:t>Diagram — Laporan Arus Kas — halaman awal</w:t>
       </w:r>
     </w:p>
     <w:p>
@@ -15710,7 +15707,7 @@
           <w:noProof/>
         </w:rPr>
         <w:drawing>
-          <wp:inline distT="0" distB="0" distL="0" distR="0" wp14:anchorId="3346A242" wp14:editId="37CB8CA7">
+          <wp:inline distT="0" distB="0" distL="0" distR="0" wp14:anchorId="170883DF" wp14:editId="3CB7C021">
             <wp:extent cx="8412480" cy="1682496"/>
             <wp:effectExtent l="0" t="0" r="0" b="0"/>
             <wp:docPr id="79" name="Picture 79"/>
@@ -15770,7 +15767,7 @@
           <w:noProof/>
         </w:rPr>
         <w:drawing>
-          <wp:inline distT="0" distB="0" distL="0" distR="0" wp14:anchorId="16DFB1DF" wp14:editId="1EB76B44">
+          <wp:inline distT="0" distB="0" distL="0" distR="0" wp14:anchorId="70527BB7" wp14:editId="2761117F">
             <wp:extent cx="8412480" cy="1682496"/>
             <wp:effectExtent l="0" t="0" r="0" b="0"/>
             <wp:docPr id="80" name="Picture 80"/>
@@ -15830,7 +15827,7 @@
           <w:noProof/>
         </w:rPr>
         <w:drawing>
-          <wp:inline distT="0" distB="0" distL="0" distR="0" wp14:anchorId="7D9ACC77" wp14:editId="36A2FD59">
+          <wp:inline distT="0" distB="0" distL="0" distR="0" wp14:anchorId="51E8EBE9" wp14:editId="6FAF1B04">
             <wp:extent cx="8412480" cy="1682496"/>
             <wp:effectExtent l="0" t="0" r="0" b="0"/>
             <wp:docPr id="81" name="Picture 81"/>
@@ -16086,7 +16083,7 @@
           <w:noProof/>
         </w:rPr>
         <w:drawing>
-          <wp:inline distT="0" distB="0" distL="0" distR="0" wp14:anchorId="25DE0C96" wp14:editId="52959462">
+          <wp:inline distT="0" distB="0" distL="0" distR="0" wp14:anchorId="2BAC4C56" wp14:editId="0BF937AB">
             <wp:extent cx="9464040" cy="5146072"/>
             <wp:effectExtent l="0" t="0" r="0" b="0"/>
             <wp:docPr id="82" name="Picture 82"/>
@@ -16146,7 +16143,7 @@
         <w:pStyle w:val="Heading2"/>
       </w:pPr>
       <w:r>
-        <w:t>Narasi rinci Screenshot 21 — 897 kata</w:t>
+        <w:t>Laporan Arus Kas — halaman terakhir/terbawah</w:t>
       </w:r>
     </w:p>
     <w:p>
@@ -16242,13 +16239,13 @@
         <w:rPr>
           <w:sz w:val="18"/>
         </w:rPr>
-        <w:t>Diagram setelah narasi ini memodelkan use case, flowchart, dan aliran data untuk Laporan Arus Kas — halaman terakhir/terbawah. Entitas yang relevan ialah Transaksi Akuntansi, Agregasi Akun, Pagination, Arus Kas. Use case menjelaskan siapa memicu tindakan dan siapa meninjau hasil. Flowchart menjelaskan urutan serta gerbang validasi sebelum status berubah. Diagram aliran data/ERD ringkas menunjukkan kunci hubungan antara dokumen sumber, detail, akun, transaksi akuntansi, dan laporan. Diagram bukan pengganti s</w:t>
-      </w:r>
-      <w:r>
-        <w:rPr>
-          <w:sz w:val="18"/>
-        </w:rPr>
-        <w:t>kema basis data fisik; ia sengaja menampilkan relasi bisnis yang perlu dipahami key user. Keterlacakan dianggap cukup apabila nomor referensi pada transaksi dapat ditemukan pada jurnal, kode akun yang sama dapat ditemukan pada Buku Besar, dan saldo akhirnya dapat dijelaskan pada laporan.</w:t>
+        <w:t>Diagram setelah penjelasan ini memodelkan use case, flowchart, dan aliran data untuk Laporan Arus Kas — halaman terakhir/terbawah. Entitas yang relevan ialah Transaksi Akuntansi, Agregasi Akun, Pagination, Arus Kas. Use case menjelaskan siapa memicu tindakan dan siapa meninjau hasil. Flowchart menjelaskan urutan serta gerbang validasi sebelum status berubah. Diagram aliran data/ERD ringkas menunjukkan kunci hubungan antara dokumen sumber, detail, akun, transaksi akuntansi, dan laporan. Diagram bukan penggan</w:t>
+      </w:r>
+      <w:r>
+        <w:rPr>
+          <w:sz w:val="18"/>
+        </w:rPr>
+        <w:t>ti skema basis data fisik; ia sengaja menampilkan relasi bisnis yang perlu dipahami key user. Keterlacakan dianggap cukup apabila nomor referensi pada transaksi dapat ditemukan pada jurnal, kode akun yang sama dapat ditemukan pada Buku Besar, dan saldo akhirnya dapat dijelaskan pada laporan.</w:t>
       </w:r>
     </w:p>
     <w:p>
@@ -16295,7 +16292,7 @@
         <w:pStyle w:val="Heading2"/>
       </w:pPr>
       <w:r>
-        <w:t>Diagram terkait Screenshot 21</w:t>
+        <w:t>Diagram — Laporan Arus Kas — halaman terakhir/terbawah</w:t>
       </w:r>
     </w:p>
     <w:p>
@@ -16308,7 +16305,7 @@
           <w:noProof/>
         </w:rPr>
         <w:drawing>
-          <wp:inline distT="0" distB="0" distL="0" distR="0" wp14:anchorId="4F6A4ECA" wp14:editId="3C5D7765">
+          <wp:inline distT="0" distB="0" distL="0" distR="0" wp14:anchorId="72D945FA" wp14:editId="145E8421">
             <wp:extent cx="8412480" cy="1682496"/>
             <wp:effectExtent l="0" t="0" r="0" b="0"/>
             <wp:docPr id="83" name="Picture 83"/>
@@ -16368,7 +16365,7 @@
           <w:noProof/>
         </w:rPr>
         <w:drawing>
-          <wp:inline distT="0" distB="0" distL="0" distR="0" wp14:anchorId="68BA39A0" wp14:editId="4B41AA75">
+          <wp:inline distT="0" distB="0" distL="0" distR="0" wp14:anchorId="08FFA6A8" wp14:editId="52A92524">
             <wp:extent cx="8412480" cy="1682496"/>
             <wp:effectExtent l="0" t="0" r="0" b="0"/>
             <wp:docPr id="84" name="Picture 84"/>
@@ -16428,7 +16425,7 @@
           <w:noProof/>
         </w:rPr>
         <w:drawing>
-          <wp:inline distT="0" distB="0" distL="0" distR="0" wp14:anchorId="31352398" wp14:editId="5EA356EF">
+          <wp:inline distT="0" distB="0" distL="0" distR="0" wp14:anchorId="3E02B311" wp14:editId="089C569D">
             <wp:extent cx="8412480" cy="1682496"/>
             <wp:effectExtent l="0" t="0" r="0" b="0"/>
             <wp:docPr id="85" name="Picture 85"/>
@@ -16684,7 +16681,7 @@
           <w:noProof/>
         </w:rPr>
         <w:drawing>
-          <wp:inline distT="0" distB="0" distL="0" distR="0" wp14:anchorId="3B4AEB10" wp14:editId="44288F4B">
+          <wp:inline distT="0" distB="0" distL="0" distR="0" wp14:anchorId="70B38ACA" wp14:editId="32E06BB5">
             <wp:extent cx="9464040" cy="5146072"/>
             <wp:effectExtent l="0" t="0" r="0" b="0"/>
             <wp:docPr id="86" name="Picture 86"/>
@@ -16744,7 +16741,7 @@
         <w:pStyle w:val="Heading2"/>
       </w:pPr>
       <w:r>
-        <w:t>Narasi rinci Screenshot 22 — 889 kata</w:t>
+        <w:t>Laporan Keseluruhan Jurnal — halaman awal</w:t>
       </w:r>
     </w:p>
     <w:p>
@@ -16840,13 +16837,13 @@
         <w:rPr>
           <w:sz w:val="18"/>
         </w:rPr>
-        <w:t>Diagram setelah narasi ini memodelkan use case, flowchart, dan aliran data untuk Laporan Keseluruhan Jurnal — halaman awal. Entitas yang relevan ialah Transaksi Akuntansi, Detail Transaksi, Akun, Keseluruhan Jurnal. Use case menjelaskan siapa memicu tindakan dan siapa meninjau hasil. Flowchart menjelaskan urutan serta gerbang validasi sebelum status berubah. Diagram aliran data/ERD ringkas menunjukkan kunci hubungan antara dokumen sumber, detail, akun, transaksi akuntansi, dan laporan. Diagram bukan penggan</w:t>
-      </w:r>
-      <w:r>
-        <w:rPr>
-          <w:sz w:val="18"/>
-        </w:rPr>
-        <w:t>ti skema basis data fisik; ia sengaja menampilkan relasi bisnis yang perlu dipahami key user. Keterlacakan dianggap cukup apabila nomor referensi pada transaksi dapat ditemukan pada jurnal, kode akun yang sama dapat ditemukan pada Buku Besar, dan saldo akhirnya dapat dijelaskan pada laporan.</w:t>
+        <w:t>Diagram setelah penjelasan ini memodelkan use case, flowchart, dan aliran data untuk Laporan Keseluruhan Jurnal — halaman awal. Entitas yang relevan ialah Transaksi Akuntansi, Detail Transaksi, Akun, Keseluruhan Jurnal. Use case menjelaskan siapa memicu tindakan dan siapa meninjau hasil. Flowchart menjelaskan urutan serta gerbang validasi sebelum status berubah. Diagram aliran data/ERD ringkas menunjukkan kunci hubungan antara dokumen sumber, detail, akun, transaksi akuntansi, dan laporan. Diagram bukan pen</w:t>
+      </w:r>
+      <w:r>
+        <w:rPr>
+          <w:sz w:val="18"/>
+        </w:rPr>
+        <w:t>gganti skema basis data fisik; ia sengaja menampilkan relasi bisnis yang perlu dipahami key user. Keterlacakan dianggap cukup apabila nomor referensi pada transaksi dapat ditemukan pada jurnal, kode akun yang sama dapat ditemukan pada Buku Besar, dan saldo akhirnya dapat dijelaskan pada laporan.</w:t>
       </w:r>
     </w:p>
     <w:p>
@@ -16893,7 +16890,7 @@
         <w:pStyle w:val="Heading2"/>
       </w:pPr>
       <w:r>
-        <w:t>Diagram terkait Screenshot 22</w:t>
+        <w:t>Diagram — Laporan Keseluruhan Jurnal — halaman awal</w:t>
       </w:r>
     </w:p>
     <w:p>
@@ -16906,7 +16903,7 @@
           <w:noProof/>
         </w:rPr>
         <w:drawing>
-          <wp:inline distT="0" distB="0" distL="0" distR="0" wp14:anchorId="630DF8DA" wp14:editId="2A109D69">
+          <wp:inline distT="0" distB="0" distL="0" distR="0" wp14:anchorId="6690D033" wp14:editId="5C901F60">
             <wp:extent cx="8412480" cy="1682496"/>
             <wp:effectExtent l="0" t="0" r="0" b="0"/>
             <wp:docPr id="87" name="Picture 87"/>
@@ -16966,7 +16963,7 @@
           <w:noProof/>
         </w:rPr>
         <w:drawing>
-          <wp:inline distT="0" distB="0" distL="0" distR="0" wp14:anchorId="5A73934B" wp14:editId="1EE68F65">
+          <wp:inline distT="0" distB="0" distL="0" distR="0" wp14:anchorId="20108077" wp14:editId="341D1FDC">
             <wp:extent cx="8412480" cy="1682496"/>
             <wp:effectExtent l="0" t="0" r="0" b="0"/>
             <wp:docPr id="88" name="Picture 88"/>
@@ -17026,7 +17023,7 @@
           <w:noProof/>
         </w:rPr>
         <w:drawing>
-          <wp:inline distT="0" distB="0" distL="0" distR="0" wp14:anchorId="0E17E5CB" wp14:editId="45D756E4">
+          <wp:inline distT="0" distB="0" distL="0" distR="0" wp14:anchorId="5C5C1176" wp14:editId="5316D434">
             <wp:extent cx="8412480" cy="1682496"/>
             <wp:effectExtent l="0" t="0" r="0" b="0"/>
             <wp:docPr id="89" name="Picture 89"/>
@@ -17282,7 +17279,7 @@
           <w:noProof/>
         </w:rPr>
         <w:drawing>
-          <wp:inline distT="0" distB="0" distL="0" distR="0" wp14:anchorId="712D40DE" wp14:editId="701E6EE5">
+          <wp:inline distT="0" distB="0" distL="0" distR="0" wp14:anchorId="2DD79DCB" wp14:editId="43CD327D">
             <wp:extent cx="9464040" cy="5146072"/>
             <wp:effectExtent l="0" t="0" r="0" b="0"/>
             <wp:docPr id="90" name="Picture 90"/>
@@ -17342,7 +17339,7 @@
         <w:pStyle w:val="Heading2"/>
       </w:pPr>
       <w:r>
-        <w:t>Narasi rinci Screenshot 23 — 899 kata</w:t>
+        <w:t>Laporan Keseluruhan Jurnal — halaman terakhir/terbawah</w:t>
       </w:r>
     </w:p>
     <w:p>
@@ -17438,13 +17435,13 @@
         <w:rPr>
           <w:sz w:val="18"/>
         </w:rPr>
-        <w:t>Diagram setelah narasi ini memodelkan use case, flowchart, dan aliran data untuk Laporan Keseluruhan Jurnal — halaman terakhir/terbawah. Entitas yang relevan ialah Transaksi Akuntansi, Agregasi Akun, Pagination, Keseluruhan Jurnal. Use case menjelaskan siapa memicu tindakan dan siapa meninjau hasil. Flowchart menjelaskan urutan serta gerbang validasi sebelum status berubah. Diagram aliran data/ERD ringkas menunjukkan kunci hubungan antara dokumen sumber, detail, akun, transaksi akuntansi, dan laporan. Diagr</w:t>
-      </w:r>
-      <w:r>
-        <w:rPr>
-          <w:sz w:val="18"/>
-        </w:rPr>
-        <w:t>am bukan pengganti skema basis data fisik; ia sengaja menampilkan relasi bisnis yang perlu dipahami key user. Keterlacakan dianggap cukup apabila nomor referensi pada transaksi dapat ditemukan pada jurnal, kode akun yang sama dapat ditemukan pada Buku Besar, dan saldo akhirnya dapat dijelaskan pada laporan.</w:t>
+        <w:t>Diagram setelah penjelasan ini memodelkan use case, flowchart, dan aliran data untuk Laporan Keseluruhan Jurnal — halaman terakhir/terbawah. Entitas yang relevan ialah Transaksi Akuntansi, Agregasi Akun, Pagination, Keseluruhan Jurnal. Use case menjelaskan siapa memicu tindakan dan siapa meninjau hasil. Flowchart menjelaskan urutan serta gerbang validasi sebelum status berubah. Diagram aliran data/ERD ringkas menunjukkan kunci hubungan antara dokumen sumber, detail, akun, transaksi akuntansi, dan laporan. D</w:t>
+      </w:r>
+      <w:r>
+        <w:rPr>
+          <w:sz w:val="18"/>
+        </w:rPr>
+        <w:t>iagram bukan pengganti skema basis data fisik; ia sengaja menampilkan relasi bisnis yang perlu dipahami key user. Keterlacakan dianggap cukup apabila nomor referensi pada transaksi dapat ditemukan pada jurnal, kode akun yang sama dapat ditemukan pada Buku Besar, dan saldo akhirnya dapat dijelaskan pada laporan.</w:t>
       </w:r>
     </w:p>
     <w:p>
@@ -17491,7 +17488,7 @@
         <w:pStyle w:val="Heading2"/>
       </w:pPr>
       <w:r>
-        <w:t>Diagram terkait Screenshot 23</w:t>
+        <w:t>Diagram — Laporan Keseluruhan Jurnal — halaman terakhir/terbawah</w:t>
       </w:r>
     </w:p>
     <w:p>
@@ -17504,7 +17501,7 @@
           <w:noProof/>
         </w:rPr>
         <w:drawing>
-          <wp:inline distT="0" distB="0" distL="0" distR="0" wp14:anchorId="5A9136E8" wp14:editId="0FF45BE5">
+          <wp:inline distT="0" distB="0" distL="0" distR="0" wp14:anchorId="3216B2AA" wp14:editId="2BD0E1A6">
             <wp:extent cx="8412480" cy="1682496"/>
             <wp:effectExtent l="0" t="0" r="0" b="0"/>
             <wp:docPr id="91" name="Picture 91"/>
@@ -17564,7 +17561,7 @@
           <w:noProof/>
         </w:rPr>
         <w:drawing>
-          <wp:inline distT="0" distB="0" distL="0" distR="0" wp14:anchorId="2C760C1A" wp14:editId="47BB05DB">
+          <wp:inline distT="0" distB="0" distL="0" distR="0" wp14:anchorId="076D787F" wp14:editId="0DB455CA">
             <wp:extent cx="8412480" cy="1682496"/>
             <wp:effectExtent l="0" t="0" r="0" b="0"/>
             <wp:docPr id="92" name="Picture 92"/>
@@ -17624,7 +17621,7 @@
           <w:noProof/>
         </w:rPr>
         <w:drawing>
-          <wp:inline distT="0" distB="0" distL="0" distR="0" wp14:anchorId="6CDC762D" wp14:editId="60AE9175">
+          <wp:inline distT="0" distB="0" distL="0" distR="0" wp14:anchorId="5A4BDBF5" wp14:editId="2B421AF9">
             <wp:extent cx="8412480" cy="1682496"/>
             <wp:effectExtent l="0" t="0" r="0" b="0"/>
             <wp:docPr id="93" name="Picture 93"/>
@@ -17880,7 +17877,7 @@
           <w:noProof/>
         </w:rPr>
         <w:drawing>
-          <wp:inline distT="0" distB="0" distL="0" distR="0" wp14:anchorId="240F321D" wp14:editId="760238A1">
+          <wp:inline distT="0" distB="0" distL="0" distR="0" wp14:anchorId="22119B8D" wp14:editId="18892294">
             <wp:extent cx="9464040" cy="5146072"/>
             <wp:effectExtent l="0" t="0" r="0" b="0"/>
             <wp:docPr id="94" name="Picture 94"/>
@@ -17940,7 +17937,7 @@
         <w:pStyle w:val="Heading2"/>
       </w:pPr>
       <w:r>
-        <w:t>Narasi rinci Screenshot 24 — 887 kata</w:t>
+        <w:t>Laporan Buku Besar — halaman awal</w:t>
       </w:r>
     </w:p>
     <w:p>
@@ -18036,13 +18033,13 @@
         <w:rPr>
           <w:sz w:val="18"/>
         </w:rPr>
-        <w:t>Diagram setelah narasi ini memodelkan use case, flowchart, dan aliran data untuk Laporan Buku Besar — halaman awal. Entitas yang relevan ialah Transaksi Akuntansi, Detail Transaksi, Akun, Buku Besar. Use case menjelaskan siapa memicu tindakan dan siapa meninjau hasil. Flowchart menjelaskan urutan serta gerbang validasi sebelum status berubah. Diagram aliran data/ERD ringkas menunjukkan kunci hubungan antara dokumen sumber, detail, akun, transaksi akuntansi, dan laporan. Diagram bukan pengganti skema basis d</w:t>
-      </w:r>
-      <w:r>
-        <w:rPr>
-          <w:sz w:val="18"/>
-        </w:rPr>
-        <w:t>ata fisik; ia sengaja menampilkan relasi bisnis yang perlu dipahami key user. Keterlacakan dianggap cukup apabila nomor referensi pada transaksi dapat ditemukan pada jurnal, kode akun yang sama dapat ditemukan pada Buku Besar, dan saldo akhirnya dapat dijelaskan pada laporan.</w:t>
+        <w:t>Diagram setelah penjelasan ini memodelkan use case, flowchart, dan aliran data untuk Laporan Buku Besar — halaman awal. Entitas yang relevan ialah Transaksi Akuntansi, Detail Transaksi, Akun, Buku Besar. Use case menjelaskan siapa memicu tindakan dan siapa meninjau hasil. Flowchart menjelaskan urutan serta gerbang validasi sebelum status berubah. Diagram aliran data/ERD ringkas menunjukkan kunci hubungan antara dokumen sumber, detail, akun, transaksi akuntansi, dan laporan. Diagram bukan pengganti skema bas</w:t>
+      </w:r>
+      <w:r>
+        <w:rPr>
+          <w:sz w:val="18"/>
+        </w:rPr>
+        <w:t>is data fisik; ia sengaja menampilkan relasi bisnis yang perlu dipahami key user. Keterlacakan dianggap cukup apabila nomor referensi pada transaksi dapat ditemukan pada jurnal, kode akun yang sama dapat ditemukan pada Buku Besar, dan saldo akhirnya dapat dijelaskan pada laporan.</w:t>
       </w:r>
     </w:p>
     <w:p>
@@ -18089,7 +18086,7 @@
         <w:pStyle w:val="Heading2"/>
       </w:pPr>
       <w:r>
-        <w:t>Diagram terkait Screenshot 24</w:t>
+        <w:t>Diagram — Laporan Buku Besar — halaman awal</w:t>
       </w:r>
     </w:p>
     <w:p>
@@ -18102,7 +18099,7 @@
           <w:noProof/>
         </w:rPr>
         <w:drawing>
-          <wp:inline distT="0" distB="0" distL="0" distR="0" wp14:anchorId="4E437E3C" wp14:editId="0E4EA67B">
+          <wp:inline distT="0" distB="0" distL="0" distR="0" wp14:anchorId="60003DA3" wp14:editId="04498710">
             <wp:extent cx="8412480" cy="1682496"/>
             <wp:effectExtent l="0" t="0" r="0" b="0"/>
             <wp:docPr id="95" name="Picture 95"/>
@@ -18162,7 +18159,7 @@
           <w:noProof/>
         </w:rPr>
         <w:drawing>
-          <wp:inline distT="0" distB="0" distL="0" distR="0" wp14:anchorId="7A55789F" wp14:editId="3C0177F4">
+          <wp:inline distT="0" distB="0" distL="0" distR="0" wp14:anchorId="13CF130F" wp14:editId="0A1ADA4E">
             <wp:extent cx="8412480" cy="1682496"/>
             <wp:effectExtent l="0" t="0" r="0" b="0"/>
             <wp:docPr id="96" name="Picture 96"/>
@@ -18222,7 +18219,7 @@
           <w:noProof/>
         </w:rPr>
         <w:drawing>
-          <wp:inline distT="0" distB="0" distL="0" distR="0" wp14:anchorId="1F639FCA" wp14:editId="4BF5BB2F">
+          <wp:inline distT="0" distB="0" distL="0" distR="0" wp14:anchorId="43358A1F" wp14:editId="7800B268">
             <wp:extent cx="8412480" cy="1682496"/>
             <wp:effectExtent l="0" t="0" r="0" b="0"/>
             <wp:docPr id="97" name="Picture 97"/>
@@ -18478,7 +18475,7 @@
           <w:noProof/>
         </w:rPr>
         <w:drawing>
-          <wp:inline distT="0" distB="0" distL="0" distR="0" wp14:anchorId="2D1AD9C2" wp14:editId="7A20BF97">
+          <wp:inline distT="0" distB="0" distL="0" distR="0" wp14:anchorId="4DC9363E" wp14:editId="3B32C91B">
             <wp:extent cx="9464040" cy="5146072"/>
             <wp:effectExtent l="0" t="0" r="0" b="0"/>
             <wp:docPr id="98" name="Picture 98"/>
@@ -18538,7 +18535,7 @@
         <w:pStyle w:val="Heading2"/>
       </w:pPr>
       <w:r>
-        <w:t>Narasi rinci Screenshot 25 — 897 kata</w:t>
+        <w:t>Laporan Buku Besar — halaman terakhir/terbawah</w:t>
       </w:r>
     </w:p>
     <w:p>
@@ -18634,13 +18631,13 @@
         <w:rPr>
           <w:sz w:val="18"/>
         </w:rPr>
-        <w:t>Diagram setelah narasi ini memodelkan use case, flowchart, dan aliran data untuk Laporan Buku Besar — halaman terakhir/terbawah. Entitas yang relevan ialah Transaksi Akuntansi, Agregasi Akun, Pagination, Buku Besar. Use case menjelaskan siapa memicu tindakan dan siapa meninjau hasil. Flowchart menjelaskan urutan serta gerbang validasi sebelum status berubah. Diagram aliran data/ERD ringkas menunjukkan kunci hubungan antara dokumen sumber, detail, akun, transaksi akuntansi, dan laporan. Diagram bukan penggan</w:t>
-      </w:r>
-      <w:r>
-        <w:rPr>
-          <w:sz w:val="18"/>
-        </w:rPr>
-        <w:t>ti skema basis data fisik; ia sengaja menampilkan relasi bisnis yang perlu dipahami key user. Keterlacakan dianggap cukup apabila nomor referensi pada transaksi dapat ditemukan pada jurnal, kode akun yang sama dapat ditemukan pada Buku Besar, dan saldo akhirnya dapat dijelaskan pada laporan.</w:t>
+        <w:t>Diagram setelah penjelasan ini memodelkan use case, flowchart, dan aliran data untuk Laporan Buku Besar — halaman terakhir/terbawah. Entitas yang relevan ialah Transaksi Akuntansi, Agregasi Akun, Pagination, Buku Besar. Use case menjelaskan siapa memicu tindakan dan siapa meninjau hasil. Flowchart menjelaskan urutan serta gerbang validasi sebelum status berubah. Diagram aliran data/ERD ringkas menunjukkan kunci hubungan antara dokumen sumber, detail, akun, transaksi akuntansi, dan laporan. Diagram bukan pen</w:t>
+      </w:r>
+      <w:r>
+        <w:rPr>
+          <w:sz w:val="18"/>
+        </w:rPr>
+        <w:t>gganti skema basis data fisik; ia sengaja menampilkan relasi bisnis yang perlu dipahami key user. Keterlacakan dianggap cukup apabila nomor referensi pada transaksi dapat ditemukan pada jurnal, kode akun yang sama dapat ditemukan pada Buku Besar, dan saldo akhirnya dapat dijelaskan pada laporan.</w:t>
       </w:r>
     </w:p>
     <w:p>
@@ -18687,7 +18684,7 @@
         <w:pStyle w:val="Heading2"/>
       </w:pPr>
       <w:r>
-        <w:t>Diagram terkait Screenshot 25</w:t>
+        <w:t>Diagram — Laporan Buku Besar — halaman terakhir/terbawah</w:t>
       </w:r>
     </w:p>
     <w:p>
@@ -18700,7 +18697,7 @@
           <w:noProof/>
         </w:rPr>
         <w:drawing>
-          <wp:inline distT="0" distB="0" distL="0" distR="0" wp14:anchorId="5562F512" wp14:editId="50609F0F">
+          <wp:inline distT="0" distB="0" distL="0" distR="0" wp14:anchorId="2659EFD2" wp14:editId="63520B0D">
             <wp:extent cx="8412480" cy="1682496"/>
             <wp:effectExtent l="0" t="0" r="0" b="0"/>
             <wp:docPr id="99" name="Picture 99"/>
@@ -18760,7 +18757,7 @@
           <w:noProof/>
         </w:rPr>
         <w:drawing>
-          <wp:inline distT="0" distB="0" distL="0" distR="0" wp14:anchorId="25C2F564" wp14:editId="434CC93B">
+          <wp:inline distT="0" distB="0" distL="0" distR="0" wp14:anchorId="5D7EE1AA" wp14:editId="67A41ED5">
             <wp:extent cx="8412480" cy="1682496"/>
             <wp:effectExtent l="0" t="0" r="0" b="0"/>
             <wp:docPr id="100" name="Picture 100"/>
@@ -18820,7 +18817,7 @@
           <w:noProof/>
         </w:rPr>
         <w:drawing>
-          <wp:inline distT="0" distB="0" distL="0" distR="0" wp14:anchorId="73D0B658" wp14:editId="28F04CF9">
+          <wp:inline distT="0" distB="0" distL="0" distR="0" wp14:anchorId="1E3FB6AF" wp14:editId="0D50213B">
             <wp:extent cx="8412480" cy="1682496"/>
             <wp:effectExtent l="0" t="0" r="0" b="0"/>
             <wp:docPr id="101" name="Picture 101"/>
@@ -19076,7 +19073,7 @@
           <w:noProof/>
         </w:rPr>
         <w:drawing>
-          <wp:inline distT="0" distB="0" distL="0" distR="0" wp14:anchorId="25C5C1CD" wp14:editId="2EA8AB0B">
+          <wp:inline distT="0" distB="0" distL="0" distR="0" wp14:anchorId="56179D1D" wp14:editId="62F342B7">
             <wp:extent cx="9464040" cy="5146072"/>
             <wp:effectExtent l="0" t="0" r="0" b="0"/>
             <wp:docPr id="102" name="Picture 102"/>
@@ -19136,7 +19133,7 @@
         <w:pStyle w:val="Heading2"/>
       </w:pPr>
       <w:r>
-        <w:t>Narasi rinci Screenshot 26 — 887 kata</w:t>
+        <w:t>Laporan Neraca Saldo — halaman awal</w:t>
       </w:r>
     </w:p>
     <w:p>
@@ -19232,13 +19229,13 @@
         <w:rPr>
           <w:sz w:val="18"/>
         </w:rPr>
-        <w:t>Diagram setelah narasi ini memodelkan use case, flowchart, dan aliran data untuk Laporan Neraca Saldo — halaman awal. Entitas yang relevan ialah Transaksi Akuntansi, Detail Transaksi, Akun, Neraca Saldo. Use case menjelaskan siapa memicu tindakan dan siapa meninjau hasil. Flowchart menjelaskan urutan serta gerbang validasi sebelum status berubah. Diagram aliran data/ERD ringkas menunjukkan kunci hubungan antara dokumen sumber, detail, akun, transaksi akuntansi, dan laporan. Diagram bukan pengganti skema bas</w:t>
-      </w:r>
-      <w:r>
-        <w:rPr>
-          <w:sz w:val="18"/>
-        </w:rPr>
-        <w:t>is data fisik; ia sengaja menampilkan relasi bisnis yang perlu dipahami key user. Keterlacakan dianggap cukup apabila nomor referensi pada transaksi dapat ditemukan pada jurnal, kode akun yang sama dapat ditemukan pada Buku Besar, dan saldo akhirnya dapat dijelaskan pada laporan.</w:t>
+        <w:t>Diagram setelah penjelasan ini memodelkan use case, flowchart, dan aliran data untuk Laporan Neraca Saldo — halaman awal. Entitas yang relevan ialah Transaksi Akuntansi, Detail Transaksi, Akun, Neraca Saldo. Use case menjelaskan siapa memicu tindakan dan siapa meninjau hasil. Flowchart menjelaskan urutan serta gerbang validasi sebelum status berubah. Diagram aliran data/ERD ringkas menunjukkan kunci hubungan antara dokumen sumber, detail, akun, transaksi akuntansi, dan laporan. Diagram bukan pengganti skema</w:t>
+      </w:r>
+      <w:r>
+        <w:rPr>
+          <w:sz w:val="18"/>
+        </w:rPr>
+        <w:t xml:space="preserve"> basis data fisik; ia sengaja menampilkan relasi bisnis yang perlu dipahami key user. Keterlacakan dianggap cukup apabila nomor referensi pada transaksi dapat ditemukan pada jurnal, kode akun yang sama dapat ditemukan pada Buku Besar, dan saldo akhirnya dapat dijelaskan pada laporan.</w:t>
       </w:r>
     </w:p>
     <w:p>
@@ -19285,7 +19282,7 @@
         <w:pStyle w:val="Heading2"/>
       </w:pPr>
       <w:r>
-        <w:t>Diagram terkait Screenshot 26</w:t>
+        <w:t>Diagram — Laporan Neraca Saldo — halaman awal</w:t>
       </w:r>
     </w:p>
     <w:p>
@@ -19298,7 +19295,7 @@
           <w:noProof/>
         </w:rPr>
         <w:drawing>
-          <wp:inline distT="0" distB="0" distL="0" distR="0" wp14:anchorId="17B6891C" wp14:editId="50B6AEEB">
+          <wp:inline distT="0" distB="0" distL="0" distR="0" wp14:anchorId="295356E0" wp14:editId="7D389488">
             <wp:extent cx="8412480" cy="1682496"/>
             <wp:effectExtent l="0" t="0" r="0" b="0"/>
             <wp:docPr id="103" name="Picture 103"/>
@@ -19358,7 +19355,7 @@
           <w:noProof/>
         </w:rPr>
         <w:drawing>
-          <wp:inline distT="0" distB="0" distL="0" distR="0" wp14:anchorId="0B614C9C" wp14:editId="2EC4AAFB">
+          <wp:inline distT="0" distB="0" distL="0" distR="0" wp14:anchorId="7EA71858" wp14:editId="6B5DDA62">
             <wp:extent cx="8412480" cy="1682496"/>
             <wp:effectExtent l="0" t="0" r="0" b="0"/>
             <wp:docPr id="104" name="Picture 104"/>
@@ -19418,7 +19415,7 @@
           <w:noProof/>
         </w:rPr>
         <w:drawing>
-          <wp:inline distT="0" distB="0" distL="0" distR="0" wp14:anchorId="49E01C66" wp14:editId="35AE5E41">
+          <wp:inline distT="0" distB="0" distL="0" distR="0" wp14:anchorId="0A8FC988" wp14:editId="4933177C">
             <wp:extent cx="8412480" cy="1682496"/>
             <wp:effectExtent l="0" t="0" r="0" b="0"/>
             <wp:docPr id="105" name="Picture 105"/>
@@ -19674,7 +19671,7 @@
           <w:noProof/>
         </w:rPr>
         <w:drawing>
-          <wp:inline distT="0" distB="0" distL="0" distR="0" wp14:anchorId="7D62BE59" wp14:editId="502D5B43">
+          <wp:inline distT="0" distB="0" distL="0" distR="0" wp14:anchorId="4818C8E9" wp14:editId="79E07CD1">
             <wp:extent cx="9464040" cy="5146072"/>
             <wp:effectExtent l="0" t="0" r="0" b="0"/>
             <wp:docPr id="106" name="Picture 106"/>
@@ -19734,7 +19731,7 @@
         <w:pStyle w:val="Heading2"/>
       </w:pPr>
       <w:r>
-        <w:t>Narasi rinci Screenshot 27 — 897 kata</w:t>
+        <w:t>Laporan Neraca Saldo — halaman terakhir/terbawah</w:t>
       </w:r>
     </w:p>
     <w:p>
@@ -19830,13 +19827,13 @@
         <w:rPr>
           <w:sz w:val="18"/>
         </w:rPr>
-        <w:t>Diagram setelah narasi ini memodelkan use case, flowchart, dan aliran data untuk Laporan Neraca Saldo — halaman terakhir/terbawah. Entitas yang relevan ialah Transaksi Akuntansi, Agregasi Akun, Pagination, Neraca Saldo. Use case menjelaskan siapa memicu tindakan dan siapa meninjau hasil. Flowchart menjelaskan urutan serta gerbang validasi sebelum status berubah. Diagram aliran data/ERD ringkas menunjukkan kunci hubungan antara dokumen sumber, detail, akun, transaksi akuntansi, dan laporan. Diagram bukan pen</w:t>
-      </w:r>
-      <w:r>
-        <w:rPr>
-          <w:sz w:val="18"/>
-        </w:rPr>
-        <w:t>gganti skema basis data fisik; ia sengaja menampilkan relasi bisnis yang perlu dipahami key user. Keterlacakan dianggap cukup apabila nomor referensi pada transaksi dapat ditemukan pada jurnal, kode akun yang sama dapat ditemukan pada Buku Besar, dan saldo akhirnya dapat dijelaskan pada laporan.</w:t>
+        <w:t>Diagram setelah penjelasan ini memodelkan use case, flowchart, dan aliran data untuk Laporan Neraca Saldo — halaman terakhir/terbawah. Entitas yang relevan ialah Transaksi Akuntansi, Agregasi Akun, Pagination, Neraca Saldo. Use case menjelaskan siapa memicu tindakan dan siapa meninjau hasil. Flowchart menjelaskan urutan serta gerbang validasi sebelum status berubah. Diagram aliran data/ERD ringkas menunjukkan kunci hubungan antara dokumen sumber, detail, akun, transaksi akuntansi, dan laporan. Diagram bukan</w:t>
+      </w:r>
+      <w:r>
+        <w:rPr>
+          <w:sz w:val="18"/>
+        </w:rPr>
+        <w:t xml:space="preserve"> pengganti skema basis data fisik; ia sengaja menampilkan relasi bisnis yang perlu dipahami key user. Keterlacakan dianggap cukup apabila nomor referensi pada transaksi dapat ditemukan pada jurnal, kode akun yang sama dapat ditemukan pada Buku Besar, dan saldo akhirnya dapat dijelaskan pada laporan.</w:t>
       </w:r>
     </w:p>
     <w:p>
@@ -19883,7 +19880,7 @@
         <w:pStyle w:val="Heading2"/>
       </w:pPr>
       <w:r>
-        <w:t>Diagram terkait Screenshot 27</w:t>
+        <w:t>Diagram — Laporan Neraca Saldo — halaman terakhir/terbawah</w:t>
       </w:r>
     </w:p>
     <w:p>
@@ -19896,7 +19893,7 @@
           <w:noProof/>
         </w:rPr>
         <w:drawing>
-          <wp:inline distT="0" distB="0" distL="0" distR="0" wp14:anchorId="7712E7C9" wp14:editId="2B53110B">
+          <wp:inline distT="0" distB="0" distL="0" distR="0" wp14:anchorId="34214687" wp14:editId="7B9B7265">
             <wp:extent cx="8412480" cy="1682496"/>
             <wp:effectExtent l="0" t="0" r="0" b="0"/>
             <wp:docPr id="107" name="Picture 107"/>
@@ -19956,7 +19953,7 @@
           <w:noProof/>
         </w:rPr>
         <w:drawing>
-          <wp:inline distT="0" distB="0" distL="0" distR="0" wp14:anchorId="2CC192C3" wp14:editId="19280C6C">
+          <wp:inline distT="0" distB="0" distL="0" distR="0" wp14:anchorId="1580863A" wp14:editId="7EAA2A85">
             <wp:extent cx="8412480" cy="1682496"/>
             <wp:effectExtent l="0" t="0" r="0" b="0"/>
             <wp:docPr id="108" name="Picture 108"/>
@@ -20016,7 +20013,7 @@
           <w:noProof/>
         </w:rPr>
         <w:drawing>
-          <wp:inline distT="0" distB="0" distL="0" distR="0" wp14:anchorId="30714CF3" wp14:editId="05A1C539">
+          <wp:inline distT="0" distB="0" distL="0" distR="0" wp14:anchorId="612E2D25" wp14:editId="4386D5F5">
             <wp:extent cx="8412480" cy="1682496"/>
             <wp:effectExtent l="0" t="0" r="0" b="0"/>
             <wp:docPr id="109" name="Picture 109"/>
@@ -20589,7 +20586,7 @@
               <w:rPr>
                 <w:sz w:val="15"/>
               </w:rPr>
-              <w:t>Narasi dan diagram</w:t>
+              <w:t>Panduan dan diagram</w:t>
             </w:r>
           </w:p>
         </w:tc>
@@ -20607,7 +20604,7 @@
               <w:rPr>
                 <w:sz w:val="15"/>
               </w:rPr>
-              <w:t>≥500 kata + use case + flowchart + ERD per screenshot</w:t>
+              <w:t>Penjelasan operasional + use case + flowchart + ERD per tahap</w:t>
             </w:r>
           </w:p>
         </w:tc>
@@ -21512,31 +21509,31 @@
       </w:rPr>
     </w:lvl>
   </w:abstractNum>
-  <w:num w:numId="1" w16cid:durableId="763309990">
+  <w:num w:numId="1" w16cid:durableId="1866404944">
     <w:abstractNumId w:val="8"/>
   </w:num>
-  <w:num w:numId="2" w16cid:durableId="783614524">
+  <w:num w:numId="2" w16cid:durableId="298077799">
     <w:abstractNumId w:val="6"/>
   </w:num>
-  <w:num w:numId="3" w16cid:durableId="681514269">
+  <w:num w:numId="3" w16cid:durableId="245261920">
     <w:abstractNumId w:val="5"/>
   </w:num>
-  <w:num w:numId="4" w16cid:durableId="2100176637">
+  <w:num w:numId="4" w16cid:durableId="838740058">
     <w:abstractNumId w:val="4"/>
   </w:num>
-  <w:num w:numId="5" w16cid:durableId="1430472270">
+  <w:num w:numId="5" w16cid:durableId="1928997864">
     <w:abstractNumId w:val="7"/>
   </w:num>
-  <w:num w:numId="6" w16cid:durableId="1603604266">
+  <w:num w:numId="6" w16cid:durableId="1507095073">
     <w:abstractNumId w:val="3"/>
   </w:num>
-  <w:num w:numId="7" w16cid:durableId="1060859216">
+  <w:num w:numId="7" w16cid:durableId="79959543">
     <w:abstractNumId w:val="2"/>
   </w:num>
-  <w:num w:numId="8" w16cid:durableId="1136799261">
+  <w:num w:numId="8" w16cid:durableId="1929382519">
     <w:abstractNumId w:val="1"/>
   </w:num>
-  <w:num w:numId="9" w16cid:durableId="65301185">
+  <w:num w:numId="9" w16cid:durableId="1007900016">
     <w:abstractNumId w:val="0"/>
   </w:num>
 </w:numbering>

</xml_diff>

<commit_message>
docs: prevent connector overlap in UAT diagrams
</commit_message>
<xml_diff>
--- a/docs/pos/uat-v1.34.22/Manual-UAT-E2E-Kantin-POS-Kulakan-Akuntansi-100-Record-Jurnal-Umum-v1.34.22-20260904.docx
+++ b/docs/pos/uat-v1.34.22/Manual-UAT-E2E-Kantin-POS-Kulakan-Akuntansi-100-Record-Jurnal-Umum-v1.34.22-20260904.docx
@@ -77,7 +77,7 @@
           <w:noProof/>
         </w:rPr>
         <w:drawing>
-          <wp:inline distT="0" distB="0" distL="0" distR="0" wp14:anchorId="421E01D3" wp14:editId="1438D0DA">
+          <wp:inline distT="0" distB="0" distL="0" distR="0" wp14:anchorId="1C1C67D4" wp14:editId="08C8012B">
             <wp:extent cx="6949440" cy="3778758"/>
             <wp:effectExtent l="0" t="0" r="0" b="0"/>
             <wp:docPr id="1" name="Picture 1"/>
@@ -4115,7 +4115,7 @@
           <w:noProof/>
         </w:rPr>
         <w:drawing>
-          <wp:inline distT="0" distB="0" distL="0" distR="0" wp14:anchorId="62B0EAD9" wp14:editId="382E74C1">
+          <wp:inline distT="0" distB="0" distL="0" distR="0" wp14:anchorId="7BE1773B" wp14:editId="13A7FD82">
             <wp:extent cx="9464040" cy="5146072"/>
             <wp:effectExtent l="0" t="0" r="0" b="0"/>
             <wp:docPr id="2" name="Picture 2"/>
@@ -4339,7 +4339,7 @@
           <w:noProof/>
         </w:rPr>
         <w:drawing>
-          <wp:inline distT="0" distB="0" distL="0" distR="0" wp14:anchorId="6941D57F" wp14:editId="1DA84A9F">
+          <wp:inline distT="0" distB="0" distL="0" distR="0" wp14:anchorId="2EB52D6F" wp14:editId="779CC08E">
             <wp:extent cx="8412480" cy="1682496"/>
             <wp:effectExtent l="0" t="0" r="0" b="0"/>
             <wp:docPr id="3" name="Picture 3"/>
@@ -4399,7 +4399,7 @@
           <w:noProof/>
         </w:rPr>
         <w:drawing>
-          <wp:inline distT="0" distB="0" distL="0" distR="0" wp14:anchorId="5C43754D" wp14:editId="22F7E603">
+          <wp:inline distT="0" distB="0" distL="0" distR="0" wp14:anchorId="5394017E" wp14:editId="700A2CFE">
             <wp:extent cx="8412480" cy="1682496"/>
             <wp:effectExtent l="0" t="0" r="0" b="0"/>
             <wp:docPr id="4" name="Picture 4"/>
@@ -4459,7 +4459,7 @@
           <w:noProof/>
         </w:rPr>
         <w:drawing>
-          <wp:inline distT="0" distB="0" distL="0" distR="0" wp14:anchorId="1B3FCF2B" wp14:editId="79FB626F">
+          <wp:inline distT="0" distB="0" distL="0" distR="0" wp14:anchorId="516CED88" wp14:editId="5AE14B8D">
             <wp:extent cx="8412480" cy="1682496"/>
             <wp:effectExtent l="0" t="0" r="0" b="0"/>
             <wp:docPr id="5" name="Picture 5"/>
@@ -4716,7 +4716,7 @@
           <w:noProof/>
         </w:rPr>
         <w:drawing>
-          <wp:inline distT="0" distB="0" distL="0" distR="0" wp14:anchorId="3BFC36E8" wp14:editId="55D3426A">
+          <wp:inline distT="0" distB="0" distL="0" distR="0" wp14:anchorId="101C5590" wp14:editId="2A0B3A06">
             <wp:extent cx="9464040" cy="5146072"/>
             <wp:effectExtent l="0" t="0" r="0" b="0"/>
             <wp:docPr id="6" name="Picture 6"/>
@@ -4940,7 +4940,7 @@
           <w:noProof/>
         </w:rPr>
         <w:drawing>
-          <wp:inline distT="0" distB="0" distL="0" distR="0" wp14:anchorId="24A7B812" wp14:editId="514D6307">
+          <wp:inline distT="0" distB="0" distL="0" distR="0" wp14:anchorId="0BBDC150" wp14:editId="09ADD855">
             <wp:extent cx="8412480" cy="1682496"/>
             <wp:effectExtent l="0" t="0" r="0" b="0"/>
             <wp:docPr id="7" name="Picture 7"/>
@@ -5000,7 +5000,7 @@
           <w:noProof/>
         </w:rPr>
         <w:drawing>
-          <wp:inline distT="0" distB="0" distL="0" distR="0" wp14:anchorId="20DCF13D" wp14:editId="571F8800">
+          <wp:inline distT="0" distB="0" distL="0" distR="0" wp14:anchorId="6D50E62E" wp14:editId="539B607B">
             <wp:extent cx="8412480" cy="1682496"/>
             <wp:effectExtent l="0" t="0" r="0" b="0"/>
             <wp:docPr id="8" name="Picture 8"/>
@@ -5060,7 +5060,7 @@
           <w:noProof/>
         </w:rPr>
         <w:drawing>
-          <wp:inline distT="0" distB="0" distL="0" distR="0" wp14:anchorId="6FB155D8" wp14:editId="01372440">
+          <wp:inline distT="0" distB="0" distL="0" distR="0" wp14:anchorId="0AD12C93" wp14:editId="15A7A75F">
             <wp:extent cx="8412480" cy="1682496"/>
             <wp:effectExtent l="0" t="0" r="0" b="0"/>
             <wp:docPr id="9" name="Picture 9"/>
@@ -5317,7 +5317,7 @@
           <w:noProof/>
         </w:rPr>
         <w:drawing>
-          <wp:inline distT="0" distB="0" distL="0" distR="0" wp14:anchorId="3B766A91" wp14:editId="48E302CF">
+          <wp:inline distT="0" distB="0" distL="0" distR="0" wp14:anchorId="5BCCA22E" wp14:editId="5476A12A">
             <wp:extent cx="9464040" cy="5146072"/>
             <wp:effectExtent l="0" t="0" r="0" b="0"/>
             <wp:docPr id="10" name="Picture 10"/>
@@ -5541,7 +5541,7 @@
           <w:noProof/>
         </w:rPr>
         <w:drawing>
-          <wp:inline distT="0" distB="0" distL="0" distR="0" wp14:anchorId="47EFA51A" wp14:editId="4F9DB17C">
+          <wp:inline distT="0" distB="0" distL="0" distR="0" wp14:anchorId="6611BC05" wp14:editId="5166FE02">
             <wp:extent cx="8412480" cy="1682496"/>
             <wp:effectExtent l="0" t="0" r="0" b="0"/>
             <wp:docPr id="11" name="Picture 11"/>
@@ -5601,7 +5601,7 @@
           <w:noProof/>
         </w:rPr>
         <w:drawing>
-          <wp:inline distT="0" distB="0" distL="0" distR="0" wp14:anchorId="6FAEB01F" wp14:editId="1BA77972">
+          <wp:inline distT="0" distB="0" distL="0" distR="0" wp14:anchorId="772B65AB" wp14:editId="56E8543F">
             <wp:extent cx="8412480" cy="1682496"/>
             <wp:effectExtent l="0" t="0" r="0" b="0"/>
             <wp:docPr id="12" name="Picture 12"/>
@@ -5661,7 +5661,7 @@
           <w:noProof/>
         </w:rPr>
         <w:drawing>
-          <wp:inline distT="0" distB="0" distL="0" distR="0" wp14:anchorId="02EAB859" wp14:editId="01AEEF13">
+          <wp:inline distT="0" distB="0" distL="0" distR="0" wp14:anchorId="29F4C9EF" wp14:editId="2EF38F85">
             <wp:extent cx="8412480" cy="1682496"/>
             <wp:effectExtent l="0" t="0" r="0" b="0"/>
             <wp:docPr id="13" name="Picture 13"/>
@@ -5917,7 +5917,7 @@
           <w:noProof/>
         </w:rPr>
         <w:drawing>
-          <wp:inline distT="0" distB="0" distL="0" distR="0" wp14:anchorId="2F165CFC" wp14:editId="07F9F90D">
+          <wp:inline distT="0" distB="0" distL="0" distR="0" wp14:anchorId="50D5B5E9" wp14:editId="31B08842">
             <wp:extent cx="9464040" cy="5146072"/>
             <wp:effectExtent l="0" t="0" r="0" b="0"/>
             <wp:docPr id="14" name="Picture 14"/>
@@ -6139,7 +6139,7 @@
           <w:noProof/>
         </w:rPr>
         <w:drawing>
-          <wp:inline distT="0" distB="0" distL="0" distR="0" wp14:anchorId="1BD41AD4" wp14:editId="3315E5D9">
+          <wp:inline distT="0" distB="0" distL="0" distR="0" wp14:anchorId="5C6812EF" wp14:editId="1FAB3531">
             <wp:extent cx="8412480" cy="1682496"/>
             <wp:effectExtent l="0" t="0" r="0" b="0"/>
             <wp:docPr id="15" name="Picture 15"/>
@@ -6199,7 +6199,7 @@
           <w:noProof/>
         </w:rPr>
         <w:drawing>
-          <wp:inline distT="0" distB="0" distL="0" distR="0" wp14:anchorId="6A1F7D76" wp14:editId="551D0A95">
+          <wp:inline distT="0" distB="0" distL="0" distR="0" wp14:anchorId="06244E87" wp14:editId="39E54D96">
             <wp:extent cx="8412480" cy="1682496"/>
             <wp:effectExtent l="0" t="0" r="0" b="0"/>
             <wp:docPr id="16" name="Picture 16"/>
@@ -6259,7 +6259,7 @@
           <w:noProof/>
         </w:rPr>
         <w:drawing>
-          <wp:inline distT="0" distB="0" distL="0" distR="0" wp14:anchorId="562BD37D" wp14:editId="6A5D48AF">
+          <wp:inline distT="0" distB="0" distL="0" distR="0" wp14:anchorId="2CDE4457" wp14:editId="65F09711">
             <wp:extent cx="8412480" cy="1682496"/>
             <wp:effectExtent l="0" t="0" r="0" b="0"/>
             <wp:docPr id="17" name="Picture 17"/>
@@ -6515,7 +6515,7 @@
           <w:noProof/>
         </w:rPr>
         <w:drawing>
-          <wp:inline distT="0" distB="0" distL="0" distR="0" wp14:anchorId="17BA5F75" wp14:editId="63ECC4F9">
+          <wp:inline distT="0" distB="0" distL="0" distR="0" wp14:anchorId="59E062BB" wp14:editId="10388DEE">
             <wp:extent cx="9464040" cy="5146072"/>
             <wp:effectExtent l="0" t="0" r="0" b="0"/>
             <wp:docPr id="18" name="Picture 18"/>
@@ -6737,7 +6737,7 @@
           <w:noProof/>
         </w:rPr>
         <w:drawing>
-          <wp:inline distT="0" distB="0" distL="0" distR="0" wp14:anchorId="0D4D6A83" wp14:editId="6DFBE633">
+          <wp:inline distT="0" distB="0" distL="0" distR="0" wp14:anchorId="64A9AFD0" wp14:editId="5CCA9BEC">
             <wp:extent cx="8412480" cy="1682496"/>
             <wp:effectExtent l="0" t="0" r="0" b="0"/>
             <wp:docPr id="19" name="Picture 19"/>
@@ -6797,7 +6797,7 @@
           <w:noProof/>
         </w:rPr>
         <w:drawing>
-          <wp:inline distT="0" distB="0" distL="0" distR="0" wp14:anchorId="73BB1EB9" wp14:editId="6C968422">
+          <wp:inline distT="0" distB="0" distL="0" distR="0" wp14:anchorId="63CC9302" wp14:editId="3A30B19B">
             <wp:extent cx="8412480" cy="1682496"/>
             <wp:effectExtent l="0" t="0" r="0" b="0"/>
             <wp:docPr id="20" name="Picture 20"/>
@@ -6857,7 +6857,7 @@
           <w:noProof/>
         </w:rPr>
         <w:drawing>
-          <wp:inline distT="0" distB="0" distL="0" distR="0" wp14:anchorId="6557FFF7" wp14:editId="7C038B0E">
+          <wp:inline distT="0" distB="0" distL="0" distR="0" wp14:anchorId="791A6724" wp14:editId="04F3B622">
             <wp:extent cx="8412480" cy="1682496"/>
             <wp:effectExtent l="0" t="0" r="0" b="0"/>
             <wp:docPr id="21" name="Picture 21"/>
@@ -7113,7 +7113,7 @@
           <w:noProof/>
         </w:rPr>
         <w:drawing>
-          <wp:inline distT="0" distB="0" distL="0" distR="0" wp14:anchorId="2EFAA09B" wp14:editId="5FF03259">
+          <wp:inline distT="0" distB="0" distL="0" distR="0" wp14:anchorId="149EF91E" wp14:editId="31C7A14E">
             <wp:extent cx="9464040" cy="5146072"/>
             <wp:effectExtent l="0" t="0" r="0" b="0"/>
             <wp:docPr id="22" name="Picture 22"/>
@@ -7335,7 +7335,7 @@
           <w:noProof/>
         </w:rPr>
         <w:drawing>
-          <wp:inline distT="0" distB="0" distL="0" distR="0" wp14:anchorId="1CC86A95" wp14:editId="4FAD9F55">
+          <wp:inline distT="0" distB="0" distL="0" distR="0" wp14:anchorId="52840A05" wp14:editId="2E81561B">
             <wp:extent cx="8412480" cy="1682496"/>
             <wp:effectExtent l="0" t="0" r="0" b="0"/>
             <wp:docPr id="23" name="Picture 23"/>
@@ -7395,7 +7395,7 @@
           <w:noProof/>
         </w:rPr>
         <w:drawing>
-          <wp:inline distT="0" distB="0" distL="0" distR="0" wp14:anchorId="52C66B7A" wp14:editId="2115FADE">
+          <wp:inline distT="0" distB="0" distL="0" distR="0" wp14:anchorId="32D1200D" wp14:editId="1BC76F30">
             <wp:extent cx="8412480" cy="1682496"/>
             <wp:effectExtent l="0" t="0" r="0" b="0"/>
             <wp:docPr id="24" name="Picture 24"/>
@@ -7455,7 +7455,7 @@
           <w:noProof/>
         </w:rPr>
         <w:drawing>
-          <wp:inline distT="0" distB="0" distL="0" distR="0" wp14:anchorId="6345DE6E" wp14:editId="0A72FC41">
+          <wp:inline distT="0" distB="0" distL="0" distR="0" wp14:anchorId="4D013D75" wp14:editId="439F941C">
             <wp:extent cx="8412480" cy="1682496"/>
             <wp:effectExtent l="0" t="0" r="0" b="0"/>
             <wp:docPr id="25" name="Picture 25"/>
@@ -7711,7 +7711,7 @@
           <w:noProof/>
         </w:rPr>
         <w:drawing>
-          <wp:inline distT="0" distB="0" distL="0" distR="0" wp14:anchorId="7843F85E" wp14:editId="629C152C">
+          <wp:inline distT="0" distB="0" distL="0" distR="0" wp14:anchorId="5C01D182" wp14:editId="4CCF522D">
             <wp:extent cx="9464040" cy="5146072"/>
             <wp:effectExtent l="0" t="0" r="0" b="0"/>
             <wp:docPr id="26" name="Picture 26"/>
@@ -7933,7 +7933,7 @@
           <w:noProof/>
         </w:rPr>
         <w:drawing>
-          <wp:inline distT="0" distB="0" distL="0" distR="0" wp14:anchorId="18E52FE6" wp14:editId="2B6B4826">
+          <wp:inline distT="0" distB="0" distL="0" distR="0" wp14:anchorId="48905C0B" wp14:editId="6527E7B6">
             <wp:extent cx="8412480" cy="1682496"/>
             <wp:effectExtent l="0" t="0" r="0" b="0"/>
             <wp:docPr id="27" name="Picture 27"/>
@@ -7993,7 +7993,7 @@
           <w:noProof/>
         </w:rPr>
         <w:drawing>
-          <wp:inline distT="0" distB="0" distL="0" distR="0" wp14:anchorId="4DBB991E" wp14:editId="30EE0065">
+          <wp:inline distT="0" distB="0" distL="0" distR="0" wp14:anchorId="46F12987" wp14:editId="2CD2F5EA">
             <wp:extent cx="8412480" cy="1682496"/>
             <wp:effectExtent l="0" t="0" r="0" b="0"/>
             <wp:docPr id="28" name="Picture 28"/>
@@ -8053,7 +8053,7 @@
           <w:noProof/>
         </w:rPr>
         <w:drawing>
-          <wp:inline distT="0" distB="0" distL="0" distR="0" wp14:anchorId="3591FD21" wp14:editId="3CA8BE0B">
+          <wp:inline distT="0" distB="0" distL="0" distR="0" wp14:anchorId="3430CBA1" wp14:editId="4F00AD1D">
             <wp:extent cx="8412480" cy="1682496"/>
             <wp:effectExtent l="0" t="0" r="0" b="0"/>
             <wp:docPr id="29" name="Picture 29"/>
@@ -8309,7 +8309,7 @@
           <w:noProof/>
         </w:rPr>
         <w:drawing>
-          <wp:inline distT="0" distB="0" distL="0" distR="0" wp14:anchorId="308F8AC8" wp14:editId="0DCBEBE2">
+          <wp:inline distT="0" distB="0" distL="0" distR="0" wp14:anchorId="67FE1244" wp14:editId="190FA7A7">
             <wp:extent cx="9464040" cy="5146072"/>
             <wp:effectExtent l="0" t="0" r="0" b="0"/>
             <wp:docPr id="30" name="Picture 30"/>
@@ -8531,7 +8531,7 @@
           <w:noProof/>
         </w:rPr>
         <w:drawing>
-          <wp:inline distT="0" distB="0" distL="0" distR="0" wp14:anchorId="6324ECAE" wp14:editId="1A98B62A">
+          <wp:inline distT="0" distB="0" distL="0" distR="0" wp14:anchorId="089F6932" wp14:editId="66934721">
             <wp:extent cx="8412480" cy="1682496"/>
             <wp:effectExtent l="0" t="0" r="0" b="0"/>
             <wp:docPr id="31" name="Picture 31"/>
@@ -8591,7 +8591,7 @@
           <w:noProof/>
         </w:rPr>
         <w:drawing>
-          <wp:inline distT="0" distB="0" distL="0" distR="0" wp14:anchorId="6F9132C3" wp14:editId="305543F3">
+          <wp:inline distT="0" distB="0" distL="0" distR="0" wp14:anchorId="3B1C9E05" wp14:editId="53E70845">
             <wp:extent cx="8412480" cy="1682496"/>
             <wp:effectExtent l="0" t="0" r="0" b="0"/>
             <wp:docPr id="32" name="Picture 32"/>
@@ -8651,7 +8651,7 @@
           <w:noProof/>
         </w:rPr>
         <w:drawing>
-          <wp:inline distT="0" distB="0" distL="0" distR="0" wp14:anchorId="521C8456" wp14:editId="2B0DC6E3">
+          <wp:inline distT="0" distB="0" distL="0" distR="0" wp14:anchorId="613532D4" wp14:editId="50EBE135">
             <wp:extent cx="8412480" cy="1682496"/>
             <wp:effectExtent l="0" t="0" r="0" b="0"/>
             <wp:docPr id="33" name="Picture 33"/>
@@ -8907,7 +8907,7 @@
           <w:noProof/>
         </w:rPr>
         <w:drawing>
-          <wp:inline distT="0" distB="0" distL="0" distR="0" wp14:anchorId="4A93BEAB" wp14:editId="2106758C">
+          <wp:inline distT="0" distB="0" distL="0" distR="0" wp14:anchorId="042B8134" wp14:editId="14085E4B">
             <wp:extent cx="9464040" cy="5146072"/>
             <wp:effectExtent l="0" t="0" r="0" b="0"/>
             <wp:docPr id="34" name="Picture 34"/>
@@ -9129,7 +9129,7 @@
           <w:noProof/>
         </w:rPr>
         <w:drawing>
-          <wp:inline distT="0" distB="0" distL="0" distR="0" wp14:anchorId="0FD84405" wp14:editId="76B62438">
+          <wp:inline distT="0" distB="0" distL="0" distR="0" wp14:anchorId="201611C7" wp14:editId="09B4D16B">
             <wp:extent cx="8412480" cy="1682496"/>
             <wp:effectExtent l="0" t="0" r="0" b="0"/>
             <wp:docPr id="35" name="Picture 35"/>
@@ -9189,7 +9189,7 @@
           <w:noProof/>
         </w:rPr>
         <w:drawing>
-          <wp:inline distT="0" distB="0" distL="0" distR="0" wp14:anchorId="44985F38" wp14:editId="2489D052">
+          <wp:inline distT="0" distB="0" distL="0" distR="0" wp14:anchorId="78D2AC57" wp14:editId="452A87D5">
             <wp:extent cx="8412480" cy="1682496"/>
             <wp:effectExtent l="0" t="0" r="0" b="0"/>
             <wp:docPr id="36" name="Picture 36"/>
@@ -9249,7 +9249,7 @@
           <w:noProof/>
         </w:rPr>
         <w:drawing>
-          <wp:inline distT="0" distB="0" distL="0" distR="0" wp14:anchorId="56099F9F" wp14:editId="4A3D7BB1">
+          <wp:inline distT="0" distB="0" distL="0" distR="0" wp14:anchorId="0BA9C488" wp14:editId="0AE55A32">
             <wp:extent cx="8412480" cy="1682496"/>
             <wp:effectExtent l="0" t="0" r="0" b="0"/>
             <wp:docPr id="37" name="Picture 37"/>
@@ -9505,7 +9505,7 @@
           <w:noProof/>
         </w:rPr>
         <w:drawing>
-          <wp:inline distT="0" distB="0" distL="0" distR="0" wp14:anchorId="33BF027A" wp14:editId="41CEDF9B">
+          <wp:inline distT="0" distB="0" distL="0" distR="0" wp14:anchorId="1BC1D9E7" wp14:editId="76D12D0F">
             <wp:extent cx="9464040" cy="5146072"/>
             <wp:effectExtent l="0" t="0" r="0" b="0"/>
             <wp:docPr id="38" name="Picture 38"/>
@@ -9727,7 +9727,7 @@
           <w:noProof/>
         </w:rPr>
         <w:drawing>
-          <wp:inline distT="0" distB="0" distL="0" distR="0" wp14:anchorId="38651C9E" wp14:editId="1A07B50A">
+          <wp:inline distT="0" distB="0" distL="0" distR="0" wp14:anchorId="51BA96DA" wp14:editId="7E3A1384">
             <wp:extent cx="8412480" cy="1682496"/>
             <wp:effectExtent l="0" t="0" r="0" b="0"/>
             <wp:docPr id="39" name="Picture 39"/>
@@ -9787,7 +9787,7 @@
           <w:noProof/>
         </w:rPr>
         <w:drawing>
-          <wp:inline distT="0" distB="0" distL="0" distR="0" wp14:anchorId="34B8F9BB" wp14:editId="37513E25">
+          <wp:inline distT="0" distB="0" distL="0" distR="0" wp14:anchorId="150BA57E" wp14:editId="7AD89408">
             <wp:extent cx="8412480" cy="1682496"/>
             <wp:effectExtent l="0" t="0" r="0" b="0"/>
             <wp:docPr id="40" name="Picture 40"/>
@@ -9847,7 +9847,7 @@
           <w:noProof/>
         </w:rPr>
         <w:drawing>
-          <wp:inline distT="0" distB="0" distL="0" distR="0" wp14:anchorId="42C9E8A8" wp14:editId="56EF5F5A">
+          <wp:inline distT="0" distB="0" distL="0" distR="0" wp14:anchorId="61B3FF20" wp14:editId="514F5128">
             <wp:extent cx="8412480" cy="1682496"/>
             <wp:effectExtent l="0" t="0" r="0" b="0"/>
             <wp:docPr id="41" name="Picture 41"/>
@@ -10103,7 +10103,7 @@
           <w:noProof/>
         </w:rPr>
         <w:drawing>
-          <wp:inline distT="0" distB="0" distL="0" distR="0" wp14:anchorId="3829F63C" wp14:editId="3CD81CE9">
+          <wp:inline distT="0" distB="0" distL="0" distR="0" wp14:anchorId="6AE93FE6" wp14:editId="114548A1">
             <wp:extent cx="9464040" cy="5146072"/>
             <wp:effectExtent l="0" t="0" r="0" b="0"/>
             <wp:docPr id="42" name="Picture 42"/>
@@ -10325,7 +10325,7 @@
           <w:noProof/>
         </w:rPr>
         <w:drawing>
-          <wp:inline distT="0" distB="0" distL="0" distR="0" wp14:anchorId="49D9EA90" wp14:editId="480880EF">
+          <wp:inline distT="0" distB="0" distL="0" distR="0" wp14:anchorId="29FFF586" wp14:editId="5B7ACF86">
             <wp:extent cx="8412480" cy="1682496"/>
             <wp:effectExtent l="0" t="0" r="0" b="0"/>
             <wp:docPr id="43" name="Picture 43"/>
@@ -10385,7 +10385,7 @@
           <w:noProof/>
         </w:rPr>
         <w:drawing>
-          <wp:inline distT="0" distB="0" distL="0" distR="0" wp14:anchorId="09473CE0" wp14:editId="0CF70E02">
+          <wp:inline distT="0" distB="0" distL="0" distR="0" wp14:anchorId="11782A37" wp14:editId="49F82DFC">
             <wp:extent cx="8412480" cy="1682496"/>
             <wp:effectExtent l="0" t="0" r="0" b="0"/>
             <wp:docPr id="44" name="Picture 44"/>
@@ -10445,7 +10445,7 @@
           <w:noProof/>
         </w:rPr>
         <w:drawing>
-          <wp:inline distT="0" distB="0" distL="0" distR="0" wp14:anchorId="7CE111C7" wp14:editId="61740231">
+          <wp:inline distT="0" distB="0" distL="0" distR="0" wp14:anchorId="51090A9E" wp14:editId="62E922B8">
             <wp:extent cx="8412480" cy="1682496"/>
             <wp:effectExtent l="0" t="0" r="0" b="0"/>
             <wp:docPr id="45" name="Picture 45"/>
@@ -10701,7 +10701,7 @@
           <w:noProof/>
         </w:rPr>
         <w:drawing>
-          <wp:inline distT="0" distB="0" distL="0" distR="0" wp14:anchorId="3A84F83A" wp14:editId="1A33AE87">
+          <wp:inline distT="0" distB="0" distL="0" distR="0" wp14:anchorId="24E5C616" wp14:editId="1DECFA48">
             <wp:extent cx="9464040" cy="5146072"/>
             <wp:effectExtent l="0" t="0" r="0" b="0"/>
             <wp:docPr id="46" name="Picture 46"/>
@@ -10923,7 +10923,7 @@
           <w:noProof/>
         </w:rPr>
         <w:drawing>
-          <wp:inline distT="0" distB="0" distL="0" distR="0" wp14:anchorId="4BBB2245" wp14:editId="651E97DE">
+          <wp:inline distT="0" distB="0" distL="0" distR="0" wp14:anchorId="274A7027" wp14:editId="6DBD5365">
             <wp:extent cx="8412480" cy="1682496"/>
             <wp:effectExtent l="0" t="0" r="0" b="0"/>
             <wp:docPr id="47" name="Picture 47"/>
@@ -10983,7 +10983,7 @@
           <w:noProof/>
         </w:rPr>
         <w:drawing>
-          <wp:inline distT="0" distB="0" distL="0" distR="0" wp14:anchorId="61B50194" wp14:editId="780A741D">
+          <wp:inline distT="0" distB="0" distL="0" distR="0" wp14:anchorId="1335319F" wp14:editId="7ABD51D6">
             <wp:extent cx="8412480" cy="1682496"/>
             <wp:effectExtent l="0" t="0" r="0" b="0"/>
             <wp:docPr id="48" name="Picture 48"/>
@@ -11043,7 +11043,7 @@
           <w:noProof/>
         </w:rPr>
         <w:drawing>
-          <wp:inline distT="0" distB="0" distL="0" distR="0" wp14:anchorId="44156536" wp14:editId="03D89905">
+          <wp:inline distT="0" distB="0" distL="0" distR="0" wp14:anchorId="4BF97DF8" wp14:editId="3D627D6B">
             <wp:extent cx="8412480" cy="1682496"/>
             <wp:effectExtent l="0" t="0" r="0" b="0"/>
             <wp:docPr id="49" name="Picture 49"/>
@@ -11299,7 +11299,7 @@
           <w:noProof/>
         </w:rPr>
         <w:drawing>
-          <wp:inline distT="0" distB="0" distL="0" distR="0" wp14:anchorId="27730479" wp14:editId="027F5D85">
+          <wp:inline distT="0" distB="0" distL="0" distR="0" wp14:anchorId="0672420C" wp14:editId="685C8778">
             <wp:extent cx="9464040" cy="5146072"/>
             <wp:effectExtent l="0" t="0" r="0" b="0"/>
             <wp:docPr id="50" name="Picture 50"/>
@@ -11521,7 +11521,7 @@
           <w:noProof/>
         </w:rPr>
         <w:drawing>
-          <wp:inline distT="0" distB="0" distL="0" distR="0" wp14:anchorId="6B335656" wp14:editId="2B8402BA">
+          <wp:inline distT="0" distB="0" distL="0" distR="0" wp14:anchorId="40C600E1" wp14:editId="071C7C00">
             <wp:extent cx="8412480" cy="1682496"/>
             <wp:effectExtent l="0" t="0" r="0" b="0"/>
             <wp:docPr id="51" name="Picture 51"/>
@@ -11581,7 +11581,7 @@
           <w:noProof/>
         </w:rPr>
         <w:drawing>
-          <wp:inline distT="0" distB="0" distL="0" distR="0" wp14:anchorId="0269701E" wp14:editId="21FEDA82">
+          <wp:inline distT="0" distB="0" distL="0" distR="0" wp14:anchorId="6ACDD1AE" wp14:editId="74F1FD90">
             <wp:extent cx="8412480" cy="1682496"/>
             <wp:effectExtent l="0" t="0" r="0" b="0"/>
             <wp:docPr id="52" name="Picture 52"/>
@@ -11641,7 +11641,7 @@
           <w:noProof/>
         </w:rPr>
         <w:drawing>
-          <wp:inline distT="0" distB="0" distL="0" distR="0" wp14:anchorId="49117C21" wp14:editId="3ED3D2BC">
+          <wp:inline distT="0" distB="0" distL="0" distR="0" wp14:anchorId="0299792C" wp14:editId="54CA4A33">
             <wp:extent cx="8412480" cy="1682496"/>
             <wp:effectExtent l="0" t="0" r="0" b="0"/>
             <wp:docPr id="53" name="Picture 53"/>
@@ -11897,7 +11897,7 @@
           <w:noProof/>
         </w:rPr>
         <w:drawing>
-          <wp:inline distT="0" distB="0" distL="0" distR="0" wp14:anchorId="5F483A7B" wp14:editId="70F865C2">
+          <wp:inline distT="0" distB="0" distL="0" distR="0" wp14:anchorId="6F8D6FBA" wp14:editId="20042450">
             <wp:extent cx="9464040" cy="5146072"/>
             <wp:effectExtent l="0" t="0" r="0" b="0"/>
             <wp:docPr id="54" name="Picture 54"/>
@@ -12119,7 +12119,7 @@
           <w:noProof/>
         </w:rPr>
         <w:drawing>
-          <wp:inline distT="0" distB="0" distL="0" distR="0" wp14:anchorId="0464C4F5" wp14:editId="28E499B0">
+          <wp:inline distT="0" distB="0" distL="0" distR="0" wp14:anchorId="59F1E0B6" wp14:editId="2F46832E">
             <wp:extent cx="8412480" cy="1682496"/>
             <wp:effectExtent l="0" t="0" r="0" b="0"/>
             <wp:docPr id="55" name="Picture 55"/>
@@ -12179,7 +12179,7 @@
           <w:noProof/>
         </w:rPr>
         <w:drawing>
-          <wp:inline distT="0" distB="0" distL="0" distR="0" wp14:anchorId="64E8AEA1" wp14:editId="4D805172">
+          <wp:inline distT="0" distB="0" distL="0" distR="0" wp14:anchorId="3F23461D" wp14:editId="4745AE89">
             <wp:extent cx="8412480" cy="1682496"/>
             <wp:effectExtent l="0" t="0" r="0" b="0"/>
             <wp:docPr id="56" name="Picture 56"/>
@@ -12239,7 +12239,7 @@
           <w:noProof/>
         </w:rPr>
         <w:drawing>
-          <wp:inline distT="0" distB="0" distL="0" distR="0" wp14:anchorId="4EC15F06" wp14:editId="6B67567F">
+          <wp:inline distT="0" distB="0" distL="0" distR="0" wp14:anchorId="57459C1A" wp14:editId="24828596">
             <wp:extent cx="8412480" cy="1682496"/>
             <wp:effectExtent l="0" t="0" r="0" b="0"/>
             <wp:docPr id="57" name="Picture 57"/>
@@ -12495,7 +12495,7 @@
           <w:noProof/>
         </w:rPr>
         <w:drawing>
-          <wp:inline distT="0" distB="0" distL="0" distR="0" wp14:anchorId="766E46DC" wp14:editId="7FA16885">
+          <wp:inline distT="0" distB="0" distL="0" distR="0" wp14:anchorId="3E4B93CC" wp14:editId="7471DDCF">
             <wp:extent cx="9464040" cy="5146072"/>
             <wp:effectExtent l="0" t="0" r="0" b="0"/>
             <wp:docPr id="58" name="Picture 58"/>
@@ -12717,7 +12717,7 @@
           <w:noProof/>
         </w:rPr>
         <w:drawing>
-          <wp:inline distT="0" distB="0" distL="0" distR="0" wp14:anchorId="6E33A73B" wp14:editId="4EA37872">
+          <wp:inline distT="0" distB="0" distL="0" distR="0" wp14:anchorId="4F575332" wp14:editId="641F8EE3">
             <wp:extent cx="8412480" cy="1682496"/>
             <wp:effectExtent l="0" t="0" r="0" b="0"/>
             <wp:docPr id="59" name="Picture 59"/>
@@ -12777,7 +12777,7 @@
           <w:noProof/>
         </w:rPr>
         <w:drawing>
-          <wp:inline distT="0" distB="0" distL="0" distR="0" wp14:anchorId="70508A8C" wp14:editId="5CE01498">
+          <wp:inline distT="0" distB="0" distL="0" distR="0" wp14:anchorId="29B97F9F" wp14:editId="4C61B27B">
             <wp:extent cx="8412480" cy="1682496"/>
             <wp:effectExtent l="0" t="0" r="0" b="0"/>
             <wp:docPr id="60" name="Picture 60"/>
@@ -12837,7 +12837,7 @@
           <w:noProof/>
         </w:rPr>
         <w:drawing>
-          <wp:inline distT="0" distB="0" distL="0" distR="0" wp14:anchorId="1B82EF40" wp14:editId="09213089">
+          <wp:inline distT="0" distB="0" distL="0" distR="0" wp14:anchorId="5B08E99B" wp14:editId="7FF6BFBD">
             <wp:extent cx="8412480" cy="1682496"/>
             <wp:effectExtent l="0" t="0" r="0" b="0"/>
             <wp:docPr id="61" name="Picture 61"/>
@@ -13093,7 +13093,7 @@
           <w:noProof/>
         </w:rPr>
         <w:drawing>
-          <wp:inline distT="0" distB="0" distL="0" distR="0" wp14:anchorId="594FB9C8" wp14:editId="62970878">
+          <wp:inline distT="0" distB="0" distL="0" distR="0" wp14:anchorId="3826AD19" wp14:editId="3ECB603D">
             <wp:extent cx="9464040" cy="5146072"/>
             <wp:effectExtent l="0" t="0" r="0" b="0"/>
             <wp:docPr id="62" name="Picture 62"/>
@@ -13315,7 +13315,7 @@
           <w:noProof/>
         </w:rPr>
         <w:drawing>
-          <wp:inline distT="0" distB="0" distL="0" distR="0" wp14:anchorId="572CC320" wp14:editId="6B46932A">
+          <wp:inline distT="0" distB="0" distL="0" distR="0" wp14:anchorId="1B37DAEE" wp14:editId="48D69CF9">
             <wp:extent cx="8412480" cy="1682496"/>
             <wp:effectExtent l="0" t="0" r="0" b="0"/>
             <wp:docPr id="63" name="Picture 63"/>
@@ -13375,7 +13375,7 @@
           <w:noProof/>
         </w:rPr>
         <w:drawing>
-          <wp:inline distT="0" distB="0" distL="0" distR="0" wp14:anchorId="0D88ABB8" wp14:editId="4F307641">
+          <wp:inline distT="0" distB="0" distL="0" distR="0" wp14:anchorId="6C50E55B" wp14:editId="767BB949">
             <wp:extent cx="8412480" cy="1682496"/>
             <wp:effectExtent l="0" t="0" r="0" b="0"/>
             <wp:docPr id="64" name="Picture 64"/>
@@ -13435,7 +13435,7 @@
           <w:noProof/>
         </w:rPr>
         <w:drawing>
-          <wp:inline distT="0" distB="0" distL="0" distR="0" wp14:anchorId="11356F3D" wp14:editId="49F91F8C">
+          <wp:inline distT="0" distB="0" distL="0" distR="0" wp14:anchorId="03800EA6" wp14:editId="62BEA3C9">
             <wp:extent cx="8412480" cy="1682496"/>
             <wp:effectExtent l="0" t="0" r="0" b="0"/>
             <wp:docPr id="65" name="Picture 65"/>
@@ -13691,7 +13691,7 @@
           <w:noProof/>
         </w:rPr>
         <w:drawing>
-          <wp:inline distT="0" distB="0" distL="0" distR="0" wp14:anchorId="753C1406" wp14:editId="1CD9260A">
+          <wp:inline distT="0" distB="0" distL="0" distR="0" wp14:anchorId="469E39AD" wp14:editId="3F176BA7">
             <wp:extent cx="9464040" cy="5146072"/>
             <wp:effectExtent l="0" t="0" r="0" b="0"/>
             <wp:docPr id="66" name="Picture 66"/>
@@ -13913,7 +13913,7 @@
           <w:noProof/>
         </w:rPr>
         <w:drawing>
-          <wp:inline distT="0" distB="0" distL="0" distR="0" wp14:anchorId="51950AD9" wp14:editId="5DCE1008">
+          <wp:inline distT="0" distB="0" distL="0" distR="0" wp14:anchorId="0089BC4A" wp14:editId="3F091576">
             <wp:extent cx="8412480" cy="1682496"/>
             <wp:effectExtent l="0" t="0" r="0" b="0"/>
             <wp:docPr id="67" name="Picture 67"/>
@@ -13973,7 +13973,7 @@
           <w:noProof/>
         </w:rPr>
         <w:drawing>
-          <wp:inline distT="0" distB="0" distL="0" distR="0" wp14:anchorId="4549DDA5" wp14:editId="3DC8DB82">
+          <wp:inline distT="0" distB="0" distL="0" distR="0" wp14:anchorId="5A891AA5" wp14:editId="58D01BE2">
             <wp:extent cx="8412480" cy="1682496"/>
             <wp:effectExtent l="0" t="0" r="0" b="0"/>
             <wp:docPr id="68" name="Picture 68"/>
@@ -14033,7 +14033,7 @@
           <w:noProof/>
         </w:rPr>
         <w:drawing>
-          <wp:inline distT="0" distB="0" distL="0" distR="0" wp14:anchorId="5D99D886" wp14:editId="721485C3">
+          <wp:inline distT="0" distB="0" distL="0" distR="0" wp14:anchorId="42CA952D" wp14:editId="70C9C4A6">
             <wp:extent cx="8412480" cy="1682496"/>
             <wp:effectExtent l="0" t="0" r="0" b="0"/>
             <wp:docPr id="69" name="Picture 69"/>
@@ -14289,7 +14289,7 @@
           <w:noProof/>
         </w:rPr>
         <w:drawing>
-          <wp:inline distT="0" distB="0" distL="0" distR="0" wp14:anchorId="185C7810" wp14:editId="2E76B8C8">
+          <wp:inline distT="0" distB="0" distL="0" distR="0" wp14:anchorId="078A0454" wp14:editId="54D4ACE8">
             <wp:extent cx="9464040" cy="5146072"/>
             <wp:effectExtent l="0" t="0" r="0" b="0"/>
             <wp:docPr id="70" name="Picture 70"/>
@@ -14511,7 +14511,7 @@
           <w:noProof/>
         </w:rPr>
         <w:drawing>
-          <wp:inline distT="0" distB="0" distL="0" distR="0" wp14:anchorId="1B9BA8A0" wp14:editId="3DA0BF0B">
+          <wp:inline distT="0" distB="0" distL="0" distR="0" wp14:anchorId="7DFA286E" wp14:editId="00EDF03D">
             <wp:extent cx="8412480" cy="1682496"/>
             <wp:effectExtent l="0" t="0" r="0" b="0"/>
             <wp:docPr id="71" name="Picture 71"/>
@@ -14571,7 +14571,7 @@
           <w:noProof/>
         </w:rPr>
         <w:drawing>
-          <wp:inline distT="0" distB="0" distL="0" distR="0" wp14:anchorId="5ACDD652" wp14:editId="25A3F303">
+          <wp:inline distT="0" distB="0" distL="0" distR="0" wp14:anchorId="4325F368" wp14:editId="21F7ACCF">
             <wp:extent cx="8412480" cy="1682496"/>
             <wp:effectExtent l="0" t="0" r="0" b="0"/>
             <wp:docPr id="72" name="Picture 72"/>
@@ -14631,7 +14631,7 @@
           <w:noProof/>
         </w:rPr>
         <w:drawing>
-          <wp:inline distT="0" distB="0" distL="0" distR="0" wp14:anchorId="1DAE9129" wp14:editId="4D0387EB">
+          <wp:inline distT="0" distB="0" distL="0" distR="0" wp14:anchorId="35AD3FD7" wp14:editId="5276EF40">
             <wp:extent cx="8412480" cy="1682496"/>
             <wp:effectExtent l="0" t="0" r="0" b="0"/>
             <wp:docPr id="73" name="Picture 73"/>
@@ -14887,7 +14887,7 @@
           <w:noProof/>
         </w:rPr>
         <w:drawing>
-          <wp:inline distT="0" distB="0" distL="0" distR="0" wp14:anchorId="1B821ACA" wp14:editId="694A77BE">
+          <wp:inline distT="0" distB="0" distL="0" distR="0" wp14:anchorId="37C5436A" wp14:editId="25B81931">
             <wp:extent cx="9464040" cy="5146072"/>
             <wp:effectExtent l="0" t="0" r="0" b="0"/>
             <wp:docPr id="74" name="Picture 74"/>
@@ -15109,7 +15109,7 @@
           <w:noProof/>
         </w:rPr>
         <w:drawing>
-          <wp:inline distT="0" distB="0" distL="0" distR="0" wp14:anchorId="68E0B559" wp14:editId="0F9A04CE">
+          <wp:inline distT="0" distB="0" distL="0" distR="0" wp14:anchorId="22AB44EB" wp14:editId="1F7FB63A">
             <wp:extent cx="8412480" cy="1682496"/>
             <wp:effectExtent l="0" t="0" r="0" b="0"/>
             <wp:docPr id="75" name="Picture 75"/>
@@ -15169,7 +15169,7 @@
           <w:noProof/>
         </w:rPr>
         <w:drawing>
-          <wp:inline distT="0" distB="0" distL="0" distR="0" wp14:anchorId="22B714C6" wp14:editId="64A4C3C6">
+          <wp:inline distT="0" distB="0" distL="0" distR="0" wp14:anchorId="017E9429" wp14:editId="70068823">
             <wp:extent cx="8412480" cy="1682496"/>
             <wp:effectExtent l="0" t="0" r="0" b="0"/>
             <wp:docPr id="76" name="Picture 76"/>
@@ -15229,7 +15229,7 @@
           <w:noProof/>
         </w:rPr>
         <w:drawing>
-          <wp:inline distT="0" distB="0" distL="0" distR="0" wp14:anchorId="1FF76696" wp14:editId="7127524B">
+          <wp:inline distT="0" distB="0" distL="0" distR="0" wp14:anchorId="45A19D1A" wp14:editId="6414D386">
             <wp:extent cx="8412480" cy="1682496"/>
             <wp:effectExtent l="0" t="0" r="0" b="0"/>
             <wp:docPr id="77" name="Picture 77"/>
@@ -15485,7 +15485,7 @@
           <w:noProof/>
         </w:rPr>
         <w:drawing>
-          <wp:inline distT="0" distB="0" distL="0" distR="0" wp14:anchorId="0C8D043B" wp14:editId="18E7FE03">
+          <wp:inline distT="0" distB="0" distL="0" distR="0" wp14:anchorId="0E0396CC" wp14:editId="3ABCBECA">
             <wp:extent cx="9464040" cy="5146072"/>
             <wp:effectExtent l="0" t="0" r="0" b="0"/>
             <wp:docPr id="78" name="Picture 78"/>
@@ -15707,7 +15707,7 @@
           <w:noProof/>
         </w:rPr>
         <w:drawing>
-          <wp:inline distT="0" distB="0" distL="0" distR="0" wp14:anchorId="170883DF" wp14:editId="3CB7C021">
+          <wp:inline distT="0" distB="0" distL="0" distR="0" wp14:anchorId="75F02B70" wp14:editId="19BF62A6">
             <wp:extent cx="8412480" cy="1682496"/>
             <wp:effectExtent l="0" t="0" r="0" b="0"/>
             <wp:docPr id="79" name="Picture 79"/>
@@ -15767,7 +15767,7 @@
           <w:noProof/>
         </w:rPr>
         <w:drawing>
-          <wp:inline distT="0" distB="0" distL="0" distR="0" wp14:anchorId="70527BB7" wp14:editId="2761117F">
+          <wp:inline distT="0" distB="0" distL="0" distR="0" wp14:anchorId="5E3830A0" wp14:editId="2CAE5E6A">
             <wp:extent cx="8412480" cy="1682496"/>
             <wp:effectExtent l="0" t="0" r="0" b="0"/>
             <wp:docPr id="80" name="Picture 80"/>
@@ -15827,7 +15827,7 @@
           <w:noProof/>
         </w:rPr>
         <w:drawing>
-          <wp:inline distT="0" distB="0" distL="0" distR="0" wp14:anchorId="51E8EBE9" wp14:editId="6FAF1B04">
+          <wp:inline distT="0" distB="0" distL="0" distR="0" wp14:anchorId="3868DEC0" wp14:editId="2A364837">
             <wp:extent cx="8412480" cy="1682496"/>
             <wp:effectExtent l="0" t="0" r="0" b="0"/>
             <wp:docPr id="81" name="Picture 81"/>
@@ -16083,7 +16083,7 @@
           <w:noProof/>
         </w:rPr>
         <w:drawing>
-          <wp:inline distT="0" distB="0" distL="0" distR="0" wp14:anchorId="2BAC4C56" wp14:editId="0BF937AB">
+          <wp:inline distT="0" distB="0" distL="0" distR="0" wp14:anchorId="7F7D1EFF" wp14:editId="7E1B259A">
             <wp:extent cx="9464040" cy="5146072"/>
             <wp:effectExtent l="0" t="0" r="0" b="0"/>
             <wp:docPr id="82" name="Picture 82"/>
@@ -16305,7 +16305,7 @@
           <w:noProof/>
         </w:rPr>
         <w:drawing>
-          <wp:inline distT="0" distB="0" distL="0" distR="0" wp14:anchorId="72D945FA" wp14:editId="145E8421">
+          <wp:inline distT="0" distB="0" distL="0" distR="0" wp14:anchorId="727E86A5" wp14:editId="7B0051F6">
             <wp:extent cx="8412480" cy="1682496"/>
             <wp:effectExtent l="0" t="0" r="0" b="0"/>
             <wp:docPr id="83" name="Picture 83"/>
@@ -16365,7 +16365,7 @@
           <w:noProof/>
         </w:rPr>
         <w:drawing>
-          <wp:inline distT="0" distB="0" distL="0" distR="0" wp14:anchorId="08FFA6A8" wp14:editId="52A92524">
+          <wp:inline distT="0" distB="0" distL="0" distR="0" wp14:anchorId="56554B78" wp14:editId="213D133C">
             <wp:extent cx="8412480" cy="1682496"/>
             <wp:effectExtent l="0" t="0" r="0" b="0"/>
             <wp:docPr id="84" name="Picture 84"/>
@@ -16425,7 +16425,7 @@
           <w:noProof/>
         </w:rPr>
         <w:drawing>
-          <wp:inline distT="0" distB="0" distL="0" distR="0" wp14:anchorId="3E02B311" wp14:editId="089C569D">
+          <wp:inline distT="0" distB="0" distL="0" distR="0" wp14:anchorId="3F17BA11" wp14:editId="0C49ECC7">
             <wp:extent cx="8412480" cy="1682496"/>
             <wp:effectExtent l="0" t="0" r="0" b="0"/>
             <wp:docPr id="85" name="Picture 85"/>
@@ -16681,7 +16681,7 @@
           <w:noProof/>
         </w:rPr>
         <w:drawing>
-          <wp:inline distT="0" distB="0" distL="0" distR="0" wp14:anchorId="70B38ACA" wp14:editId="32E06BB5">
+          <wp:inline distT="0" distB="0" distL="0" distR="0" wp14:anchorId="0B0D5687" wp14:editId="19BD306B">
             <wp:extent cx="9464040" cy="5146072"/>
             <wp:effectExtent l="0" t="0" r="0" b="0"/>
             <wp:docPr id="86" name="Picture 86"/>
@@ -16903,7 +16903,7 @@
           <w:noProof/>
         </w:rPr>
         <w:drawing>
-          <wp:inline distT="0" distB="0" distL="0" distR="0" wp14:anchorId="6690D033" wp14:editId="5C901F60">
+          <wp:inline distT="0" distB="0" distL="0" distR="0" wp14:anchorId="09F73544" wp14:editId="6BC3349D">
             <wp:extent cx="8412480" cy="1682496"/>
             <wp:effectExtent l="0" t="0" r="0" b="0"/>
             <wp:docPr id="87" name="Picture 87"/>
@@ -16963,7 +16963,7 @@
           <w:noProof/>
         </w:rPr>
         <w:drawing>
-          <wp:inline distT="0" distB="0" distL="0" distR="0" wp14:anchorId="20108077" wp14:editId="341D1FDC">
+          <wp:inline distT="0" distB="0" distL="0" distR="0" wp14:anchorId="3AC64CBE" wp14:editId="647AE977">
             <wp:extent cx="8412480" cy="1682496"/>
             <wp:effectExtent l="0" t="0" r="0" b="0"/>
             <wp:docPr id="88" name="Picture 88"/>
@@ -17023,7 +17023,7 @@
           <w:noProof/>
         </w:rPr>
         <w:drawing>
-          <wp:inline distT="0" distB="0" distL="0" distR="0" wp14:anchorId="5C5C1176" wp14:editId="5316D434">
+          <wp:inline distT="0" distB="0" distL="0" distR="0" wp14:anchorId="5A5B6F44" wp14:editId="00C87945">
             <wp:extent cx="8412480" cy="1682496"/>
             <wp:effectExtent l="0" t="0" r="0" b="0"/>
             <wp:docPr id="89" name="Picture 89"/>
@@ -17279,7 +17279,7 @@
           <w:noProof/>
         </w:rPr>
         <w:drawing>
-          <wp:inline distT="0" distB="0" distL="0" distR="0" wp14:anchorId="2DD79DCB" wp14:editId="43CD327D">
+          <wp:inline distT="0" distB="0" distL="0" distR="0" wp14:anchorId="25E0FF52" wp14:editId="43AFA98F">
             <wp:extent cx="9464040" cy="5146072"/>
             <wp:effectExtent l="0" t="0" r="0" b="0"/>
             <wp:docPr id="90" name="Picture 90"/>
@@ -17501,7 +17501,7 @@
           <w:noProof/>
         </w:rPr>
         <w:drawing>
-          <wp:inline distT="0" distB="0" distL="0" distR="0" wp14:anchorId="3216B2AA" wp14:editId="2BD0E1A6">
+          <wp:inline distT="0" distB="0" distL="0" distR="0" wp14:anchorId="45089DD7" wp14:editId="769C1CD1">
             <wp:extent cx="8412480" cy="1682496"/>
             <wp:effectExtent l="0" t="0" r="0" b="0"/>
             <wp:docPr id="91" name="Picture 91"/>
@@ -17561,7 +17561,7 @@
           <w:noProof/>
         </w:rPr>
         <w:drawing>
-          <wp:inline distT="0" distB="0" distL="0" distR="0" wp14:anchorId="076D787F" wp14:editId="0DB455CA">
+          <wp:inline distT="0" distB="0" distL="0" distR="0" wp14:anchorId="5E0A645A" wp14:editId="4FB8B639">
             <wp:extent cx="8412480" cy="1682496"/>
             <wp:effectExtent l="0" t="0" r="0" b="0"/>
             <wp:docPr id="92" name="Picture 92"/>
@@ -17621,7 +17621,7 @@
           <w:noProof/>
         </w:rPr>
         <w:drawing>
-          <wp:inline distT="0" distB="0" distL="0" distR="0" wp14:anchorId="5A4BDBF5" wp14:editId="2B421AF9">
+          <wp:inline distT="0" distB="0" distL="0" distR="0" wp14:anchorId="7C338743" wp14:editId="5FD91E62">
             <wp:extent cx="8412480" cy="1682496"/>
             <wp:effectExtent l="0" t="0" r="0" b="0"/>
             <wp:docPr id="93" name="Picture 93"/>
@@ -17877,7 +17877,7 @@
           <w:noProof/>
         </w:rPr>
         <w:drawing>
-          <wp:inline distT="0" distB="0" distL="0" distR="0" wp14:anchorId="22119B8D" wp14:editId="18892294">
+          <wp:inline distT="0" distB="0" distL="0" distR="0" wp14:anchorId="276F77FC" wp14:editId="7A5AC4FA">
             <wp:extent cx="9464040" cy="5146072"/>
             <wp:effectExtent l="0" t="0" r="0" b="0"/>
             <wp:docPr id="94" name="Picture 94"/>
@@ -18099,7 +18099,7 @@
           <w:noProof/>
         </w:rPr>
         <w:drawing>
-          <wp:inline distT="0" distB="0" distL="0" distR="0" wp14:anchorId="60003DA3" wp14:editId="04498710">
+          <wp:inline distT="0" distB="0" distL="0" distR="0" wp14:anchorId="0743A123" wp14:editId="488967FF">
             <wp:extent cx="8412480" cy="1682496"/>
             <wp:effectExtent l="0" t="0" r="0" b="0"/>
             <wp:docPr id="95" name="Picture 95"/>
@@ -18159,7 +18159,7 @@
           <w:noProof/>
         </w:rPr>
         <w:drawing>
-          <wp:inline distT="0" distB="0" distL="0" distR="0" wp14:anchorId="13CF130F" wp14:editId="0A1ADA4E">
+          <wp:inline distT="0" distB="0" distL="0" distR="0" wp14:anchorId="5A6788E3" wp14:editId="50FB51D8">
             <wp:extent cx="8412480" cy="1682496"/>
             <wp:effectExtent l="0" t="0" r="0" b="0"/>
             <wp:docPr id="96" name="Picture 96"/>
@@ -18219,7 +18219,7 @@
           <w:noProof/>
         </w:rPr>
         <w:drawing>
-          <wp:inline distT="0" distB="0" distL="0" distR="0" wp14:anchorId="43358A1F" wp14:editId="7800B268">
+          <wp:inline distT="0" distB="0" distL="0" distR="0" wp14:anchorId="547F9C17" wp14:editId="3E940947">
             <wp:extent cx="8412480" cy="1682496"/>
             <wp:effectExtent l="0" t="0" r="0" b="0"/>
             <wp:docPr id="97" name="Picture 97"/>
@@ -18475,7 +18475,7 @@
           <w:noProof/>
         </w:rPr>
         <w:drawing>
-          <wp:inline distT="0" distB="0" distL="0" distR="0" wp14:anchorId="4DC9363E" wp14:editId="3B32C91B">
+          <wp:inline distT="0" distB="0" distL="0" distR="0" wp14:anchorId="5034CA59" wp14:editId="1443A535">
             <wp:extent cx="9464040" cy="5146072"/>
             <wp:effectExtent l="0" t="0" r="0" b="0"/>
             <wp:docPr id="98" name="Picture 98"/>
@@ -18697,7 +18697,7 @@
           <w:noProof/>
         </w:rPr>
         <w:drawing>
-          <wp:inline distT="0" distB="0" distL="0" distR="0" wp14:anchorId="2659EFD2" wp14:editId="63520B0D">
+          <wp:inline distT="0" distB="0" distL="0" distR="0" wp14:anchorId="022592D0" wp14:editId="767DDDA5">
             <wp:extent cx="8412480" cy="1682496"/>
             <wp:effectExtent l="0" t="0" r="0" b="0"/>
             <wp:docPr id="99" name="Picture 99"/>
@@ -18757,7 +18757,7 @@
           <w:noProof/>
         </w:rPr>
         <w:drawing>
-          <wp:inline distT="0" distB="0" distL="0" distR="0" wp14:anchorId="5D7EE1AA" wp14:editId="67A41ED5">
+          <wp:inline distT="0" distB="0" distL="0" distR="0" wp14:anchorId="55AD09F7" wp14:editId="6A641F6C">
             <wp:extent cx="8412480" cy="1682496"/>
             <wp:effectExtent l="0" t="0" r="0" b="0"/>
             <wp:docPr id="100" name="Picture 100"/>
@@ -18817,7 +18817,7 @@
           <w:noProof/>
         </w:rPr>
         <w:drawing>
-          <wp:inline distT="0" distB="0" distL="0" distR="0" wp14:anchorId="1E3FB6AF" wp14:editId="0D50213B">
+          <wp:inline distT="0" distB="0" distL="0" distR="0" wp14:anchorId="1E165225" wp14:editId="595A1C19">
             <wp:extent cx="8412480" cy="1682496"/>
             <wp:effectExtent l="0" t="0" r="0" b="0"/>
             <wp:docPr id="101" name="Picture 101"/>
@@ -19073,7 +19073,7 @@
           <w:noProof/>
         </w:rPr>
         <w:drawing>
-          <wp:inline distT="0" distB="0" distL="0" distR="0" wp14:anchorId="56179D1D" wp14:editId="62F342B7">
+          <wp:inline distT="0" distB="0" distL="0" distR="0" wp14:anchorId="70F4CFEF" wp14:editId="7AD9F064">
             <wp:extent cx="9464040" cy="5146072"/>
             <wp:effectExtent l="0" t="0" r="0" b="0"/>
             <wp:docPr id="102" name="Picture 102"/>
@@ -19295,7 +19295,7 @@
           <w:noProof/>
         </w:rPr>
         <w:drawing>
-          <wp:inline distT="0" distB="0" distL="0" distR="0" wp14:anchorId="295356E0" wp14:editId="7D389488">
+          <wp:inline distT="0" distB="0" distL="0" distR="0" wp14:anchorId="15E8342D" wp14:editId="082661F7">
             <wp:extent cx="8412480" cy="1682496"/>
             <wp:effectExtent l="0" t="0" r="0" b="0"/>
             <wp:docPr id="103" name="Picture 103"/>
@@ -19355,7 +19355,7 @@
           <w:noProof/>
         </w:rPr>
         <w:drawing>
-          <wp:inline distT="0" distB="0" distL="0" distR="0" wp14:anchorId="7EA71858" wp14:editId="6B5DDA62">
+          <wp:inline distT="0" distB="0" distL="0" distR="0" wp14:anchorId="4388FC60" wp14:editId="7946B8D3">
             <wp:extent cx="8412480" cy="1682496"/>
             <wp:effectExtent l="0" t="0" r="0" b="0"/>
             <wp:docPr id="104" name="Picture 104"/>
@@ -19415,7 +19415,7 @@
           <w:noProof/>
         </w:rPr>
         <w:drawing>
-          <wp:inline distT="0" distB="0" distL="0" distR="0" wp14:anchorId="0A8FC988" wp14:editId="4933177C">
+          <wp:inline distT="0" distB="0" distL="0" distR="0" wp14:anchorId="292D8192" wp14:editId="51D08EE3">
             <wp:extent cx="8412480" cy="1682496"/>
             <wp:effectExtent l="0" t="0" r="0" b="0"/>
             <wp:docPr id="105" name="Picture 105"/>
@@ -19671,7 +19671,7 @@
           <w:noProof/>
         </w:rPr>
         <w:drawing>
-          <wp:inline distT="0" distB="0" distL="0" distR="0" wp14:anchorId="4818C8E9" wp14:editId="79E07CD1">
+          <wp:inline distT="0" distB="0" distL="0" distR="0" wp14:anchorId="490673EE" wp14:editId="179A46A8">
             <wp:extent cx="9464040" cy="5146072"/>
             <wp:effectExtent l="0" t="0" r="0" b="0"/>
             <wp:docPr id="106" name="Picture 106"/>
@@ -19893,7 +19893,7 @@
           <w:noProof/>
         </w:rPr>
         <w:drawing>
-          <wp:inline distT="0" distB="0" distL="0" distR="0" wp14:anchorId="34214687" wp14:editId="7B9B7265">
+          <wp:inline distT="0" distB="0" distL="0" distR="0" wp14:anchorId="149562AA" wp14:editId="41F6E01C">
             <wp:extent cx="8412480" cy="1682496"/>
             <wp:effectExtent l="0" t="0" r="0" b="0"/>
             <wp:docPr id="107" name="Picture 107"/>
@@ -19953,7 +19953,7 @@
           <w:noProof/>
         </w:rPr>
         <w:drawing>
-          <wp:inline distT="0" distB="0" distL="0" distR="0" wp14:anchorId="1580863A" wp14:editId="7EAA2A85">
+          <wp:inline distT="0" distB="0" distL="0" distR="0" wp14:anchorId="37006F89" wp14:editId="26C39AAF">
             <wp:extent cx="8412480" cy="1682496"/>
             <wp:effectExtent l="0" t="0" r="0" b="0"/>
             <wp:docPr id="108" name="Picture 108"/>
@@ -20013,7 +20013,7 @@
           <w:noProof/>
         </w:rPr>
         <w:drawing>
-          <wp:inline distT="0" distB="0" distL="0" distR="0" wp14:anchorId="612E2D25" wp14:editId="4386D5F5">
+          <wp:inline distT="0" distB="0" distL="0" distR="0" wp14:anchorId="39120317" wp14:editId="030D6931">
             <wp:extent cx="8412480" cy="1682496"/>
             <wp:effectExtent l="0" t="0" r="0" b="0"/>
             <wp:docPr id="109" name="Picture 109"/>
@@ -21509,31 +21509,31 @@
       </w:rPr>
     </w:lvl>
   </w:abstractNum>
-  <w:num w:numId="1" w16cid:durableId="1866404944">
+  <w:num w:numId="1" w16cid:durableId="832140571">
     <w:abstractNumId w:val="8"/>
   </w:num>
-  <w:num w:numId="2" w16cid:durableId="298077799">
+  <w:num w:numId="2" w16cid:durableId="398093912">
     <w:abstractNumId w:val="6"/>
   </w:num>
-  <w:num w:numId="3" w16cid:durableId="245261920">
+  <w:num w:numId="3" w16cid:durableId="1233075774">
     <w:abstractNumId w:val="5"/>
   </w:num>
-  <w:num w:numId="4" w16cid:durableId="838740058">
+  <w:num w:numId="4" w16cid:durableId="21707103">
     <w:abstractNumId w:val="4"/>
   </w:num>
-  <w:num w:numId="5" w16cid:durableId="1928997864">
+  <w:num w:numId="5" w16cid:durableId="1388647270">
     <w:abstractNumId w:val="7"/>
   </w:num>
-  <w:num w:numId="6" w16cid:durableId="1507095073">
+  <w:num w:numId="6" w16cid:durableId="277417923">
     <w:abstractNumId w:val="3"/>
   </w:num>
-  <w:num w:numId="7" w16cid:durableId="79959543">
+  <w:num w:numId="7" w16cid:durableId="1210144835">
     <w:abstractNumId w:val="2"/>
   </w:num>
-  <w:num w:numId="8" w16cid:durableId="1929382519">
+  <w:num w:numId="8" w16cid:durableId="797602518">
     <w:abstractNumId w:val="1"/>
   </w:num>
-  <w:num w:numId="9" w16cid:durableId="1007900016">
+  <w:num w:numId="9" w16cid:durableId="2139519286">
     <w:abstractNumId w:val="0"/>
   </w:num>
 </w:numbering>

</xml_diff>